<commit_message>
docs(rp2): publish timing-remediation evidence
</commit_message>
<xml_diff>
--- a/reports/final_report_draft_v2.docx
+++ b/reports/final_report_draft_v2.docx
@@ -2,7 +2,7 @@
 <file path=word/document.xml><?xml version="1.0" encoding="utf-8"?>
 <w:document xmlns:w="http://schemas.openxmlformats.org/wordprocessingml/2006/main" xmlns:m="http://schemas.openxmlformats.org/officeDocument/2006/math" xmlns:r="http://schemas.openxmlformats.org/officeDocument/2006/relationships" xmlns:o="urn:schemas-microsoft-com:office:office" xmlns:v="urn:schemas-microsoft-com:vml" xmlns:w10="urn:schemas-microsoft-com:office:word" xmlns:a="http://schemas.openxmlformats.org/drawingml/2006/main" xmlns:pic="http://schemas.openxmlformats.org/drawingml/2006/picture" xmlns:wp="http://schemas.openxmlformats.org/drawingml/2006/wordprocessingDrawing">
   <w:body>
-    <w:bookmarkStart w:id="42" w:name="X38984083efee9680b21f1536dd8294d72ad0f10"/>
+    <w:bookmarkStart w:id="43" w:name="X38984083efee9680b21f1536dd8294d72ad0f10"/>
     <w:p>
       <w:pPr>
         <w:pStyle w:val="Heading1"/>
@@ -20,7 +20,7 @@
           <w:bCs/>
           <w:b/>
         </w:rPr>
-        <w:t xml:space="preserve">Capstone report — evidence-cutoff version (2026-08-28)</w:t>
+        <w:t xml:space="preserve">Capstone report — evidence-cutoff version (2026-08-31)</w:t>
       </w:r>
     </w:p>
     <w:p>
@@ -91,7 +91,7 @@
           <w:bCs/>
           <w:b/>
         </w:rPr>
-        <w:t xml:space="preserve">Evidence status (2026-08-28).</w:t>
+        <w:t xml:space="preserve">Evidence status (2026-08-31).</w:t>
       </w:r>
       <w:r>
         <w:t xml:space="preserve"> </w:t>
@@ -106,7 +106,7 @@
         <w:rPr>
           <w:rStyle w:val="VerbatimChar"/>
         </w:rPr>
-        <w:t xml:space="preserve">rp2-v3-20260827-remediation3</w:t>
+        <w:t xml:space="preserve">rp2-v3-20260831-timing-role-remediation</w:t>
       </w:r>
       <w:r>
         <w:t xml:space="preserve"> </w:t>
@@ -121,22 +121,22 @@
         <w:rPr>
           <w:rStyle w:val="VerbatimChar"/>
         </w:rPr>
-        <w:t xml:space="preserve">386610a4908d601c...</w:t>
-      </w:r>
-      <w:r>
-        <w:t xml:space="preserve">). It repairs the</w:t>
-      </w:r>
-      <w:r>
-        <w:t xml:space="preserve"> </w:t>
-      </w:r>
-      <w:r>
-        <w:t xml:space="preserve">Block 8/Block 10 LightGBM protocol divergence, but remains a historical D/V measurement</w:t>
-      </w:r>
-      <w:r>
-        <w:t xml:space="preserve"> </w:t>
-      </w:r>
-      <w:r>
-        <w:t xml:space="preserve">because</w:t>
+        <w:t xml:space="preserve">7d544aa334b70ce8...</w:t>
+      </w:r>
+      <w:r>
+        <w:t xml:space="preserve">). It repairs partition-role assignment, aligns B0 with the</w:t>
+      </w:r>
+      <w:r>
+        <w:t xml:space="preserve"> </w:t>
+      </w:r>
+      <w:r>
+        <w:t xml:space="preserve">documented 120-second B1/B2 cutoff and gives B1 the same XNYS expiry calendar as B2.</w:t>
+      </w:r>
+      <w:r>
+        <w:t xml:space="preserve"> </w:t>
+      </w:r>
+      <w:r>
+        <w:t xml:space="preserve">It remains a historical D/V measurement because</w:t>
       </w:r>
       <w:r>
         <w:t xml:space="preserve"> </w:t>
@@ -151,13 +151,13 @@
         <w:t xml:space="preserve"> </w:t>
       </w:r>
       <w:r>
-        <w:t xml:space="preserve">is still active. No number in this report is an</w:t>
-      </w:r>
-      <w:r>
-        <w:t xml:space="preserve"> </w:t>
-      </w:r>
-      <w:r>
-        <w:t xml:space="preserve">eligible current headline;</w:t>
+        <w:t xml:space="preserve">is</w:t>
+      </w:r>
+      <w:r>
+        <w:t xml:space="preserve"> </w:t>
+      </w:r>
+      <w:r>
+        <w:t xml:space="preserve">active. No number in this report is an eligible current headline;</w:t>
       </w:r>
       <w:r>
         <w:t xml:space="preserve"> </w:t>
@@ -187,13 +187,7 @@
         <w:t xml:space="preserve"> </w:t>
       </w:r>
       <w:r>
-        <w:t xml:space="preserve">govern if a dated</w:t>
-      </w:r>
-      <w:r>
-        <w:t xml:space="preserve"> </w:t>
-      </w:r>
-      <w:r>
-        <w:t xml:space="preserve">narrative disagrees.</w:t>
+        <w:t xml:space="preserve">govern if a dated narrative disagrees.</w:t>
       </w:r>
     </w:p>
     <w:bookmarkStart w:id="20" w:name="title-page"/>
@@ -292,7 +286,7 @@
         <w:t xml:space="preserve"> </w:t>
       </w:r>
       <w:r>
-        <w:t xml:space="preserve">28 August 2026 (Australia/Sydney)</w:t>
+        <w:t xml:space="preserve">31 August 2026 (Australia/Sydney)</w:t>
       </w:r>
     </w:p>
     <w:bookmarkEnd w:id="20"/>
@@ -358,67 +352,91 @@
         <w:t xml:space="preserve"> </w:t>
       </w:r>
       <w:r>
-        <w:t xml:space="preserve">preregistered confirmation. Discovery ΔB1 is positive in all three families; validation</w:t>
-      </w:r>
-      <w:r>
-        <w:t xml:space="preserve"> </w:t>
-      </w:r>
-      <w:r>
-        <w:t xml:space="preserve">does not establish a replicated option-state contribution. ΔB2|B1 is small, mixed by</w:t>
-      </w:r>
-      <w:r>
-        <w:t xml:space="preserve"> </w:t>
-      </w:r>
-      <w:r>
-        <w:t xml:space="preserve">family and partition, and does not establish a universal flow contribution. Nine of the</w:t>
-      </w:r>
-      <w:r>
-        <w:t xml:space="preserve"> </w:t>
-      </w:r>
-      <w:r>
-        <w:t xml:space="preserve">twelve contrasts are below their own minimum detectable effect. Provider source-time and</w:t>
-      </w:r>
-      <w:r>
-        <w:t xml:space="preserve"> </w:t>
-      </w:r>
-      <w:r>
-        <w:t xml:space="preserve">record-creation rules prevent look-ahead under documented assumptions, but they do not</w:t>
-      </w:r>
-      <w:r>
-        <w:t xml:space="preserve"> </w:t>
-      </w:r>
-      <w:r>
-        <w:t xml:space="preserve">prove historical client receipt time; PIT v2.2 reconciliation therefore remains blocked.</w:t>
-      </w:r>
-      <w:r>
-        <w:t xml:space="preserve"> </w:t>
-      </w:r>
-      <w:r>
-        <w:t xml:space="preserve">Phase 8 is an unopened exploratory bridge and Phase 9 is an ongoing 60-session prospective</w:t>
-      </w:r>
-      <w:r>
-        <w:t xml:space="preserve"> </w:t>
-      </w:r>
-      <w:r>
-        <w:t xml:space="preserve">follow-up, not a submission gate. No causal, directional, confirmatory or profitability</w:t>
-      </w:r>
-      <w:r>
-        <w:t xml:space="preserve"> </w:t>
-      </w:r>
-      <w:r>
-        <w:t xml:space="preserve">claim is made, and</w:t>
-      </w:r>
-      <w:r>
-        <w:t xml:space="preserve"> </w:t>
-      </w:r>
-      <w:r>
-        <w:rPr>
-          <w:rStyle w:val="VerbatimChar"/>
-        </w:rPr>
-        <w:t xml:space="preserve">sealed_cohorts_read=0</w:t>
-      </w:r>
-      <w:r>
-        <w:t xml:space="preserve">.</w:t>
+        <w:t xml:space="preserve">preregistered confirmation. The decision-relevant B2 result is negative. The registered</w:t>
+      </w:r>
+      <w:r>
+        <w:t xml:space="preserve"> </w:t>
+      </w:r>
+      <w:r>
+        <w:t xml:space="preserve">directional rule returns</w:t>
+      </w:r>
+      <w:r>
+        <w:t xml:space="preserve"> </w:t>
+      </w:r>
+      <w:r>
+        <w:rPr>
+          <w:rStyle w:val="VerbatimChar"/>
+        </w:rPr>
+        <w:t xml:space="preserve">DO_NOT_PURSUE</w:t>
+      </w:r>
+      <w:r>
+        <w:t xml:space="preserve">; Phase 8 places the positive contribution in the</w:t>
+      </w:r>
+      <w:r>
+        <w:t xml:space="preserve"> </w:t>
+      </w:r>
+      <w:r>
+        <w:t xml:space="preserve">B1 option-state block while every ΔB2|B1 interval crosses zero. In the retrospective run,</w:t>
+      </w:r>
+      <w:r>
+        <w:t xml:space="preserve"> </w:t>
+      </w:r>
+      <w:r>
+        <w:t xml:space="preserve">discovery ΔB1 is positive in all three families, validation does not establish replication,</w:t>
+      </w:r>
+      <w:r>
+        <w:t xml:space="preserve"> </w:t>
+      </w:r>
+      <w:r>
+        <w:t xml:space="preserve">and ΔB2|B1 changes sign by family and partition. Ten of twelve contrasts are below their</w:t>
+      </w:r>
+      <w:r>
+        <w:t xml:space="preserve"> </w:t>
+      </w:r>
+      <w:r>
+        <w:t xml:space="preserve">own minimum detectable effect. Provider source-time and record-creation rules prevent</w:t>
+      </w:r>
+      <w:r>
+        <w:t xml:space="preserve"> </w:t>
+      </w:r>
+      <w:r>
+        <w:t xml:space="preserve">look-ahead under documented assumptions, but they do not prove historical client receipt</w:t>
+      </w:r>
+      <w:r>
+        <w:t xml:space="preserve"> </w:t>
+      </w:r>
+      <w:r>
+        <w:t xml:space="preserve">time; PIT v2.2 reconciliation therefore remains blocked. Phase 8 consumed its sole</w:t>
+      </w:r>
+      <w:r>
+        <w:t xml:space="preserve"> </w:t>
+      </w:r>
+      <w:r>
+        <w:t xml:space="preserve">exploratory read and is</w:t>
+      </w:r>
+      <w:r>
+        <w:t xml:space="preserve"> </w:t>
+      </w:r>
+      <w:r>
+        <w:rPr>
+          <w:rStyle w:val="VerbatimChar"/>
+        </w:rPr>
+        <w:t xml:space="preserve">MIXED_EXPLORATORY</w:t>
+      </w:r>
+      <w:r>
+        <w:t xml:space="preserve">; Phase 9 is an ongoing 60-session prospective</w:t>
+      </w:r>
+      <w:r>
+        <w:t xml:space="preserve"> </w:t>
+      </w:r>
+      <w:r>
+        <w:t xml:space="preserve">follow-up, not a submission gate. No causal, confirmatory or profitability claim is made;</w:t>
+      </w:r>
+      <w:r>
+        <w:t xml:space="preserve"> </w:t>
+      </w:r>
+      <w:r>
+        <w:t xml:space="preserve">the current read counters are Phase 8 = 1 and Phase 9 = 0.</w:t>
       </w:r>
     </w:p>
     <w:bookmarkEnd w:id="21"/>
@@ -1342,7 +1360,7 @@
         <w:t xml:space="preserve"> </w:t>
       </w:r>
       <w:r>
-        <w:t xml:space="preserve">(§7). The assembled panel holds 184,632 origins over 2,814 session-assets, none dropped for</w:t>
+        <w:t xml:space="preserve">(§7). The assembled panel holds 181,829 origins over 2,814 session-assets, none dropped for</w:t>
       </w:r>
       <w:r>
         <w:t xml:space="preserve"> </w:t>
@@ -1354,7 +1372,7 @@
         <w:t xml:space="preserve"> </w:t>
       </w:r>
       <w:r>
-        <w:t xml:space="preserve">standard error at this horizon has a median of 25.7 per cent in discovery, so roughly a</w:t>
+        <w:t xml:space="preserve">standard error at this horizon has a median of 25.6 per cent in discovery, so roughly a</w:t>
       </w:r>
       <w:r>
         <w:t xml:space="preserve"> </w:t>
@@ -1392,13 +1410,13 @@
         <w:t xml:space="preserve"> </w:t>
       </w:r>
       <w:r>
-        <w:t xml:space="preserve">are computed. Coverage of the ten B1-core features is 99.3 per cent and the median snapshot</w:t>
-      </w:r>
-      <w:r>
-        <w:t xml:space="preserve"> </w:t>
-      </w:r>
-      <w:r>
-        <w:t xml:space="preserve">carries 783 contracts. B2 adds the point-in-time trade tape under the same cutoff, and the</w:t>
+        <w:t xml:space="preserve">are computed. Coverage of the ten B1-core features is 99.3 per cent and the average snapshot</w:t>
+      </w:r>
+      <w:r>
+        <w:t xml:space="preserve"> </w:t>
+      </w:r>
+      <w:r>
+        <w:t xml:space="preserve">carries 779 contracts. B2 adds the point-in-time trade tape under the same cutoff, and the</w:t>
       </w:r>
       <w:r>
         <w:t xml:space="preserve"> </w:t>
@@ -1671,7 +1689,19 @@
         <w:t xml:space="preserve"> </w:t>
       </w:r>
       <w:r>
-        <w:t xml:space="preserve">forecastable, and any comparison of effect sizes across the two must carry that. A third</w:t>
+        <w:t xml:space="preserve">forecastable, and any comparison of effect sizes across the two must carry that. Those two</w:t>
+      </w:r>
+      <w:r>
+        <w:t xml:space="preserve"> </w:t>
+      </w:r>
+      <w:r>
+        <w:t xml:space="preserve">figures are carried over from the superseded RP2-v2 cascade and are not reproducible from</w:t>
+      </w:r>
+      <w:r>
+        <w:t xml:space="preserve"> </w:t>
+      </w:r>
+      <w:r>
+        <w:t xml:space="preserve">any artifact in this release; the difficulty gap they illustrate is qualitative here. A third</w:t>
       </w:r>
       <w:r>
         <w:t xml:space="preserve"> </w:t>
@@ -2422,7 +2452,7 @@
     </w:p>
     <w:bookmarkEnd w:id="29"/>
     <w:bookmarkEnd w:id="30"/>
-    <w:bookmarkStart w:id="35" w:name="Xf008beceec6d1c3a3c616f37281fffb37cae0fa"/>
+    <w:bookmarkStart w:id="36" w:name="Xf008beceec6d1c3a3c616f37281fffb37cae0fa"/>
     <w:p>
       <w:pPr>
         <w:pStyle w:val="Heading2"/>
@@ -2462,7 +2492,7 @@
         <w:rPr>
           <w:rStyle w:val="VerbatimChar"/>
         </w:rPr>
-        <w:t xml:space="preserve">rp2-v3-20260827-remediation3</w:t>
+        <w:t xml:space="preserve">rp2-v3-20260831-timing-role-remediation</w:t>
       </w:r>
       <w:r>
         <w:t xml:space="preserve"> </w:t>
@@ -2477,28 +2507,34 @@
         <w:rPr>
           <w:rStyle w:val="VerbatimChar"/>
         </w:rPr>
-        <w:t xml:space="preserve">386610a4908d601c...</w:t>
-      </w:r>
-      <w:r>
-        <w:t xml:space="preserve">, code commit</w:t>
-      </w:r>
-      <w:r>
-        <w:t xml:space="preserve"> </w:t>
-      </w:r>
-      <w:r>
-        <w:rPr>
-          <w:rStyle w:val="VerbatimChar"/>
-        </w:rPr>
-        <w:t xml:space="preserve">e7728ebbaf3f</w:t>
-      </w:r>
-      <w:r>
-        <w:t xml:space="preserve">). It covers the two disjoint calendar roles frozen in §3 — discovery D and</w:t>
-      </w:r>
-      <w:r>
-        <w:t xml:space="preserve"> </w:t>
-      </w:r>
-      <w:r>
-        <w:t xml:space="preserve">validation V — on six outcome assets, with 61,336 and 12,672 common evaluation rows.</w:t>
+        <w:t xml:space="preserve">7d544aa334b70ce8...</w:t>
+      </w:r>
+      <w:r>
+        <w:t xml:space="preserve">, code</w:t>
+      </w:r>
+      <w:r>
+        <w:t xml:space="preserve"> </w:t>
+      </w:r>
+      <w:r>
+        <w:t xml:space="preserve">commit</w:t>
+      </w:r>
+      <w:r>
+        <w:t xml:space="preserve"> </w:t>
+      </w:r>
+      <w:r>
+        <w:rPr>
+          <w:rStyle w:val="VerbatimChar"/>
+        </w:rPr>
+        <w:t xml:space="preserve">cbdd0b5840da</w:t>
+      </w:r>
+      <w:r>
+        <w:t xml:space="preserve">). It covers the two disjoint calendar roles frozen in §3 — discovery</w:t>
+      </w:r>
+      <w:r>
+        <w:t xml:space="preserve"> </w:t>
+      </w:r>
+      <w:r>
+        <w:t xml:space="preserve">D and validation V — on six outcome assets, with 60,407 and 12,480 common evaluation rows.</w:t>
       </w:r>
       <w:r>
         <w:t xml:space="preserve"> </w:t>
@@ -2542,7 +2578,7 @@
         <w:pStyle w:val="BodyText"/>
       </w:pPr>
       <w:r>
-        <w:t xml:space="preserve">In discovery ΔB1 is +0.00219 for</w:t>
+        <w:t xml:space="preserve">In discovery ΔB1 is +0.00258 for</w:t>
       </w:r>
       <w:r>
         <w:t xml:space="preserve"> </w:t>
@@ -2557,13 +2593,13 @@
         <w:t xml:space="preserve"> </w:t>
       </w:r>
       <w:r>
-        <w:t xml:space="preserve">(95 percent interval [+0.00098,</w:t>
-      </w:r>
-      <w:r>
-        <w:t xml:space="preserve"> </w:t>
-      </w:r>
-      <w:r>
-        <w:t xml:space="preserve">+0.00342]), +0.00229 for</w:t>
+        <w:t xml:space="preserve">(95 percent interval [+0.00102,</w:t>
+      </w:r>
+      <w:r>
+        <w:t xml:space="preserve"> </w:t>
+      </w:r>
+      <w:r>
+        <w:t xml:space="preserve">+0.00418]), +0.00288 for</w:t>
       </w:r>
       <w:r>
         <w:t xml:space="preserve"> </w:t>
@@ -2578,7 +2614,7 @@
         <w:t xml:space="preserve"> </w:t>
       </w:r>
       <w:r>
-        <w:t xml:space="preserve">([+0.00121, +0.00352]) and +0.00253 for</w:t>
+        <w:t xml:space="preserve">([+0.00154, +0.00438]) and +0.00267 for</w:t>
       </w:r>
       <w:r>
         <w:t xml:space="preserve"> </w:t>
@@ -2593,7 +2629,7 @@
         <w:t xml:space="preserve"> </w:t>
       </w:r>
       <w:r>
-        <w:t xml:space="preserve">([+0.00064, +0.00502]). All three intervals exclude zero, but their</w:t>
+        <w:t xml:space="preserve">([+0.00060, +0.00519]). All three intervals exclude zero, but their</w:t>
       </w:r>
       <w:r>
         <w:t xml:space="preserve"> </w:t>
@@ -2613,7 +2649,7 @@
         <w:pStyle w:val="BodyText"/>
       </w:pPr>
       <w:r>
-        <w:t xml:space="preserve">Validation does not establish replication. ΔB1 is −0.00113 for</w:t>
+        <w:t xml:space="preserve">Validation does not establish replication. ΔB1 is −0.00152 for</w:t>
       </w:r>
       <w:r>
         <w:t xml:space="preserve"> </w:t>
@@ -2628,7 +2664,7 @@
         <w:t xml:space="preserve"> </w:t>
       </w:r>
       <w:r>
-        <w:t xml:space="preserve">([−0.00411, +0.00198]), −0.00083 for</w:t>
+        <w:t xml:space="preserve">([−0.00500, +0.00223]), −0.00092 for</w:t>
       </w:r>
       <w:r>
         <w:t xml:space="preserve"> </w:t>
@@ -2643,7 +2679,7 @@
         <w:t xml:space="preserve"> </w:t>
       </w:r>
       <w:r>
-        <w:t xml:space="preserve">([−0.00283, +0.00131]) and +0.00211</w:t>
+        <w:t xml:space="preserve">([−0.00318, +0.00148]) and +0.00136</w:t>
       </w:r>
       <w:r>
         <w:t xml:space="preserve"> </w:t>
@@ -2664,19 +2700,13 @@
         <w:t xml:space="preserve"> </w:t>
       </w:r>
       <w:r>
-        <w:t xml:space="preserve">([−0.00797, +0.01211]); every interval contains zero. The tree-family</w:t>
-      </w:r>
-      <w:r>
-        <w:t xml:space="preserve"> </w:t>
-      </w:r>
-      <w:r>
-        <w:t xml:space="preserve">sign no longer reverses after the Block 8/Block 10 protocol repair, but its interval is too</w:t>
-      </w:r>
-      <w:r>
-        <w:t xml:space="preserve"> </w:t>
-      </w:r>
-      <w:r>
-        <w:t xml:space="preserve">wide to support replication. B0 QLIKE also rises from 0.13860 to 0.17501 for</w:t>
+        <w:t xml:space="preserve">([−0.00548, +0.00819]); every interval contains zero. B0 QLIKE also</w:t>
+      </w:r>
+      <w:r>
+        <w:t xml:space="preserve"> </w:t>
+      </w:r>
+      <w:r>
+        <w:t xml:space="preserve">rises from 0.14522 to 0.18347 for</w:t>
       </w:r>
       <w:r>
         <w:t xml:space="preserve"> </w:t>
@@ -2691,7 +2721,7 @@
         <w:t xml:space="preserve"> </w:t>
       </w:r>
       <w:r>
-        <w:t xml:space="preserve">and from 0.13550 to 0.19866 for</w:t>
+        <w:t xml:space="preserve">and from 0.14239 to 0.21304 for</w:t>
       </w:r>
       <w:r>
         <w:t xml:space="preserve"> </w:t>
@@ -2703,13 +2733,7 @@
         <w:t xml:space="preserve">lightgbm_qlike</w:t>
       </w:r>
       <w:r>
-        <w:t xml:space="preserve">, so the later role is both shorter and</w:t>
-      </w:r>
-      <w:r>
-        <w:t xml:space="preserve"> </w:t>
-      </w:r>
-      <w:r>
-        <w:t xml:space="preserve">harder in level.</w:t>
+        <w:t xml:space="preserve">, so the later role is both shorter and harder in level.</w:t>
       </w:r>
     </w:p>
     <w:p>
@@ -2723,7 +2747,7 @@
         <w:t xml:space="preserve"> </w:t>
       </w:r>
       <w:r>
-        <w:t xml:space="preserve">ΔB2|B1 is −0.00002 for</w:t>
+        <w:t xml:space="preserve">ΔB2|B1 is +0.00018 for</w:t>
       </w:r>
       <w:r>
         <w:t xml:space="preserve"> </w:t>
@@ -2735,7 +2759,7 @@
         <w:t xml:space="preserve">gamma_glm</w:t>
       </w:r>
       <w:r>
-        <w:t xml:space="preserve">, +0.00017 for</w:t>
+        <w:t xml:space="preserve">, +0.00028 for</w:t>
       </w:r>
       <w:r>
         <w:t xml:space="preserve"> </w:t>
@@ -2750,7 +2774,7 @@
         <w:t xml:space="preserve"> </w:t>
       </w:r>
       <w:r>
-        <w:t xml:space="preserve">and +0.00060 for</w:t>
+        <w:t xml:space="preserve">and +0.00096 for</w:t>
       </w:r>
       <w:r>
         <w:t xml:space="preserve"> </w:t>
@@ -2762,37 +2786,43 @@
         <w:t xml:space="preserve">lightgbm_qlike</w:t>
       </w:r>
       <w:r>
-        <w:t xml:space="preserve">; in validation it is −0.00215, −0.00194 and +0.00336. Three of the six</w:t>
-      </w:r>
-      <w:r>
-        <w:t xml:space="preserve"> </w:t>
-      </w:r>
-      <w:r>
-        <w:t xml:space="preserve">family-role pairs are negative, and only the validation gamma interval excludes zero on</w:t>
-      </w:r>
-      <w:r>
-        <w:t xml:space="preserve"> </w:t>
-      </w:r>
-      <w:r>
-        <w:t xml:space="preserve">the adverse side. The small smooth-family development estimates are compatible with the</w:t>
-      </w:r>
-      <w:r>
-        <w:t xml:space="preserve"> </w:t>
-      </w:r>
-      <w:r>
-        <w:t xml:space="preserve">recorded margin, but the implementation does not establish formal multiplicity-adjusted</w:t>
-      </w:r>
-      <w:r>
-        <w:t xml:space="preserve"> </w:t>
-      </w:r>
-      <w:r>
-        <w:t xml:space="preserve">TOST equivalence. The family- and partition-dependent signs do not support a universal B2</w:t>
-      </w:r>
-      <w:r>
-        <w:t xml:space="preserve"> </w:t>
-      </w:r>
-      <w:r>
-        <w:t xml:space="preserve">contribution.</w:t>
+        <w:t xml:space="preserve">; in validation it is −0.00272, −0.00251 and −0.00202. Three of the six</w:t>
+      </w:r>
+      <w:r>
+        <w:t xml:space="preserve"> </w:t>
+      </w:r>
+      <w:r>
+        <w:t xml:space="preserve">family-role pairs are negative. The discovery LightGBM interval excludes zero on the</w:t>
+      </w:r>
+      <w:r>
+        <w:t xml:space="preserve"> </w:t>
+      </w:r>
+      <w:r>
+        <w:t xml:space="preserve">positive side and the validation gamma interval excludes zero on the adverse side; the</w:t>
+      </w:r>
+      <w:r>
+        <w:t xml:space="preserve"> </w:t>
+      </w:r>
+      <w:r>
+        <w:t xml:space="preserve">other four cross zero. The small smooth-family development estimates are compatible with</w:t>
+      </w:r>
+      <w:r>
+        <w:t xml:space="preserve"> </w:t>
+      </w:r>
+      <w:r>
+        <w:t xml:space="preserve">the recorded margin, but the implementation does not establish formal</w:t>
+      </w:r>
+      <w:r>
+        <w:t xml:space="preserve"> </w:t>
+      </w:r>
+      <w:r>
+        <w:t xml:space="preserve">multiplicity-adjusted TOST equivalence. The family- and partition-dependent signs do not</w:t>
+      </w:r>
+      <w:r>
+        <w:t xml:space="preserve"> </w:t>
+      </w:r>
+      <w:r>
+        <w:t xml:space="preserve">support a universal B2 contribution.</w:t>
       </w:r>
     </w:p>
     <w:p>
@@ -2800,52 +2830,49 @@
         <w:pStyle w:val="BodyText"/>
       </w:pPr>
       <w:r>
-        <w:t xml:space="preserve">The current run also repairs a producer inconsistency that an equal-row-mask gate could not</w:t>
-      </w:r>
-      <w:r>
-        <w:t xml:space="preserve"> </w:t>
-      </w:r>
-      <w:r>
-        <w:t xml:space="preserve">detect: Block 8 and Block 10 previously selected LightGBM rounds under different session</w:t>
-      </w:r>
-      <w:r>
-        <w:t xml:space="preserve"> </w:t>
-      </w:r>
-      <w:r>
-        <w:t xml:space="preserve">rules. Harmonising that path moves LightGBM ΔB1 from +0.00123 to +0.00253 in discovery and</w:t>
-      </w:r>
-      <w:r>
-        <w:t xml:space="preserve"> </w:t>
-      </w:r>
-      <w:r>
-        <w:t xml:space="preserve">from −0.00383 to +0.00211 in validation. The smooth families are unchanged. This movement</w:t>
-      </w:r>
-      <w:r>
-        <w:t xml:space="preserve"> </w:t>
-      </w:r>
-      <w:r>
-        <w:t xml:space="preserve">is why the 2026-08-24 run is retained only in</w:t>
-      </w:r>
-      <w:r>
-        <w:t xml:space="preserve"> </w:t>
-      </w:r>
-      <w:r>
-        <w:rPr>
-          <w:rStyle w:val="VerbatimChar"/>
-        </w:rPr>
-        <w:t xml:space="preserve">SUPERSEDED_RESULTS.md</w:t>
-      </w:r>
-      <w:r>
-        <w:t xml:space="preserve"> </w:t>
-      </w:r>
-      <w:r>
-        <w:t xml:space="preserve">and why the corrected</w:t>
-      </w:r>
-      <w:r>
-        <w:t xml:space="preserve"> </w:t>
-      </w:r>
-      <w:r>
-        <w:t xml:space="preserve">run is still described as a historical measurement rather than silently promoted.</w:t>
+        <w:t xml:space="preserve">The current run repairs three result-changing defects jointly. It derives bar roles from</w:t>
+      </w:r>
+      <w:r>
+        <w:t xml:space="preserve"> </w:t>
+      </w:r>
+      <w:r>
+        <w:t xml:space="preserve">partition dates instead of trusting file literals; shifts every B0 predictor, market</w:t>
+      </w:r>
+      <w:r>
+        <w:t xml:space="preserve"> </w:t>
+      </w:r>
+      <w:r>
+        <w:t xml:space="preserve">control and volatility state back three one-minute bars so B0 shares the documented</w:t>
+      </w:r>
+      <w:r>
+        <w:t xml:space="preserve"> </w:t>
+      </w:r>
+      <w:r>
+        <w:t xml:space="preserve">120-second B1/B2 cutoff; and gives B1 the XNYS expiry-close calendar already used by B2.</w:t>
+      </w:r>
+      <w:r>
+        <w:t xml:space="preserve"> </w:t>
+      </w:r>
+      <w:r>
+        <w:t xml:space="preserve">The common panel falls from 184,632 to 181,829 origins. These changes move discovery ΔB1</w:t>
+      </w:r>
+      <w:r>
+        <w:t xml:space="preserve"> </w:t>
+      </w:r>
+      <w:r>
+        <w:t xml:space="preserve">from +0.00219, +0.00229 and +0.00253 to the values above; validation moves from −0.00113,</w:t>
+      </w:r>
+      <w:r>
+        <w:t xml:space="preserve"> </w:t>
+      </w:r>
+      <w:r>
+        <w:t xml:space="preserve">−0.00083 and +0.00211. Because the rebuild changes all three defects together, it is not</w:t>
+      </w:r>
+      <w:r>
+        <w:t xml:space="preserve"> </w:t>
+      </w:r>
+      <w:r>
+        <w:t xml:space="preserve">an ablation and does not assign each movement to one repair.</w:t>
       </w:r>
     </w:p>
     <w:p>
@@ -2859,7 +2886,7 @@
         <w:t xml:space="preserve"> </w:t>
       </w:r>
       <w:r>
-        <w:t xml:space="preserve">validation MDEs are 0.00411 for</w:t>
+        <w:t xml:space="preserve">validation MDEs are 0.00496 for</w:t>
       </w:r>
       <w:r>
         <w:t xml:space="preserve"> </w:t>
@@ -2871,7 +2898,7 @@
         <w:t xml:space="preserve">gamma_glm</w:t>
       </w:r>
       <w:r>
-        <w:t xml:space="preserve">, 0.00271 for</w:t>
+        <w:t xml:space="preserve">, 0.00311 for</w:t>
       </w:r>
       <w:r>
         <w:t xml:space="preserve"> </w:t>
@@ -2886,7 +2913,7 @@
         <w:t xml:space="preserve"> </w:t>
       </w:r>
       <w:r>
-        <w:t xml:space="preserve">and 0.01517 for</w:t>
+        <w:t xml:space="preserve">and 0.01037 for</w:t>
       </w:r>
       <w:r>
         <w:t xml:space="preserve"> </w:t>
@@ -2898,19 +2925,19 @@
         <w:t xml:space="preserve">lightgbm_qlike</w:t>
       </w:r>
       <w:r>
-        <w:t xml:space="preserve">, against discovery ΔB1 estimates of 0.00219, 0.00229 and 0.00253.</w:t>
-      </w:r>
-      <w:r>
-        <w:t xml:space="preserve"> </w:t>
-      </w:r>
-      <w:r>
-        <w:t xml:space="preserve">Approximate session requirements under the same exploratory α = 0.05 contract are 113,</w:t>
-      </w:r>
-      <w:r>
-        <w:t xml:space="preserve"> </w:t>
-      </w:r>
-      <w:r>
-        <w:t xml:space="preserve">45 and 1,148. They are not requirements computed under the separate 0.00417 future</w:t>
+        <w:t xml:space="preserve">, against discovery ΔB1 estimates of 0.00258, 0.00288 and 0.00267.</w:t>
+      </w:r>
+      <w:r>
+        <w:t xml:space="preserve"> </w:t>
+      </w:r>
+      <w:r>
+        <w:t xml:space="preserve">Approximate session requirements under the same exploratory α = 0.05 contract are 119,</w:t>
+      </w:r>
+      <w:r>
+        <w:t xml:space="preserve"> </w:t>
+      </w:r>
+      <w:r>
+        <w:t xml:space="preserve">38 and 484. They are not requirements computed under the separate 0.00417 future</w:t>
       </w:r>
       <w:r>
         <w:t xml:space="preserve"> </w:t>
@@ -2930,7 +2957,7 @@
         <w:pStyle w:val="BodyText"/>
       </w:pPr>
       <w:r>
-        <w:t xml:space="preserve">Nine of the twelve contrasts sit below their own minimum detectable effect. Where a</w:t>
+        <w:t xml:space="preserve">Ten of the twelve contrasts sit below their own minimum detectable effect. Where a</w:t>
       </w:r>
       <w:r>
         <w:t xml:space="preserve"> </w:t>
@@ -2972,31 +2999,668 @@
         <w:pStyle w:val="FirstParagraph"/>
       </w:pPr>
       <w:r>
-        <w:t xml:space="preserve">The bridge method is frozen for a twenty-session strictly unobserved primary analysis and</w:t>
-      </w:r>
-      <w:r>
-        <w:t xml:space="preserve"> </w:t>
-      </w:r>
-      <w:r>
-        <w:t xml:space="preserve">a thirty-session sensitivity, but the cohort remains unopened. A separately authorised</w:t>
-      </w:r>
-      <w:r>
-        <w:t xml:space="preserve"> </w:t>
-      </w:r>
-      <w:r>
-        <w:t xml:space="preserve">one-shot evaluation will be published as a dated addendum under the bridge's exploratory,</w:t>
-      </w:r>
-      <w:r>
-        <w:t xml:space="preserve"> </w:t>
-      </w:r>
-      <w:r>
-        <w:t xml:space="preserve">non-confirmatory label. This report therefore contains no Phase 8 estimate, interval,</w:t>
-      </w:r>
-      <w:r>
-        <w:t xml:space="preserve"> </w:t>
-      </w:r>
-      <w:r>
-        <w:t xml:space="preserve">p-value or verdict, and records</w:t>
+        <w:t xml:space="preserve">The owner-authorised bridge consumed its sole read on 2026-08-30 under the frozen</w:t>
+      </w:r>
+      <w:r>
+        <w:t xml:space="preserve"> </w:t>
+      </w:r>
+      <w:r>
+        <w:t xml:space="preserve">twenty-session primary window and thirty-session sensitivity. Its classification is</w:t>
+      </w:r>
+      <w:r>
+        <w:t xml:space="preserve"> </w:t>
+      </w:r>
+      <w:r>
+        <w:rPr>
+          <w:rStyle w:val="VerbatimChar"/>
+        </w:rPr>
+        <w:t xml:space="preserve">MIXED_EXPLORATORY</w:t>
+      </w:r>
+      <w:r>
+        <w:t xml:space="preserve">, descriptive and non-confirmatory. In the primary window all four ΔB1</w:t>
+      </w:r>
+      <w:r>
+        <w:t xml:space="preserve"> </w:t>
+      </w:r>
+      <w:r>
+        <w:t xml:space="preserve">estimates are positive; three of four descriptive Holm p-values are below 0.05. For</w:t>
+      </w:r>
+      <w:r>
+        <w:t xml:space="preserve"> </w:t>
+      </w:r>
+      <w:r>
+        <w:t xml:space="preserve">ΔB2 conditional on B1, all four intervals cross zero and every Holm p-value exceeds 0.39.</w:t>
+      </w:r>
+      <w:r>
+        <w:t xml:space="preserve"> </w:t>
+      </w:r>
+      <w:r>
+        <w:t xml:space="preserve">The positive prospective contribution is therefore concentrated in the B1 option-state</w:t>
+      </w:r>
+      <w:r>
+        <w:t xml:space="preserve"> </w:t>
+      </w:r>
+      <w:r>
+        <w:t xml:space="preserve">block, not established in B2 flow.</w:t>
+      </w:r>
+    </w:p>
+    <w:p>
+      <w:pPr>
+        <w:pStyle w:val="BodyText"/>
+      </w:pPr>
+      <w:r>
+        <w:t xml:space="preserve">The append-only dispersion audit replays all 20 primary contrast rows and all 140 published</w:t>
+      </w:r>
+      <w:r>
+        <w:t xml:space="preserve"> </w:t>
+      </w:r>
+      <w:r>
+        <w:t xml:space="preserve">fields exactly from the materialised cube, without reopening the sealed store or running a</w:t>
+      </w:r>
+      <w:r>
+        <w:t xml:space="preserve"> </w:t>
+      </w:r>
+      <w:r>
+        <w:t xml:space="preserve">second evaluator. It finds no aggregation change. The read count is Phase 8 = 1; the full</w:t>
+      </w:r>
+      <w:r>
+        <w:t xml:space="preserve"> </w:t>
+      </w:r>
+      <w:r>
+        <w:t xml:space="preserve">cells, asymmetric intervals, descriptive Holm values, recovery boundary and frozen</w:t>
+      </w:r>
+      <w:r>
+        <w:t xml:space="preserve"> </w:t>
+      </w:r>
+      <w:r>
+        <w:t xml:space="preserve">producer closure are reported in</w:t>
+      </w:r>
+      <w:r>
+        <w:t xml:space="preserve"> </w:t>
+      </w:r>
+      <w:r>
+        <w:rPr>
+          <w:rStyle w:val="VerbatimChar"/>
+        </w:rPr>
+        <w:t xml:space="preserve">reports/phase8a_exploratory_bridge_addendum_v11.md</w:t>
+      </w:r>
+      <w:r>
+        <w:t xml:space="preserve">.</w:t>
+      </w:r>
+    </w:p>
+    <w:bookmarkEnd w:id="32"/>
+    <w:bookmarkStart w:id="33" w:name="X92789f8c2ab2ec71a880ad0265646011b597bdb"/>
+    <w:p>
+      <w:pPr>
+        <w:pStyle w:val="Heading3"/>
+      </w:pPr>
+      <w:r>
+        <w:t xml:space="preserve">5.3 Directional B2 extension and treatment-by-coverage attribution</w:t>
+      </w:r>
+    </w:p>
+    <w:p>
+      <w:pPr>
+        <w:pStyle w:val="FirstParagraph"/>
+      </w:pPr>
+      <w:r>
+        <w:t xml:space="preserve">The registered directional extension returned</w:t>
+      </w:r>
+      <w:r>
+        <w:t xml:space="preserve"> </w:t>
+      </w:r>
+      <w:r>
+        <w:rPr>
+          <w:rStyle w:val="VerbatimChar"/>
+        </w:rPr>
+        <w:t xml:space="preserve">DO_NOT_PURSUE</w:t>
+      </w:r>
+      <w:r>
+        <w:t xml:space="preserve"> </w:t>
+      </w:r>
+      <w:r>
+        <w:t xml:space="preserve">with</w:t>
+      </w:r>
+      <w:r>
+        <w:t xml:space="preserve"> </w:t>
+      </w:r>
+      <w:r>
+        <w:rPr>
+          <w:rStyle w:val="VerbatimChar"/>
+        </w:rPr>
+        <w:t xml:space="preserve">pursue_rule_passed = false</w:t>
+      </w:r>
+      <w:r>
+        <w:t xml:space="preserve">; its stricter sign falsifier did not fire. That means the</w:t>
+      </w:r>
+      <w:r>
+        <w:t xml:space="preserve"> </w:t>
+      </w:r>
+      <w:r>
+        <w:t xml:space="preserve">selected directional lead was not strong enough to justify a new programme, not that its</w:t>
+      </w:r>
+      <w:r>
+        <w:t xml:space="preserve"> </w:t>
+      </w:r>
+      <w:r>
+        <w:t xml:space="preserve">population effect was proved zero. The timing-remediated run did not reopen that 68-test</w:t>
+      </w:r>
+      <w:r>
+        <w:t xml:space="preserve"> </w:t>
+      </w:r>
+      <w:r>
+        <w:t xml:space="preserve">battery. It did rerun the preregistered 2 × 2 factorial that asks whether movement in the</w:t>
+      </w:r>
+      <w:r>
+        <w:t xml:space="preserve"> </w:t>
+      </w:r>
+      <w:r>
+        <w:t xml:space="preserve">joint statistic is attributable to treatment definition or data coverage. Each entry</w:t>
+      </w:r>
+      <w:r>
+        <w:t xml:space="preserve"> </w:t>
+      </w:r>
+      <w:r>
+        <w:t xml:space="preserve">below is</w:t>
+      </w:r>
+      <w:r>
+        <w:t xml:space="preserve"> </w:t>
+      </w:r>
+      <w:r>
+        <w:rPr>
+          <w:rStyle w:val="VerbatimChar"/>
+        </w:rPr>
+        <w:t xml:space="preserve">Wald / df / raw p / 40-test Holm p</w:t>
+      </w:r>
+      <w:r>
+        <w:t xml:space="preserve">.</w:t>
+      </w:r>
+    </w:p>
+    <w:tbl>
+      <w:tblPr>
+        <w:tblStyle w:val="Table"/>
+        <w:tblW w:type="auto" w:w="0"/>
+        <w:tblLook w:firstRow="1" w:lastRow="0" w:firstColumn="0" w:lastColumn="0" w:noHBand="0" w:noVBand="0" w:val="0020"/>
+        <w:jc w:val="start"/>
+      </w:tblPr>
+      <w:tblGrid>
+        <w:gridCol w:w="1584"/>
+        <w:gridCol w:w="1584"/>
+        <w:gridCol w:w="1584"/>
+        <w:gridCol w:w="1584"/>
+        <w:gridCol w:w="1584"/>
+      </w:tblGrid>
+      <w:tr>
+        <w:trPr>
+          <w:tblHeader w:val="true"/>
+        </w:trPr>
+        <w:tc>
+          <w:tcPr/>
+          <w:p>
+            <w:pPr>
+              <w:pStyle w:val="Compact"/>
+              <w:jc w:val="left"/>
+            </w:pPr>
+            <w:r>
+              <w:t xml:space="preserve">Treatment set / coverage</w:t>
+            </w:r>
+          </w:p>
+        </w:tc>
+        <w:tc>
+          <w:tcPr/>
+          <w:p>
+            <w:pPr>
+              <w:pStyle w:val="Compact"/>
+              <w:jc w:val="right"/>
+            </w:pPr>
+            <w:r>
+              <w:t xml:space="preserve">D 60m</w:t>
+            </w:r>
+          </w:p>
+        </w:tc>
+        <w:tc>
+          <w:tcPr/>
+          <w:p>
+            <w:pPr>
+              <w:pStyle w:val="Compact"/>
+              <w:jc w:val="right"/>
+            </w:pPr>
+            <w:r>
+              <w:t xml:space="preserve">D 120m</w:t>
+            </w:r>
+          </w:p>
+        </w:tc>
+        <w:tc>
+          <w:tcPr/>
+          <w:p>
+            <w:pPr>
+              <w:pStyle w:val="Compact"/>
+              <w:jc w:val="right"/>
+            </w:pPr>
+            <w:r>
+              <w:t xml:space="preserve">V 60m</w:t>
+            </w:r>
+          </w:p>
+        </w:tc>
+        <w:tc>
+          <w:tcPr/>
+          <w:p>
+            <w:pPr>
+              <w:pStyle w:val="Compact"/>
+              <w:jc w:val="right"/>
+            </w:pPr>
+            <w:r>
+              <w:t xml:space="preserve">V 120m</w:t>
+            </w:r>
+          </w:p>
+        </w:tc>
+      </w:tr>
+      <w:tr>
+        <w:tc>
+          <w:tcPr/>
+          <w:p>
+            <w:pPr>
+              <w:pStyle w:val="Compact"/>
+              <w:jc w:val="left"/>
+            </w:pPr>
+            <w:r>
+              <w:t xml:space="preserve">Ext1 exact / August</w:t>
+            </w:r>
+          </w:p>
+        </w:tc>
+        <w:tc>
+          <w:tcPr/>
+          <w:p>
+            <w:pPr>
+              <w:pStyle w:val="Compact"/>
+              <w:jc w:val="right"/>
+            </w:pPr>
+            <w:r>
+              <w:t xml:space="preserve">12.593 / 10 / 0.247302 / 1.000000</w:t>
+            </w:r>
+          </w:p>
+        </w:tc>
+        <w:tc>
+          <w:tcPr/>
+          <w:p>
+            <w:pPr>
+              <w:pStyle w:val="Compact"/>
+              <w:jc w:val="right"/>
+            </w:pPr>
+            <w:r>
+              <w:t xml:space="preserve">11.769 / 10 / 0.300784 / 1.000000</w:t>
+            </w:r>
+          </w:p>
+        </w:tc>
+        <w:tc>
+          <w:tcPr/>
+          <w:p>
+            <w:pPr>
+              <w:pStyle w:val="Compact"/>
+              <w:jc w:val="right"/>
+            </w:pPr>
+            <w:r>
+              <w:t xml:space="preserve">27.793 / 10 / 0.001948 / 0.070123</w:t>
+            </w:r>
+          </w:p>
+        </w:tc>
+        <w:tc>
+          <w:tcPr/>
+          <w:p>
+            <w:pPr>
+              <w:pStyle w:val="Compact"/>
+              <w:jc w:val="right"/>
+            </w:pPr>
+            <w:r>
+              <w:t xml:space="preserve">29.554 / 10 / 0.001013 / 0.038488</w:t>
+            </w:r>
+          </w:p>
+        </w:tc>
+      </w:tr>
+      <w:tr>
+        <w:tc>
+          <w:tcPr/>
+          <w:p>
+            <w:pPr>
+              <w:pStyle w:val="Compact"/>
+              <w:jc w:val="left"/>
+            </w:pPr>
+            <w:r>
+              <w:t xml:space="preserve">Ext1 exact / complete</w:t>
+            </w:r>
+          </w:p>
+        </w:tc>
+        <w:tc>
+          <w:tcPr/>
+          <w:p>
+            <w:pPr>
+              <w:pStyle w:val="Compact"/>
+              <w:jc w:val="right"/>
+            </w:pPr>
+            <w:r>
+              <w:t xml:space="preserve">12.976 / 10 / 0.225014 / 1.000000</w:t>
+            </w:r>
+          </w:p>
+        </w:tc>
+        <w:tc>
+          <w:tcPr/>
+          <w:p>
+            <w:pPr>
+              <w:pStyle w:val="Compact"/>
+              <w:jc w:val="right"/>
+            </w:pPr>
+            <w:r>
+              <w:t xml:space="preserve">17.634 / 10 / 0.061464 / 1.000000</w:t>
+            </w:r>
+          </w:p>
+        </w:tc>
+        <w:tc>
+          <w:tcPr/>
+          <w:p>
+            <w:pPr>
+              <w:pStyle w:val="Compact"/>
+              <w:jc w:val="right"/>
+            </w:pPr>
+            <w:r>
+              <w:t xml:space="preserve">27.793 / 10 / 0.001948 / 0.070123</w:t>
+            </w:r>
+          </w:p>
+        </w:tc>
+        <w:tc>
+          <w:tcPr/>
+          <w:p>
+            <w:pPr>
+              <w:pStyle w:val="Compact"/>
+              <w:jc w:val="right"/>
+            </w:pPr>
+            <w:r>
+              <w:t xml:space="preserve">29.554 / 10 / 0.001013 / 0.038488</w:t>
+            </w:r>
+          </w:p>
+        </w:tc>
+      </w:tr>
+      <w:tr>
+        <w:tc>
+          <w:tcPr/>
+          <w:p>
+            <w:pPr>
+              <w:pStyle w:val="Compact"/>
+              <w:jc w:val="left"/>
+            </w:pPr>
+            <w:r>
+              <w:t xml:space="preserve">B2 panel 12 / August</w:t>
+            </w:r>
+          </w:p>
+        </w:tc>
+        <w:tc>
+          <w:tcPr/>
+          <w:p>
+            <w:pPr>
+              <w:pStyle w:val="Compact"/>
+              <w:jc w:val="right"/>
+            </w:pPr>
+            <w:r>
+              <w:t xml:space="preserve">29.405 / 12 / 0.003429 / 0.109729</w:t>
+            </w:r>
+          </w:p>
+        </w:tc>
+        <w:tc>
+          <w:tcPr/>
+          <w:p>
+            <w:pPr>
+              <w:pStyle w:val="Compact"/>
+              <w:jc w:val="right"/>
+            </w:pPr>
+            <w:r>
+              <w:t xml:space="preserve">22.717 / 12 / 0.030231 / 0.816240</w:t>
+            </w:r>
+          </w:p>
+        </w:tc>
+        <w:tc>
+          <w:tcPr/>
+          <w:p>
+            <w:pPr>
+              <w:pStyle w:val="Compact"/>
+              <w:jc w:val="right"/>
+            </w:pPr>
+            <w:r>
+              <w:t xml:space="preserve">30.457 / 12 / 0.002382 / 0.080985</w:t>
+            </w:r>
+          </w:p>
+        </w:tc>
+        <w:tc>
+          <w:tcPr/>
+          <w:p>
+            <w:pPr>
+              <w:pStyle w:val="Compact"/>
+              <w:jc w:val="right"/>
+            </w:pPr>
+            <w:r>
+              <w:t xml:space="preserve">26.444 / 12 / 0.009284 / 0.269236</w:t>
+            </w:r>
+          </w:p>
+        </w:tc>
+      </w:tr>
+      <w:tr>
+        <w:tc>
+          <w:tcPr/>
+          <w:p>
+            <w:pPr>
+              <w:pStyle w:val="Compact"/>
+              <w:jc w:val="left"/>
+            </w:pPr>
+            <w:r>
+              <w:t xml:space="preserve">B2 panel 12 / complete</w:t>
+            </w:r>
+          </w:p>
+        </w:tc>
+        <w:tc>
+          <w:tcPr/>
+          <w:p>
+            <w:pPr>
+              <w:pStyle w:val="Compact"/>
+              <w:jc w:val="right"/>
+            </w:pPr>
+            <w:r>
+              <w:t xml:space="preserve">33.065 / 12 / 0.000946 / 0.036878</w:t>
+            </w:r>
+          </w:p>
+        </w:tc>
+        <w:tc>
+          <w:tcPr/>
+          <w:p>
+            <w:pPr>
+              <w:pStyle w:val="Compact"/>
+              <w:jc w:val="right"/>
+            </w:pPr>
+            <w:r>
+              <w:t xml:space="preserve">37.072 / 12 / 0.000217 / 0.008699</w:t>
+            </w:r>
+          </w:p>
+        </w:tc>
+        <w:tc>
+          <w:tcPr/>
+          <w:p>
+            <w:pPr>
+              <w:pStyle w:val="Compact"/>
+              <w:jc w:val="right"/>
+            </w:pPr>
+            <w:r>
+              <w:t xml:space="preserve">30.457 / 12 / 0.002382 / 0.080985</w:t>
+            </w:r>
+          </w:p>
+        </w:tc>
+        <w:tc>
+          <w:tcPr/>
+          <w:p>
+            <w:pPr>
+              <w:pStyle w:val="Compact"/>
+              <w:jc w:val="right"/>
+            </w:pPr>
+            <w:r>
+              <w:t xml:space="preserve">26.444 / 12 / 0.009284 / 0.269236</w:t>
+            </w:r>
+          </w:p>
+        </w:tc>
+      </w:tr>
+    </w:tbl>
+    <w:p>
+      <w:pPr>
+        <w:pStyle w:val="BodyText"/>
+      </w:pPr>
+      <w:r>
+        <w:t xml:space="preserve">On the registered</w:t>
+      </w:r>
+      <w:r>
+        <w:t xml:space="preserve"> </w:t>
+      </w:r>
+      <w:r>
+        <w:rPr>
+          <w:rStyle w:val="VerbatimChar"/>
+        </w:rPr>
+        <w:t xml:space="preserve">log(Wald / df)</w:t>
+      </w:r>
+      <w:r>
+        <w:t xml:space="preserve"> </w:t>
+      </w:r>
+      <w:r>
+        <w:t xml:space="preserve">scale, the median absolute treatment-set main effect</w:t>
+      </w:r>
+      <w:r>
+        <w:t xml:space="preserve"> </w:t>
+      </w:r>
+      <w:r>
+        <w:t xml:space="preserve">is 0.405764 and the coverage main effect is 0.036811, a ratio of 11.02. The registered</w:t>
+      </w:r>
+      <w:r>
+        <w:t xml:space="preserve"> </w:t>
+      </w:r>
+      <w:r>
+        <w:t xml:space="preserve">classification is</w:t>
+      </w:r>
+      <w:r>
+        <w:t xml:space="preserve"> </w:t>
+      </w:r>
+      <w:r>
+        <w:rPr>
+          <w:rStyle w:val="VerbatimChar"/>
+        </w:rPr>
+        <w:t xml:space="preserve">TREATMENT_SET</w:t>
+      </w:r>
+      <w:r>
+        <w:t xml:space="preserve">, descriptively rather than causally because the sets are</w:t>
+      </w:r>
+      <w:r>
+        <w:t xml:space="preserve"> </w:t>
+      </w:r>
+      <w:r>
+        <w:t xml:space="preserve">not nested. It does not explain the historical validation decline: August and complete</w:t>
+      </w:r>
+      <w:r>
+        <w:t xml:space="preserve"> </w:t>
+      </w:r>
+      <w:r>
+        <w:t xml:space="preserve">coverage have identical V masks, and the 12-feature panel set does not restore the frozen</w:t>
+      </w:r>
+      <w:r>
+        <w:t xml:space="preserve"> </w:t>
+      </w:r>
+      <w:r>
+        <w:t xml:space="preserve">V 120-minute statistic. For that decline the result is</w:t>
+      </w:r>
+      <w:r>
+        <w:t xml:space="preserve"> </w:t>
+      </w:r>
+      <w:r>
+        <w:rPr>
+          <w:rStyle w:val="VerbatimChar"/>
+        </w:rPr>
+        <w:t xml:space="preserve">NEITHER_TREATMENT_SET_NOR_COVERAGE</w:t>
+      </w:r>
+      <w:r>
+        <w:t xml:space="preserve">.</w:t>
+      </w:r>
+    </w:p>
+    <w:p>
+      <w:pPr>
+        <w:pStyle w:val="BodyText"/>
+      </w:pPr>
+      <w:r>
+        <w:t xml:space="preserve">The exact Ext1 contract names</w:t>
+      </w:r>
+      <w:r>
+        <w:t xml:space="preserve"> </w:t>
+      </w:r>
+      <w:r>
+        <w:rPr>
+          <w:rStyle w:val="VerbatimChar"/>
+        </w:rPr>
+        <w:t xml:space="preserve">b2_5m_hawkes_innovation</w:t>
+      </w:r>
+      <w:r>
+        <w:t xml:space="preserve">, which no longer exists in the</w:t>
+      </w:r>
+      <w:r>
+        <w:t xml:space="preserve"> </w:t>
+      </w:r>
+      <w:r>
+        <w:t xml:space="preserve">panel. The producer records a</w:t>
+      </w:r>
+      <w:r>
+        <w:t xml:space="preserve"> </w:t>
+      </w:r>
+      <w:r>
+        <w:rPr>
+          <w:rStyle w:val="VerbatimChar"/>
+        </w:rPr>
+        <w:t xml:space="preserve">RECORDED_SEMANTIC_RENAME</w:t>
+      </w:r>
+      <w:r>
+        <w:t xml:space="preserve"> </w:t>
+      </w:r>
+      <w:r>
+        <w:t xml:space="preserve">to</w:t>
+      </w:r>
+      <w:r>
+        <w:t xml:space="preserve"> </w:t>
+      </w:r>
+      <w:r>
+        <w:rPr>
+          <w:rStyle w:val="VerbatimChar"/>
+        </w:rPr>
+        <w:t xml:space="preserve">b2_5m_decay_intensity_innovation</w:t>
+      </w:r>
+      <w:r>
+        <w:t xml:space="preserve">, maps the historical label in memory, retains the</w:t>
+      </w:r>
+      <w:r>
+        <w:t xml:space="preserve"> </w:t>
+      </w:r>
+      <w:r>
+        <w:t xml:space="preserve">ten-column Ext1 coefficient identity and does not recompute the feature. The obsolete</w:t>
+      </w:r>
+      <w:r>
+        <w:t xml:space="preserve"> </w:t>
+      </w:r>
+      <w:r>
+        <w:t xml:space="preserve">column bytes are unavailable, so historical byte equality cannot be confirmed. The full</w:t>
+      </w:r>
+      <w:r>
+        <w:t xml:space="preserve"> </w:t>
+      </w:r>
+      <w:r>
+        <w:t xml:space="preserve">factorial, requested/resolved names and hashes are in</w:t>
+      </w:r>
+      <w:r>
+        <w:t xml:space="preserve"> </w:t>
+      </w:r>
+      <w:r>
+        <w:rPr>
+          <w:rStyle w:val="VerbatimChar"/>
+        </w:rPr>
+        <w:t xml:space="preserve">artifacts/rp2_ext1_directional_factorial_v2/results.json</w:t>
+      </w:r>
+      <w:r>
+        <w:t xml:space="preserve">; it records</w:t>
       </w:r>
       <w:r>
         <w:t xml:space="preserve"> </w:t>
@@ -3008,26 +3672,17 @@
         <w:t xml:space="preserve">sealed_cohorts_read=0</w:t>
       </w:r>
       <w:r>
-        <w:t xml:space="preserve"> </w:t>
-      </w:r>
-      <w:r>
-        <w:t xml:space="preserve">instead of filling the gap with an</w:t>
-      </w:r>
-      <w:r>
-        <w:t xml:space="preserve"> </w:t>
-      </w:r>
-      <w:r>
-        <w:t xml:space="preserve">assumption.</w:t>
-      </w:r>
-    </w:p>
-    <w:bookmarkEnd w:id="32"/>
-    <w:bookmarkStart w:id="33" w:name="X94ddadd8e29c92230f63b9715b7a46211d61586"/>
+        <w:t xml:space="preserve">.</w:t>
+      </w:r>
+    </w:p>
+    <w:bookmarkEnd w:id="33"/>
+    <w:bookmarkStart w:id="34" w:name="X08e477e665b55ba288ce28eba8927c6ac385830"/>
     <w:p>
       <w:pPr>
         <w:pStyle w:val="Heading3"/>
       </w:pPr>
       <w:r>
-        <w:t xml:space="preserve">5.3 Calibration, and what the loss is rewarding</w:t>
+        <w:t xml:space="preserve">5.4 Calibration, and what the loss is rewarding</w:t>
       </w:r>
     </w:p>
     <w:p>
@@ -3124,7 +3779,13 @@
         <w:t xml:space="preserve"> </w:t>
       </w:r>
       <w:r>
-        <w:t xml:space="preserve">repairs of decision 92. Remeasured, discovery ΔB1 moves from +0.00219 to +0.00237 for</w:t>
+        <w:t xml:space="preserve">repairs of decision 92. Under the timing-remediated bundle, recalibrated discovery ΔB1 is</w:t>
+      </w:r>
+      <w:r>
+        <w:t xml:space="preserve"> </w:t>
+      </w:r>
+      <w:r>
+        <w:t xml:space="preserve">+0.00276 for</w:t>
       </w:r>
       <w:r>
         <w:t xml:space="preserve"> </w:t>
@@ -3136,7 +3797,7 @@
         <w:t xml:space="preserve">gamma_glm</w:t>
       </w:r>
       <w:r>
-        <w:t xml:space="preserve">, stays at +0.00229 for</w:t>
+        <w:t xml:space="preserve">, +0.00288 for</w:t>
       </w:r>
       <w:r>
         <w:t xml:space="preserve"> </w:t>
@@ -3151,7 +3812,7 @@
         <w:t xml:space="preserve"> </w:t>
       </w:r>
       <w:r>
-        <w:t xml:space="preserve">and moves from +0.00253 to +0.00264 for</w:t>
+        <w:t xml:space="preserve">and +0.00285 for</w:t>
       </w:r>
       <w:r>
         <w:t xml:space="preserve"> </w:t>
@@ -3163,7 +3824,7 @@
         <w:t xml:space="preserve">lightgbm_qlike</w:t>
       </w:r>
       <w:r>
-        <w:t xml:space="preserve">; validation reads −0.00057, −0.00082 and +0.00196, none significant</w:t>
+        <w:t xml:space="preserve">; validation reads −0.00084, −0.00091 and −0.00101, none significant</w:t>
       </w:r>
       <w:r>
         <w:t xml:space="preserve"> </w:t>
@@ -3208,7 +3869,7 @@
         <w:t xml:space="preserve"> </w:t>
       </w:r>
       <w:r>
-        <w:t xml:space="preserve">the tree family's is 1.02 against 1.07 — so the raw validation nulls and the recalibrated</w:t>
+        <w:t xml:space="preserve">the tree family's is 1.02 against 1.11 — so the raw validation nulls and the recalibrated</w:t>
       </w:r>
       <w:r>
         <w:t xml:space="preserve"> </w:t>
@@ -3234,7 +3895,7 @@
         <w:t xml:space="preserve"> </w:t>
       </w:r>
       <w:r>
-        <w:t xml:space="preserve">is +0.00001 for</w:t>
+        <w:t xml:space="preserve">is +0.00024 for</w:t>
       </w:r>
       <w:r>
         <w:t xml:space="preserve"> </w:t>
@@ -3246,7 +3907,7 @@
         <w:t xml:space="preserve">gamma_glm</w:t>
       </w:r>
       <w:r>
-        <w:t xml:space="preserve">, +0.00017 for</w:t>
+        <w:t xml:space="preserve">, +0.00028 for</w:t>
       </w:r>
       <w:r>
         <w:t xml:space="preserve"> </w:t>
@@ -3261,7 +3922,7 @@
         <w:t xml:space="preserve"> </w:t>
       </w:r>
       <w:r>
-        <w:t xml:space="preserve">and +0.00062 for</w:t>
+        <w:t xml:space="preserve">and +0.00096 for</w:t>
       </w:r>
       <w:r>
         <w:t xml:space="preserve"> </w:t>
@@ -3320,14 +3981,14 @@
         <w:t xml:space="preserve">disagreement itself as evidence about the loss rather than about the market.</w:t>
       </w:r>
     </w:p>
-    <w:bookmarkEnd w:id="33"/>
-    <w:bookmarkStart w:id="34" w:name="X94378d4108cadf7fc64c4f396cb9f4cb0d875ef"/>
+    <w:bookmarkEnd w:id="34"/>
+    <w:bookmarkStart w:id="35" w:name="X8389a3a91025374832e5a84c65754e1ef7d1ba7"/>
     <w:p>
       <w:pPr>
         <w:pStyle w:val="Heading3"/>
       </w:pPr>
       <w:r>
-        <w:t xml:space="preserve">5.4 Field-standard baselines and the activity block</w:t>
+        <w:t xml:space="preserve">5.5 Field-standard baselines and the activity block</w:t>
       </w:r>
     </w:p>
     <w:p>
@@ -3377,7 +4038,13 @@
         <w:t xml:space="preserve"> </w:t>
       </w:r>
       <w:r>
-        <w:t xml:space="preserve">makes forecasts marginally worse (−0.00068 and −0.00070, neither significant)</w:t>
+        <w:t xml:space="preserve">makes forecasts marginally worse (−0.00068 and −0.00070; all cluster/Newey–West/wild</w:t>
+      </w:r>
+      <w:r>
+        <w:t xml:space="preserve"> </w:t>
+      </w:r>
+      <w:r>
+        <w:t xml:space="preserve">p ≥ 0.50)</w:t>
       </w:r>
       <w:r>
         <w:t xml:space="preserve"> </w:t>
@@ -3407,9 +4074,9 @@
         <w:t xml:space="preserve">improve those HAR/HARQ specifications on the measured sessions.</w:t>
       </w:r>
     </w:p>
-    <w:bookmarkEnd w:id="34"/>
     <w:bookmarkEnd w:id="35"/>
-    <w:bookmarkStart w:id="36" w:name="Xe60211b7362d4efd10cab3a88ad8ddec4cb4e70"/>
+    <w:bookmarkEnd w:id="36"/>
+    <w:bookmarkStart w:id="37" w:name="Xe60211b7362d4efd10cab3a88ad8ddec4cb4e70"/>
     <w:p>
       <w:pPr>
         <w:pStyle w:val="Heading2"/>
@@ -3441,19 +4108,37 @@
         <w:t xml:space="preserve"> </w:t>
       </w:r>
       <w:r>
-        <w:t xml:space="preserve">The separate HAR/HARQ diagnostic also finds no improvement from its activity block.</w:t>
-      </w:r>
-      <w:r>
-        <w:t xml:space="preserve"> </w:t>
-      </w:r>
-      <w:r>
-        <w:t xml:space="preserve">Second, the discovery result is not confirmed on the later validation sample, and the</w:t>
-      </w:r>
-      <w:r>
-        <w:t xml:space="preserve"> </w:t>
-      </w:r>
-      <w:r>
-        <w:t xml:space="preserve">design cannot say why: nine of the twelve contrasts sit</w:t>
+        <w:t xml:space="preserve">The separate HAR/HARQ diagnostic also finds no improvement from its activity block, the</w:t>
+      </w:r>
+      <w:r>
+        <w:t xml:space="preserve"> </w:t>
+      </w:r>
+      <w:r>
+        <w:t xml:space="preserve">directional rule returns</w:t>
+      </w:r>
+      <w:r>
+        <w:t xml:space="preserve"> </w:t>
+      </w:r>
+      <w:r>
+        <w:rPr>
+          <w:rStyle w:val="VerbatimChar"/>
+        </w:rPr>
+        <w:t xml:space="preserve">DO_NOT_PURSUE</w:t>
+      </w:r>
+      <w:r>
+        <w:t xml:space="preserve">, and Phase 8 adds no incremental B2 result on top</w:t>
+      </w:r>
+      <w:r>
+        <w:t xml:space="preserve"> </w:t>
+      </w:r>
+      <w:r>
+        <w:t xml:space="preserve">of B1. Second, the discovery result is not confirmed on the later validation sample, and</w:t>
+      </w:r>
+      <w:r>
+        <w:t xml:space="preserve"> </w:t>
+      </w:r>
+      <w:r>
+        <w:t xml:space="preserve">the design cannot say why: ten of the twelve contrasts sit</w:t>
       </w:r>
       <w:r>
         <w:t xml:space="preserve"> </w:t>
@@ -3553,13 +4238,34 @@
         <w:t xml:space="preserve"> </w:t>
       </w:r>
       <w:r>
-        <w:t xml:space="preserve">open. Phase 8 remains an unopened exploratory bridge. Phase 9 (decision 58) remains a</w:t>
-      </w:r>
-      <w:r>
-        <w:t xml:space="preserve"> </w:t>
-      </w:r>
-      <w:r>
-        <w:t xml:space="preserve">frozen, collecting, 60-session one-read test of total contribution. Decisions 100–101</w:t>
+        <w:t xml:space="preserve">open. Phase 8 is complete as a one-read</w:t>
+      </w:r>
+      <w:r>
+        <w:t xml:space="preserve"> </w:t>
+      </w:r>
+      <w:r>
+        <w:rPr>
+          <w:rStyle w:val="VerbatimChar"/>
+        </w:rPr>
+        <w:t xml:space="preserve">MIXED_EXPLORATORY</w:t>
+      </w:r>
+      <w:r>
+        <w:t xml:space="preserve"> </w:t>
+      </w:r>
+      <w:r>
+        <w:t xml:space="preserve">bridge and cannot be promoted</w:t>
+      </w:r>
+      <w:r>
+        <w:t xml:space="preserve"> </w:t>
+      </w:r>
+      <w:r>
+        <w:t xml:space="preserve">or rerun. Phase 9 (decision 58) remains a frozen, collecting, 60-session one-read test of</w:t>
+      </w:r>
+      <w:r>
+        <w:t xml:space="preserve"> </w:t>
+      </w:r>
+      <w:r>
+        <w:t xml:space="preserve">total contribution. Decisions 100–101</w:t>
       </w:r>
       <w:r>
         <w:t xml:space="preserve"> </w:t>
@@ -3622,8 +4328,8 @@
         <w:t xml:space="preserve">.</w:t>
       </w:r>
     </w:p>
-    <w:bookmarkEnd w:id="36"/>
-    <w:bookmarkStart w:id="37" w:name="X37c964ddc35c2eea68e5d9ed0daf274553be565"/>
+    <w:bookmarkEnd w:id="37"/>
+    <w:bookmarkStart w:id="38" w:name="X37c964ddc35c2eea68e5d9ed0daf274553be565"/>
     <w:p>
       <w:pPr>
         <w:pStyle w:val="Heading2"/>
@@ -3655,7 +4361,7 @@
         <w:t xml:space="preserve"> </w:t>
       </w:r>
       <w:r>
-        <w:t xml:space="preserve">that follow — 0.00411 for</w:t>
+        <w:t xml:space="preserve">that follow — 0.00496 for</w:t>
       </w:r>
       <w:r>
         <w:t xml:space="preserve"> </w:t>
@@ -3667,7 +4373,7 @@
         <w:t xml:space="preserve">gamma_glm</w:t>
       </w:r>
       <w:r>
-        <w:t xml:space="preserve">, 0.00271 for</w:t>
+        <w:t xml:space="preserve">, 0.00311 for</w:t>
       </w:r>
       <w:r>
         <w:t xml:space="preserve"> </w:t>
@@ -3679,7 +4385,7 @@
         <w:t xml:space="preserve">ridge_log</w:t>
       </w:r>
       <w:r>
-        <w:t xml:space="preserve">, 0.01517 for</w:t>
+        <w:t xml:space="preserve">, 0.01037 for</w:t>
       </w:r>
       <w:r>
         <w:t xml:space="preserve"> </w:t>
@@ -3694,13 +4400,13 @@
         <w:t xml:space="preserve"> </w:t>
       </w:r>
       <w:r>
-        <w:t xml:space="preserve">— stand against discovery increments of +0.00219, +0.00229 and +0.00253,</w:t>
-      </w:r>
-      <w:r>
-        <w:t xml:space="preserve"> </w:t>
-      </w:r>
-      <w:r>
-        <w:t xml:space="preserve">and nine of the twelve contrasts sit below their own bound (§5.1). Every validation null</w:t>
+        <w:t xml:space="preserve">— stand against discovery increments of +0.00258, +0.00288 and +0.00267,</w:t>
+      </w:r>
+      <w:r>
+        <w:t xml:space="preserve"> </w:t>
+      </w:r>
+      <w:r>
+        <w:t xml:space="preserve">and ten of the twelve contrasts sit below their own bound (§5.1). Every validation null</w:t>
       </w:r>
       <w:r>
         <w:t xml:space="preserve"> </w:t>
@@ -3741,13 +4447,13 @@
         <w:t xml:space="preserve"> </w:t>
       </w:r>
       <w:r>
-        <w:t xml:space="preserve">validation ΔB2|B1 of −0.00215 at</w:t>
-      </w:r>
-      <w:r>
-        <w:t xml:space="preserve"> </w:t>
-      </w:r>
-      <w:r>
-        <w:t xml:space="preserve">[−0.00437, −0.00032] excludes zero at 95 percent without clearing the budget, and carries</w:t>
+        <w:t xml:space="preserve">validation ΔB2|B1 of −0.00272 at</w:t>
+      </w:r>
+      <w:r>
+        <w:t xml:space="preserve"> </w:t>
+      </w:r>
+      <w:r>
+        <w:t xml:space="preserve">[−0.00598, −0.00011] excludes zero at 95 percent without clearing the budget, and carries</w:t>
       </w:r>
       <w:r>
         <w:t xml:space="preserve"> </w:t>
@@ -3779,19 +4485,19 @@
         <w:t xml:space="preserve"> </w:t>
       </w:r>
       <w:r>
-        <w:t xml:space="preserve">three fixed families give discovery ΔB1 of +0.00219, +0.00229 and +0.00253, while</w:t>
-      </w:r>
-      <w:r>
-        <w:t xml:space="preserve"> </w:t>
-      </w:r>
-      <w:r>
-        <w:t xml:space="preserve">validation gives −0.00113, −0.00083 and +0.00211 and their minimum detectable effects</w:t>
-      </w:r>
-      <w:r>
-        <w:t xml:space="preserve"> </w:t>
-      </w:r>
-      <w:r>
-        <w:t xml:space="preserve">differ by a factor of 5.6. The family therefore fixes both the estimate and what the experiment</w:t>
+        <w:t xml:space="preserve">three fixed families give discovery ΔB1 of +0.00258, +0.00288 and +0.00267, while</w:t>
+      </w:r>
+      <w:r>
+        <w:t xml:space="preserve"> </w:t>
+      </w:r>
+      <w:r>
+        <w:t xml:space="preserve">validation gives −0.00152, −0.00092 and +0.00136 and their minimum detectable effects</w:t>
+      </w:r>
+      <w:r>
+        <w:t xml:space="preserve"> </w:t>
+      </w:r>
+      <w:r>
+        <w:t xml:space="preserve">differ by a factor of 3.3. The family therefore fixes both the estimate and what the experiment</w:t>
       </w:r>
       <w:r>
         <w:t xml:space="preserve"> </w:t>
@@ -3811,7 +4517,7 @@
         <w:pStyle w:val="BodyText"/>
       </w:pPr>
       <w:r>
-        <w:t xml:space="preserve">Scope is bounded and permanent. The panel holds 184,632 origins, but they come from six</w:t>
+        <w:t xml:space="preserve">Scope is bounded and permanent. The panel holds 181,829 origins, but they come from six</w:t>
       </w:r>
       <w:r>
         <w:t xml:space="preserve"> </w:t>
@@ -3924,8 +4630,8 @@
         <w:t xml:space="preserve">sessions would conceal that temporal-generalisation problem rather than solve it.</w:t>
       </w:r>
     </w:p>
-    <w:bookmarkEnd w:id="37"/>
-    <w:bookmarkStart w:id="39" w:name="Xd9cf52679672012faea4471d69d6db5ac4faf4b"/>
+    <w:bookmarkEnd w:id="38"/>
+    <w:bookmarkStart w:id="40" w:name="Xd9cf52679672012faea4471d69d6db5ac4faf4b"/>
     <w:p>
       <w:pPr>
         <w:pStyle w:val="Heading2"/>
@@ -3995,34 +4701,40 @@
         <w:t xml:space="preserve"> </w:t>
       </w:r>
       <w:r>
-        <w:t xml:space="preserve">a corrected shared LightGBM producer contract, and source-time PIT rules that fail closed</w:t>
-      </w:r>
-      <w:r>
-        <w:t xml:space="preserve"> </w:t>
-      </w:r>
-      <w:r>
-        <w:t xml:space="preserve">instead of claiming client latency they do not observe. The remaining PIT v2.2 blocker is</w:t>
-      </w:r>
-      <w:r>
-        <w:t xml:space="preserve"> </w:t>
-      </w:r>
-      <w:r>
-        <w:t xml:space="preserve">part of the result, not something concealed by a headline. Phase 8 remains unopened and</w:t>
-      </w:r>
-      <w:r>
-        <w:t xml:space="preserve"> </w:t>
-      </w:r>
-      <w:r>
-        <w:t xml:space="preserve">exploratory; Phase 9 continues to 60 as prospective future evidence while the capstone is</w:t>
-      </w:r>
-      <w:r>
-        <w:t xml:space="preserve"> </w:t>
-      </w:r>
-      <w:r>
-        <w:t xml:space="preserve">written and submitted from the evidence available at its editorial cutoff.</w:t>
-      </w:r>
-    </w:p>
-    <w:bookmarkStart w:id="38" w:name="Xebdc92d4acd8b8d67c9f3fe0f9867e95cc7704d"/>
+        <w:t xml:space="preserve">date-derived partition roles, one market-information cutoff, one XNYS expiry calendar and</w:t>
+      </w:r>
+      <w:r>
+        <w:t xml:space="preserve"> </w:t>
+      </w:r>
+      <w:r>
+        <w:t xml:space="preserve">source-time PIT rules that fail closed instead of claiming client latency they do not</w:t>
+      </w:r>
+      <w:r>
+        <w:t xml:space="preserve"> </w:t>
+      </w:r>
+      <w:r>
+        <w:t xml:space="preserve">observe. The remaining PIT v2.2 blocker is part of the result, not something concealed by</w:t>
+      </w:r>
+      <w:r>
+        <w:t xml:space="preserve"> </w:t>
+      </w:r>
+      <w:r>
+        <w:t xml:space="preserve">a headline. Phase 8 is complete and exploratory; Phase 9 continues to 60 as prospective</w:t>
+      </w:r>
+      <w:r>
+        <w:t xml:space="preserve"> </w:t>
+      </w:r>
+      <w:r>
+        <w:t xml:space="preserve">future evidence while the capstone is written and submitted from the evidence available at</w:t>
+      </w:r>
+      <w:r>
+        <w:t xml:space="preserve"> </w:t>
+      </w:r>
+      <w:r>
+        <w:t xml:space="preserve">its editorial cutoff.</w:t>
+      </w:r>
+    </w:p>
+    <w:bookmarkStart w:id="39" w:name="Xebdc92d4acd8b8d67c9f3fe0f9867e95cc7704d"/>
     <w:p>
       <w:pPr>
         <w:pStyle w:val="Heading3"/>
@@ -4180,9 +4892,9 @@
         <w:t xml:space="preserve">publication with the same prominence as a positive.</w:t>
       </w:r>
     </w:p>
-    <w:bookmarkEnd w:id="38"/>
     <w:bookmarkEnd w:id="39"/>
-    <w:bookmarkStart w:id="40" w:name="X05c252bb324b59d74213582a35bc1b53bba3933"/>
+    <w:bookmarkEnd w:id="40"/>
+    <w:bookmarkStart w:id="41" w:name="X05c252bb324b59d74213582a35bc1b53bba3933"/>
     <w:p>
       <w:pPr>
         <w:pStyle w:val="Heading2"/>
@@ -4235,8 +4947,8 @@
         <w:t xml:space="preserve">report.</w:t>
       </w:r>
     </w:p>
-    <w:bookmarkEnd w:id="40"/>
-    <w:bookmarkStart w:id="41" w:name="appendices"/>
+    <w:bookmarkEnd w:id="41"/>
+    <w:bookmarkStart w:id="42" w:name="appendices"/>
     <w:p>
       <w:pPr>
         <w:pStyle w:val="Heading2"/>
@@ -4358,7 +5070,7 @@
         <w:rPr>
           <w:rStyle w:val="VerbatimChar"/>
         </w:rPr>
-        <w:t xml:space="preserve">artifacts/rp2_v3/rp2-v3-20260827-remediation3/</w:t>
+        <w:t xml:space="preserve">artifacts/rp2_v3/rp2-v3-20260831-timing-role-remediation/</w:t>
       </w:r>
       <w:r>
         <w:t xml:space="preserve">:</w:t>
@@ -4421,8 +5133,8 @@
         <w:t xml:space="preserve">).</w:t>
       </w:r>
     </w:p>
-    <w:bookmarkEnd w:id="41"/>
     <w:bookmarkEnd w:id="42"/>
+    <w:bookmarkEnd w:id="43"/>
     <w:sectPr/>
   </w:body>
 </w:document>

</xml_diff>

<commit_message>
report RP2 factorial and Phase 8 sensitivity
</commit_message>
<xml_diff>
--- a/reports/final_report_draft_v2.docx
+++ b/reports/final_report_draft_v2.docx
@@ -106,7 +106,7 @@
         <w:rPr>
           <w:rStyle w:val="VerbatimChar"/>
         </w:rPr>
-        <w:t xml:space="preserve">rp2-v3-20260831-timing-role-remediation</w:t>
+        <w:t xml:space="preserve">rp2-v3-20260831-b1-spot-cutoff-remediation</w:t>
       </w:r>
       <w:r>
         <w:t xml:space="preserve"> </w:t>
@@ -121,7 +121,7 @@
         <w:rPr>
           <w:rStyle w:val="VerbatimChar"/>
         </w:rPr>
-        <w:t xml:space="preserve">7d544aa334b70ce8...</w:t>
+        <w:t xml:space="preserve">033f2eb6be35e5db...</w:t>
       </w:r>
       <w:r>
         <w:t xml:space="preserve">). It repairs partition-role assignment, aligns B0 with the</w:t>
@@ -130,7 +130,13 @@
         <w:t xml:space="preserve"> </w:t>
       </w:r>
       <w:r>
-        <w:t xml:space="preserve">documented 120-second B1/B2 cutoff and gives B1 the same XNYS expiry calendar as B2.</w:t>
+        <w:t xml:space="preserve">documented 120-second B1/B2 cutoff, gives B1 the same XNYS expiry calendar as B2,</w:t>
+      </w:r>
+      <w:r>
+        <w:t xml:space="preserve"> </w:t>
+      </w:r>
+      <w:r>
+        <w:t xml:space="preserve">and makes B1’s underlying spot obey its own option-quote cutoff.</w:t>
       </w:r>
       <w:r>
         <w:t xml:space="preserve"> </w:t>
@@ -370,13 +376,25 @@
         <w:t xml:space="preserve">DO_NOT_PURSUE</w:t>
       </w:r>
       <w:r>
-        <w:t xml:space="preserve">; Phase 8 places the positive contribution in the</w:t>
-      </w:r>
-      <w:r>
-        <w:t xml:space="preserve"> </w:t>
-      </w:r>
-      <w:r>
-        <w:t xml:space="preserve">B1 option-state block while every ΔB2|B1 interval crosses zero. In the retrospective run,</w:t>
+        <w:t xml:space="preserve">; the same-30-session Phase 8 remediation places</w:t>
+      </w:r>
+      <w:r>
+        <w:t xml:space="preserve"> </w:t>
+      </w:r>
+      <w:r>
+        <w:t xml:space="preserve">the positive contribution in the B1 option-state block while every ΔB2|B1 interval crosses</w:t>
+      </w:r>
+      <w:r>
+        <w:t xml:space="preserve"> </w:t>
+      </w:r>
+      <w:r>
+        <w:t xml:space="preserve">zero. It improves information-clock validity rather than absolute forecast score: only one</w:t>
+      </w:r>
+      <w:r>
+        <w:t xml:space="preserve"> </w:t>
+      </w:r>
+      <w:r>
+        <w:t xml:space="preserve">of eight B1-inclusive primary cells lowers paired QLIKE after correction. In the retrospective run,</w:t>
       </w:r>
       <w:r>
         <w:t xml:space="preserve"> </w:t>
@@ -424,7 +442,13 @@
         <w:t xml:space="preserve">MIXED_EXPLORATORY</w:t>
       </w:r>
       <w:r>
-        <w:t xml:space="preserve">; Phase 9 is an ongoing 60-session prospective</w:t>
+        <w:t xml:space="preserve">; an append-only post-hoc reconstruction uses</w:t>
+      </w:r>
+      <w:r>
+        <w:t xml:space="preserve"> </w:t>
+      </w:r>
+      <w:r>
+        <w:t xml:space="preserve">only those already materialized sessions and does not create a second read. Phase 9 is an ongoing 60-session prospective</w:t>
       </w:r>
       <w:r>
         <w:t xml:space="preserve"> </w:t>
@@ -440,7 +464,7 @@
       </w:r>
     </w:p>
     <w:bookmarkEnd w:id="21"/>
-    <w:bookmarkStart w:id="22" w:name="Xe3d0fc0bea9a42ce7605565d0964033d7f6ee47"/>
+    <w:bookmarkStart w:id="22" w:name="introduction"/>
     <w:p>
       <w:pPr>
         <w:pStyle w:val="Heading2"/>
@@ -548,7 +572,7 @@
         <w:t xml:space="preserve"> </w:t>
       </w:r>
       <w:r>
-        <w:t xml:space="preserve">researcher's data existed, in the form used, at the moment the forecast pretends to have</w:t>
+        <w:t xml:space="preserve">researcher’s data existed, in the form used, at the moment the forecast pretends to have</w:t>
       </w:r>
       <w:r>
         <w:t xml:space="preserve"> </w:t>
@@ -775,7 +799,7 @@
       </w:r>
     </w:p>
     <w:bookmarkEnd w:id="22"/>
-    <w:bookmarkStart w:id="23" w:name="Xe6f33f15488280d70f3858ac5d64bf720282e0a"/>
+    <w:bookmarkStart w:id="23" w:name="literature-review"/>
     <w:p>
       <w:pPr>
         <w:pStyle w:val="Heading2"/>
@@ -815,7 +839,7 @@
         <w:t xml:space="preserve"> </w:t>
       </w:r>
       <w:r>
-        <w:t xml:space="preserve">verified in the project's evidence ledger (</w:t>
+        <w:t xml:space="preserve">verified in the project’s evidence ledger (</w:t>
       </w:r>
       <w:r>
         <w:rPr>
@@ -898,7 +922,7 @@
         <w:t xml:space="preserve"> </w:t>
       </w:r>
       <w:r>
-        <w:t xml:space="preserve">the predictor set is limited. This project's results agree with the strand. Once the</w:t>
+        <w:t xml:space="preserve">the predictor set is limited. This project’s results agree with the strand. Once the</w:t>
       </w:r>
       <w:r>
         <w:t xml:space="preserve"> </w:t>
@@ -1008,7 +1032,7 @@
         <w:t xml:space="preserve"> </w:t>
       </w:r>
       <w:r>
-        <w:t xml:space="preserve">strand's evidence is rarely conditioned on rich lagged intraday realised variance and is</w:t>
+        <w:t xml:space="preserve">strand’s evidence is rarely conditioned on rich lagged intraday realised variance and is</w:t>
       </w:r>
       <w:r>
         <w:t xml:space="preserve"> </w:t>
@@ -1040,7 +1064,7 @@
         <w:t xml:space="preserve"> </w:t>
       </w:r>
       <w:r>
-        <w:t xml:space="preserve">B2 without licensing a claim about trader intent. The ledger's anchor for the modern</w:t>
+        <w:t xml:space="preserve">B2 without licensing a claim about trader intent. The ledger’s anchor for the modern</w:t>
       </w:r>
       <w:r>
         <w:t xml:space="preserve"> </w:t>
@@ -1064,7 +1088,7 @@
         <w:t xml:space="preserve"> </w:t>
       </w:r>
       <w:r>
-        <w:t xml:space="preserve">realised variance, and it must never be used to infer trader intent from this project's</w:t>
+        <w:t xml:space="preserve">realised variance, and it must never be used to infer trader intent from this project’s</w:t>
       </w:r>
       <w:r>
         <w:t xml:space="preserve"> </w:t>
@@ -1156,7 +1180,7 @@
         <w:t xml:space="preserve"> </w:t>
       </w:r>
       <w:r>
-        <w:t xml:space="preserve">single verdict and never treats one family's increment as the study's answer.</w:t>
+        <w:t xml:space="preserve">single verdict and never treats one family’s increment as the study’s answer.</w:t>
       </w:r>
     </w:p>
     <w:p>
@@ -1266,7 +1290,7 @@
       </w:r>
     </w:p>
     <w:bookmarkEnd w:id="23"/>
-    <w:bookmarkStart w:id="24" w:name="X88d3c05de5ae6f586c370a9175780f937e6a3ca"/>
+    <w:bookmarkStart w:id="24" w:name="data-and-point-in-time-discipline"/>
     <w:p>
       <w:pPr>
         <w:pStyle w:val="Heading2"/>
@@ -1378,7 +1402,7 @@
         <w:t xml:space="preserve"> </w:t>
       </w:r>
       <w:r>
-        <w:t xml:space="preserve">quarter of what is being predicted is the estimator's own sampling error.</w:t>
+        <w:t xml:space="preserve">quarter of what is being predicted is the estimator’s own sampling error.</w:t>
       </w:r>
     </w:p>
     <w:p>
@@ -1454,7 +1478,7 @@
         <w:pStyle w:val="BodyText"/>
       </w:pPr>
       <w:r>
-        <w:t xml:space="preserve">The availability evidence is asymmetric. The bar-label audit supports the project's</w:t>
+        <w:t xml:space="preserve">The availability evidence is asymmetric. The bar-label audit supports the project’s</w:t>
       </w:r>
       <w:r>
         <w:t xml:space="preserve"> </w:t>
@@ -1723,7 +1747,7 @@
       </w:r>
     </w:p>
     <w:bookmarkEnd w:id="24"/>
-    <w:bookmarkStart w:id="30" w:name="X4e0404407b2823f6ed5ea6a6c1651c2e996b033"/>
+    <w:bookmarkStart w:id="30" w:name="methodology"/>
     <w:p>
       <w:pPr>
         <w:pStyle w:val="Heading2"/>
@@ -1732,7 +1756,7 @@
         <w:t xml:space="preserve">4. Methodology</w:t>
       </w:r>
     </w:p>
-    <w:bookmarkStart w:id="25" w:name="Xff0e1f0668c26b247076b911ef7c636c72af8da"/>
+    <w:bookmarkStart w:id="25" w:name="X8c509025c233396d6e0f298295af628987bdea6"/>
     <w:p>
       <w:pPr>
         <w:pStyle w:val="Heading3"/>
@@ -1892,7 +1916,7 @@
       </w:r>
     </w:p>
     <w:bookmarkEnd w:id="25"/>
-    <w:bookmarkStart w:id="26" w:name="X76513c88b3f4daa5a07ec59e2c2d1ff56ef8ea8"/>
+    <w:bookmarkStart w:id="26" w:name="the-loss-and-why-it-was-frozen"/>
     <w:p>
       <w:pPr>
         <w:pStyle w:val="Heading3"/>
@@ -2008,7 +2032,7 @@
       </w:r>
     </w:p>
     <w:bookmarkEnd w:id="26"/>
-    <w:bookmarkStart w:id="27" w:name="X6cc6d68366d4592ab37c1d1116ff91da64e0e7e"/>
+    <w:bookmarkStart w:id="27" w:name="preregistration-and-one-read-gates"/>
     <w:p>
       <w:pPr>
         <w:pStyle w:val="Heading3"/>
@@ -2159,17 +2183,17 @@
         <w:t xml:space="preserve"> </w:t>
       </w:r>
       <w:r>
-        <w:t xml:space="preserve">one-shot execution still requires separate written authorisation. At this report's</w:t>
-      </w:r>
-      <w:r>
-        <w:t xml:space="preserve"> </w:t>
-      </w:r>
-      <w:r>
-        <w:t xml:space="preserve">evidence cutoff no Phase 8 payload had been opened, so no outcome is inferred or inserted.</w:t>
+        <w:t xml:space="preserve">separate written authorisation was consumed on 2026-08-30; the outcome and subsequent</w:t>
+      </w:r>
+      <w:r>
+        <w:t xml:space="preserve"> </w:t>
+      </w:r>
+      <w:r>
+        <w:t xml:space="preserve">same-session remediation sensitivity are reported in Section 5.2.</w:t>
       </w:r>
     </w:p>
     <w:bookmarkEnd w:id="27"/>
-    <w:bookmarkStart w:id="28" w:name="X7aee7f27383de7462890a494973a18014812083"/>
+    <w:bookmarkStart w:id="28" w:name="session-level-inference"/>
     <w:p>
       <w:pPr>
         <w:pStyle w:val="Heading3"/>
@@ -2225,7 +2249,7 @@
         <w:t xml:space="preserve"> </w:t>
       </w:r>
       <w:r>
-        <w:t xml:space="preserve">Hansen's test of superior predictive ability. A bootstrap interval wholly inside one per</w:t>
+        <w:t xml:space="preserve">Hansen’s test of superior predictive ability. A bootstrap interval wholly inside one per</w:t>
       </w:r>
       <w:r>
         <w:t xml:space="preserve"> </w:t>
@@ -2237,7 +2261,7 @@
         <w:t xml:space="preserve"> </w:t>
       </w:r>
       <w:r>
-        <w:t xml:space="preserve">implementation does not perform TOST or establish formal equivalence. Holm's correction is applied within each</w:t>
+        <w:t xml:space="preserve">implementation does not perform TOST or establish formal equivalence. Holm’s correction is applied within each</w:t>
       </w:r>
       <w:r>
         <w:t xml:space="preserve"> </w:t>
@@ -2249,7 +2273,7 @@
         <w:t xml:space="preserve"> </w:t>
       </w:r>
       <w:r>
-        <w:t xml:space="preserve">family the scientific question defines. The earlier programme's global Holm correction is</w:t>
+        <w:t xml:space="preserve">family the scientific question defines. The earlier programme’s global Holm correction is</w:t>
       </w:r>
       <w:r>
         <w:t xml:space="preserve"> </w:t>
@@ -2269,29 +2293,29 @@
         <w:pStyle w:val="BodyText"/>
       </w:pPr>
       <w:r>
-        <w:t xml:space="preserve">Interval calibration is measured. Resampling blocks from the centred series and rerunning</w:t>
-      </w:r>
-      <w:r>
-        <w:t xml:space="preserve"> </w:t>
-      </w:r>
-      <w:r>
-        <w:t xml:space="preserve">the production bootstrap gives an empirical coverage of 0.784 against a nominal 0.95 for</w:t>
-      </w:r>
-      <w:r>
-        <w:t xml:space="preserve"> </w:t>
-      </w:r>
-      <w:r>
-        <w:t xml:space="preserve">the one validation interval that excludes zero, and it is reported accordingly: the</w:t>
-      </w:r>
-      <w:r>
-        <w:t xml:space="preserve"> </w:t>
-      </w:r>
-      <w:r>
-        <w:t xml:space="preserve">finding survives in sign, its confidence does not.</w:t>
+        <w:t xml:space="preserve">Interval calibration remains an explicit threat. The current run did not repeat the</w:t>
+      </w:r>
+      <w:r>
+        <w:t xml:space="preserve"> </w:t>
+      </w:r>
+      <w:r>
+        <w:t xml:space="preserve">separate empirical-coverage experiment, so this report does not transfer its historical</w:t>
+      </w:r>
+      <w:r>
+        <w:t xml:space="preserve"> </w:t>
+      </w:r>
+      <w:r>
+        <w:t xml:space="preserve">0.784 estimate to the replacement intervals. Every validation interval reported in §5.1</w:t>
+      </w:r>
+      <w:r>
+        <w:t xml:space="preserve"> </w:t>
+      </w:r>
+      <w:r>
+        <w:t xml:space="preserve">crosses zero; no current validation claim relies on interval exclusion.</w:t>
       </w:r>
     </w:p>
     <w:bookmarkEnd w:id="28"/>
-    <w:bookmarkStart w:id="29" w:name="Xe336cab0df9cd0f26dd748a4ae2db52738b6cbb"/>
+    <w:bookmarkStart w:id="29" w:name="power-declared-per-contrast"/>
     <w:p>
       <w:pPr>
         <w:pStyle w:val="Heading3"/>
@@ -2452,7 +2476,7 @@
     </w:p>
     <w:bookmarkEnd w:id="29"/>
     <w:bookmarkEnd w:id="30"/>
-    <w:bookmarkStart w:id="36" w:name="Xf008beceec6d1c3a3c616f37281fffb37cae0fa"/>
+    <w:bookmarkStart w:id="36" w:name="results"/>
     <w:p>
       <w:pPr>
         <w:pStyle w:val="Heading2"/>
@@ -2469,7 +2493,7 @@
         <w:t xml:space="preserve">The order below is binding (decision 53).</w:t>
       </w:r>
     </w:p>
-    <w:bookmarkStart w:id="31" w:name="X17e55a6c5d239cbdcb378efa322270bfeb3194f"/>
+    <w:bookmarkStart w:id="31" w:name="retrospective-results"/>
     <w:p>
       <w:pPr>
         <w:pStyle w:val="Heading3"/>
@@ -2492,7 +2516,7 @@
         <w:rPr>
           <w:rStyle w:val="VerbatimChar"/>
         </w:rPr>
-        <w:t xml:space="preserve">rp2-v3-20260831-timing-role-remediation</w:t>
+        <w:t xml:space="preserve">rp2-v3-20260831-b1-spot-cutoff-remediation</w:t>
       </w:r>
       <w:r>
         <w:t xml:space="preserve"> </w:t>
@@ -2507,28 +2531,28 @@
         <w:rPr>
           <w:rStyle w:val="VerbatimChar"/>
         </w:rPr>
-        <w:t xml:space="preserve">7d544aa334b70ce8...</w:t>
-      </w:r>
-      <w:r>
-        <w:t xml:space="preserve">, code</w:t>
-      </w:r>
-      <w:r>
-        <w:t xml:space="preserve"> </w:t>
-      </w:r>
-      <w:r>
-        <w:t xml:space="preserve">commit</w:t>
-      </w:r>
-      <w:r>
-        <w:t xml:space="preserve"> </w:t>
-      </w:r>
-      <w:r>
-        <w:rPr>
-          <w:rStyle w:val="VerbatimChar"/>
-        </w:rPr>
-        <w:t xml:space="preserve">cbdd0b5840da</w:t>
-      </w:r>
-      <w:r>
-        <w:t xml:space="preserve">). It covers the two disjoint calendar roles frozen in §3 — discovery</w:t>
+        <w:t xml:space="preserve">033f2eb6be35e5db...</w:t>
+      </w:r>
+      <w:r>
+        <w:t xml:space="preserve">, code commit</w:t>
+      </w:r>
+      <w:r>
+        <w:t xml:space="preserve"> </w:t>
+      </w:r>
+      <w:r>
+        <w:rPr>
+          <w:rStyle w:val="VerbatimChar"/>
+        </w:rPr>
+        <w:t xml:space="preserve">b70c54ba14fd</w:t>
+      </w:r>
+      <w:r>
+        <w:t xml:space="preserve">). It covers the two disjoint calendar</w:t>
+      </w:r>
+      <w:r>
+        <w:t xml:space="preserve"> </w:t>
+      </w:r>
+      <w:r>
+        <w:t xml:space="preserve">roles frozen in §3 — discovery</w:t>
       </w:r>
       <w:r>
         <w:t xml:space="preserve"> </w:t>
@@ -2552,7 +2576,7 @@
         <w:t xml:space="preserve"> </w:t>
       </w:r>
       <w:r>
-        <w:t xml:space="preserve">information set minus the loss of the larger one. Seven deltas are positive and seven</w:t>
+        <w:t xml:space="preserve">information set minus the loss of the larger one. Eight deltas are positive and nine</w:t>
       </w:r>
       <w:r>
         <w:t xml:space="preserve"> </w:t>
@@ -2578,7 +2602,7 @@
         <w:pStyle w:val="BodyText"/>
       </w:pPr>
       <w:r>
-        <w:t xml:space="preserve">In discovery ΔB1 is +0.00258 for</w:t>
+        <w:t xml:space="preserve">In discovery ΔB1 is +0.00256 for</w:t>
       </w:r>
       <w:r>
         <w:t xml:space="preserve"> </w:t>
@@ -2593,13 +2617,13 @@
         <w:t xml:space="preserve"> </w:t>
       </w:r>
       <w:r>
-        <w:t xml:space="preserve">(95 percent interval [+0.00102,</w:t>
-      </w:r>
-      <w:r>
-        <w:t xml:space="preserve"> </w:t>
-      </w:r>
-      <w:r>
-        <w:t xml:space="preserve">+0.00418]), +0.00288 for</w:t>
+        <w:t xml:space="preserve">(95 percent interval [+0.00100,</w:t>
+      </w:r>
+      <w:r>
+        <w:t xml:space="preserve"> </w:t>
+      </w:r>
+      <w:r>
+        <w:t xml:space="preserve">+0.00417]), +0.00287 for</w:t>
       </w:r>
       <w:r>
         <w:t xml:space="preserve"> </w:t>
@@ -2614,7 +2638,7 @@
         <w:t xml:space="preserve"> </w:t>
       </w:r>
       <w:r>
-        <w:t xml:space="preserve">([+0.00154, +0.00438]) and +0.00267 for</w:t>
+        <w:t xml:space="preserve">([+0.00153, +0.00437]) and +0.00320 for</w:t>
       </w:r>
       <w:r>
         <w:t xml:space="preserve"> </w:t>
@@ -2629,7 +2653,7 @@
         <w:t xml:space="preserve"> </w:t>
       </w:r>
       <w:r>
-        <w:t xml:space="preserve">([+0.00060, +0.00519]). All three intervals exclude zero, but their</w:t>
+        <w:t xml:space="preserve">([+0.00106, +0.00590]). All three intervals exclude zero, but their</w:t>
       </w:r>
       <w:r>
         <w:t xml:space="preserve"> </w:t>
@@ -2649,7 +2673,7 @@
         <w:pStyle w:val="BodyText"/>
       </w:pPr>
       <w:r>
-        <w:t xml:space="preserve">Validation does not establish replication. ΔB1 is −0.00152 for</w:t>
+        <w:t xml:space="preserve">Validation does not establish replication. ΔB1 is −0.00150 for</w:t>
       </w:r>
       <w:r>
         <w:t xml:space="preserve"> </w:t>
@@ -2664,7 +2688,7 @@
         <w:t xml:space="preserve"> </w:t>
       </w:r>
       <w:r>
-        <w:t xml:space="preserve">([−0.00500, +0.00223]), −0.00092 for</w:t>
+        <w:t xml:space="preserve">([−0.00511, +0.00224]), −0.00088 for</w:t>
       </w:r>
       <w:r>
         <w:t xml:space="preserve"> </w:t>
@@ -2679,7 +2703,7 @@
         <w:t xml:space="preserve"> </w:t>
       </w:r>
       <w:r>
-        <w:t xml:space="preserve">([−0.00318, +0.00148]) and +0.00136</w:t>
+        <w:t xml:space="preserve">([−0.00315, +0.00156]) and +0.00280</w:t>
       </w:r>
       <w:r>
         <w:t xml:space="preserve"> </w:t>
@@ -2700,7 +2724,7 @@
         <w:t xml:space="preserve"> </w:t>
       </w:r>
       <w:r>
-        <w:t xml:space="preserve">([−0.00548, +0.00819]); every interval contains zero. B0 QLIKE also</w:t>
+        <w:t xml:space="preserve">([−0.00518, +0.01030]); every interval contains zero. B0 QLIKE also</w:t>
       </w:r>
       <w:r>
         <w:t xml:space="preserve"> </w:t>
@@ -2747,7 +2771,7 @@
         <w:t xml:space="preserve"> </w:t>
       </w:r>
       <w:r>
-        <w:t xml:space="preserve">ΔB2|B1 is +0.00018 for</w:t>
+        <w:t xml:space="preserve">ΔB2|B1 is +0.00012 for</w:t>
       </w:r>
       <w:r>
         <w:t xml:space="preserve"> </w:t>
@@ -2774,7 +2798,7 @@
         <w:t xml:space="preserve"> </w:t>
       </w:r>
       <w:r>
-        <w:t xml:space="preserve">and +0.00096 for</w:t>
+        <w:t xml:space="preserve">and +0.00052 for</w:t>
       </w:r>
       <w:r>
         <w:t xml:space="preserve"> </w:t>
@@ -2786,25 +2810,19 @@
         <w:t xml:space="preserve">lightgbm_qlike</w:t>
       </w:r>
       <w:r>
-        <w:t xml:space="preserve">; in validation it is −0.00272, −0.00251 and −0.00202. Three of the six</w:t>
-      </w:r>
-      <w:r>
-        <w:t xml:space="preserve"> </w:t>
-      </w:r>
-      <w:r>
-        <w:t xml:space="preserve">family-role pairs are negative. The discovery LightGBM interval excludes zero on the</w:t>
-      </w:r>
-      <w:r>
-        <w:t xml:space="preserve"> </w:t>
-      </w:r>
-      <w:r>
-        <w:t xml:space="preserve">positive side and the validation gamma interval excludes zero on the adverse side; the</w:t>
-      </w:r>
-      <w:r>
-        <w:t xml:space="preserve"> </w:t>
-      </w:r>
-      <w:r>
-        <w:t xml:space="preserve">other four cross zero. The small smooth-family development estimates are compatible with</w:t>
+        <w:t xml:space="preserve">; in validation it is −0.00264, −0.00250 and +0.00198. Two of the six</w:t>
+      </w:r>
+      <w:r>
+        <w:t xml:space="preserve"> </w:t>
+      </w:r>
+      <w:r>
+        <w:t xml:space="preserve">family-role pairs are negative, and all six intervals cross zero. The small smooth-family</w:t>
+      </w:r>
+      <w:r>
+        <w:t xml:space="preserve"> </w:t>
+      </w:r>
+      <w:r>
+        <w:t xml:space="preserve">development estimates are compatible with</w:t>
       </w:r>
       <w:r>
         <w:t xml:space="preserve"> </w:t>
@@ -2830,49 +2848,118 @@
         <w:pStyle w:val="BodyText"/>
       </w:pPr>
       <w:r>
-        <w:t xml:space="preserve">The current run repairs three result-changing defects jointly. It derives bar roles from</w:t>
-      </w:r>
-      <w:r>
-        <w:t xml:space="preserve"> </w:t>
-      </w:r>
-      <w:r>
-        <w:t xml:space="preserve">partition dates instead of trusting file literals; shifts every B0 predictor, market</w:t>
-      </w:r>
-      <w:r>
-        <w:t xml:space="preserve"> </w:t>
-      </w:r>
-      <w:r>
-        <w:t xml:space="preserve">control and volatility state back three one-minute bars so B0 shares the documented</w:t>
-      </w:r>
-      <w:r>
-        <w:t xml:space="preserve"> </w:t>
-      </w:r>
-      <w:r>
-        <w:t xml:space="preserve">120-second B1/B2 cutoff; and gives B1 the XNYS expiry-close calendar already used by B2.</w:t>
-      </w:r>
-      <w:r>
-        <w:t xml:space="preserve"> </w:t>
-      </w:r>
-      <w:r>
-        <w:t xml:space="preserve">The common panel falls from 184,632 to 181,829 origins. These changes move discovery ΔB1</w:t>
-      </w:r>
-      <w:r>
-        <w:t xml:space="preserve"> </w:t>
-      </w:r>
-      <w:r>
-        <w:t xml:space="preserve">from +0.00219, +0.00229 and +0.00253 to the values above; validation moves from −0.00113,</w:t>
-      </w:r>
-      <w:r>
-        <w:t xml:space="preserve"> </w:t>
-      </w:r>
-      <w:r>
-        <w:t xml:space="preserve">−0.00083 and +0.00211. Because the rebuild changes all three defects together, it is not</w:t>
-      </w:r>
-      <w:r>
-        <w:t xml:space="preserve"> </w:t>
-      </w:r>
-      <w:r>
-        <w:t xml:space="preserve">an ablation and does not assign each movement to one repair.</w:t>
+        <w:t xml:space="preserve">The current run preserves three result-changing repairs: bar roles are derived from</w:t>
+      </w:r>
+      <w:r>
+        <w:t xml:space="preserve"> </w:t>
+      </w:r>
+      <w:r>
+        <w:t xml:space="preserve">partition dates instead of trusted file literals; every B0 predictor, market control and</w:t>
+      </w:r>
+      <w:r>
+        <w:t xml:space="preserve"> </w:t>
+      </w:r>
+      <w:r>
+        <w:t xml:space="preserve">volatility state is shifted back three one-minute bars to share the documented 120-second</w:t>
+      </w:r>
+      <w:r>
+        <w:t xml:space="preserve"> </w:t>
+      </w:r>
+      <w:r>
+        <w:t xml:space="preserve">B1/B2 cutoff; and B1 uses the XNYS expiry-close calendar already used by B2. Adversarial</w:t>
+      </w:r>
+      <w:r>
+        <w:t xml:space="preserve"> </w:t>
+      </w:r>
+      <w:r>
+        <w:t xml:space="preserve">follow-up found a fourth defect: B1 option rows stopped at</w:t>
+      </w:r>
+      <w:r>
+        <w:t xml:space="preserve"> </w:t>
+      </w:r>
+      <w:r>
+        <w:rPr>
+          <w:rStyle w:val="VerbatimChar"/>
+        </w:rPr>
+        <w:t xml:space="preserve">t−120 s</w:t>
+      </w:r>
+      <w:r>
+        <w:t xml:space="preserve">, but parity,</w:t>
+      </w:r>
+      <w:r>
+        <w:t xml:space="preserve"> </w:t>
+      </w:r>
+      <w:r>
+        <w:t xml:space="preserve">moneyness and delta used</w:t>
+      </w:r>
+      <w:r>
+        <w:t xml:space="preserve"> </w:t>
+      </w:r>
+      <w:r>
+        <w:rPr>
+          <w:rStyle w:val="VerbatimChar"/>
+        </w:rPr>
+        <w:t xml:space="preserve">close[m]</w:t>
+      </w:r>
+      <w:r>
+        <w:t xml:space="preserve">, which ends at</w:t>
+      </w:r>
+      <w:r>
+        <w:t xml:space="preserve"> </w:t>
+      </w:r>
+      <w:r>
+        <w:rPr>
+          <w:rStyle w:val="VerbatimChar"/>
+        </w:rPr>
+        <w:t xml:space="preserve">t+60 s</w:t>
+      </w:r>
+      <w:r>
+        <w:t xml:space="preserve"> </w:t>
+      </w:r>
+      <w:r>
+        <w:t xml:space="preserve">for start-labelled bars. The</w:t>
+      </w:r>
+      <w:r>
+        <w:t xml:space="preserve"> </w:t>
+      </w:r>
+      <w:r>
+        <w:t xml:space="preserve">current run uses</w:t>
+      </w:r>
+      <w:r>
+        <w:t xml:space="preserve"> </w:t>
+      </w:r>
+      <w:r>
+        <w:rPr>
+          <w:rStyle w:val="VerbatimChar"/>
+        </w:rPr>
+        <w:t xml:space="preserve">close[m−3]</w:t>
+      </w:r>
+      <w:r>
+        <w:t xml:space="preserve">, the last underlying close admissible at the option cutoff.</w:t>
+      </w:r>
+      <w:r>
+        <w:t xml:space="preserve"> </w:t>
+      </w:r>
+      <w:r>
+        <w:t xml:space="preserve">It keeps the immediately prior run’s 181,829-row panel membership. Relative to that run,</w:t>
+      </w:r>
+      <w:r>
+        <w:t xml:space="preserve"> </w:t>
+      </w:r>
+      <w:r>
+        <w:t xml:space="preserve">discovery ΔB1 moves from +0.00258, +0.00288 and +0.00267 to the values above; validation</w:t>
+      </w:r>
+      <w:r>
+        <w:t xml:space="preserve"> </w:t>
+      </w:r>
+      <w:r>
+        <w:t xml:space="preserve">moves from −0.00152, −0.00092 and +0.00136. This before/after isolates the spot-input</w:t>
+      </w:r>
+      <w:r>
+        <w:t xml:space="preserve"> </w:t>
+      </w:r>
+      <w:r>
+        <w:t xml:space="preserve">correction at the pipeline level, but does not decompose individual B1 feature movements.</w:t>
       </w:r>
     </w:p>
     <w:p>
@@ -2886,7 +2973,7 @@
         <w:t xml:space="preserve"> </w:t>
       </w:r>
       <w:r>
-        <w:t xml:space="preserve">validation MDEs are 0.00496 for</w:t>
+        <w:t xml:space="preserve">validation MDEs are 0.00506 for</w:t>
       </w:r>
       <w:r>
         <w:t xml:space="preserve"> </w:t>
@@ -2898,7 +2985,7 @@
         <w:t xml:space="preserve">gamma_glm</w:t>
       </w:r>
       <w:r>
-        <w:t xml:space="preserve">, 0.00311 for</w:t>
+        <w:t xml:space="preserve">, 0.00315 for</w:t>
       </w:r>
       <w:r>
         <w:t xml:space="preserve"> </w:t>
@@ -2913,7 +3000,7 @@
         <w:t xml:space="preserve"> </w:t>
       </w:r>
       <w:r>
-        <w:t xml:space="preserve">and 0.01037 for</w:t>
+        <w:t xml:space="preserve">and 0.01198 for</w:t>
       </w:r>
       <w:r>
         <w:t xml:space="preserve"> </w:t>
@@ -2925,19 +3012,19 @@
         <w:t xml:space="preserve">lightgbm_qlike</w:t>
       </w:r>
       <w:r>
-        <w:t xml:space="preserve">, against discovery ΔB1 estimates of 0.00258, 0.00288 and 0.00267.</w:t>
-      </w:r>
-      <w:r>
-        <w:t xml:space="preserve"> </w:t>
-      </w:r>
-      <w:r>
-        <w:t xml:space="preserve">Approximate session requirements under the same exploratory α = 0.05 contract are 119,</w:t>
-      </w:r>
-      <w:r>
-        <w:t xml:space="preserve"> </w:t>
-      </w:r>
-      <w:r>
-        <w:t xml:space="preserve">38 and 484. They are not requirements computed under the separate 0.00417 future</w:t>
+        <w:t xml:space="preserve">, against discovery ΔB1 estimates of 0.00256, 0.00287 and 0.00320.</w:t>
+      </w:r>
+      <w:r>
+        <w:t xml:space="preserve"> </w:t>
+      </w:r>
+      <w:r>
+        <w:t xml:space="preserve">Approximate session requirements under the same exploratory α = 0.05 contract are 125,</w:t>
+      </w:r>
+      <w:r>
+        <w:t xml:space="preserve"> </w:t>
+      </w:r>
+      <w:r>
+        <w:t xml:space="preserve">39 and 449. They are not requirements computed under the separate 0.00417 future</w:t>
       </w:r>
       <w:r>
         <w:t xml:space="preserve"> </w:t>
@@ -2985,7 +3072,7 @@
       </w:r>
     </w:p>
     <w:bookmarkEnd w:id="31"/>
-    <w:bookmarkStart w:id="32" w:name="X925c5b771554b707740b4e1d8936d66bcd73337"/>
+    <w:bookmarkStart w:id="32" w:name="X4b0c7dd96a35a6ebc21e415db0060c2b124e47d"/>
     <w:p>
       <w:pPr>
         <w:pStyle w:val="Heading3"/>
@@ -3017,31 +3104,34 @@
         <w:t xml:space="preserve">MIXED_EXPLORATORY</w:t>
       </w:r>
       <w:r>
-        <w:t xml:space="preserve">, descriptive and non-confirmatory. In the primary window all four ΔB1</w:t>
-      </w:r>
-      <w:r>
-        <w:t xml:space="preserve"> </w:t>
-      </w:r>
-      <w:r>
-        <w:t xml:space="preserve">estimates are positive; three of four descriptive Holm p-values are below 0.05. For</w:t>
-      </w:r>
-      <w:r>
-        <w:t xml:space="preserve"> </w:t>
-      </w:r>
-      <w:r>
-        <w:t xml:space="preserve">ΔB2 conditional on B1, all four intervals cross zero and every Holm p-value exceeds 0.39.</w:t>
-      </w:r>
-      <w:r>
-        <w:t xml:space="preserve"> </w:t>
-      </w:r>
-      <w:r>
-        <w:t xml:space="preserve">The positive prospective contribution is therefore concentrated in the B1 option-state</w:t>
-      </w:r>
-      <w:r>
-        <w:t xml:space="preserve"> </w:t>
-      </w:r>
-      <w:r>
-        <w:t xml:space="preserve">block, not established in B2 flow.</w:t>
+        <w:t xml:space="preserve">, descriptive and non-confirmatory. The first post-cutoff audit replayed</w:t>
+      </w:r>
+      <w:r>
+        <w:t xml:space="preserve"> </w:t>
+      </w:r>
+      <w:r>
+        <w:t xml:space="preserve">the historical forecast cube exactly, but that cube contains forecasts rather than B0/B1</w:t>
+      </w:r>
+      <w:r>
+        <w:t xml:space="preserve"> </w:t>
+      </w:r>
+      <w:r>
+        <w:t xml:space="preserve">feature rows and therefore could not incorporate the corrected</w:t>
+      </w:r>
+      <w:r>
+        <w:t xml:space="preserve"> </w:t>
+      </w:r>
+      <w:r>
+        <w:rPr>
+          <w:rStyle w:val="VerbatimChar"/>
+        </w:rPr>
+        <w:t xml:space="preserve">t−120s</w:t>
+      </w:r>
+      <w:r>
+        <w:t xml:space="preserve"> </w:t>
+      </w:r>
+      <w:r>
+        <w:t xml:space="preserve">underlying clock.</w:t>
       </w:r>
     </w:p>
     <w:p>
@@ -3049,47 +3139,148 @@
         <w:pStyle w:val="BodyText"/>
       </w:pPr>
       <w:r>
-        <w:t xml:space="preserve">The append-only dispersion audit replays all 20 primary contrast rows and all 140 published</w:t>
-      </w:r>
-      <w:r>
-        <w:t xml:space="preserve"> </w:t>
-      </w:r>
-      <w:r>
-        <w:t xml:space="preserve">fields exactly from the materialised cube, without reopening the sealed store or running a</w:t>
-      </w:r>
-      <w:r>
-        <w:t xml:space="preserve"> </w:t>
-      </w:r>
-      <w:r>
-        <w:t xml:space="preserve">second evaluator. It finds no aggregation change. The read count is Phase 8 = 1; the full</w:t>
-      </w:r>
-      <w:r>
-        <w:t xml:space="preserve"> </w:t>
-      </w:r>
-      <w:r>
-        <w:t xml:space="preserve">cells, asymmetric intervals, descriptive Holm values, recovery boundary and frozen</w:t>
-      </w:r>
-      <w:r>
-        <w:t xml:space="preserve"> </w:t>
-      </w:r>
-      <w:r>
-        <w:t xml:space="preserve">producer closure are reported in</w:t>
-      </w:r>
-      <w:r>
-        <w:t xml:space="preserve"> </w:t>
-      </w:r>
-      <w:r>
-        <w:rPr>
-          <w:rStyle w:val="VerbatimChar"/>
-        </w:rPr>
-        <w:t xml:space="preserve">reports/phase8a_exploratory_bridge_addendum_v11.md</w:t>
+        <w:t xml:space="preserve">The project subsequently rebuilt and rescored the same thirty already materialized</w:t>
+      </w:r>
+      <w:r>
+        <w:t xml:space="preserve"> </w:t>
+      </w:r>
+      <w:r>
+        <w:t xml:space="preserve">sessions under a precommitted, append-only post-hoc remediation. It collected zero new</w:t>
+      </w:r>
+      <w:r>
+        <w:t xml:space="preserve"> </w:t>
+      </w:r>
+      <w:r>
+        <w:t xml:space="preserve">sessions, reopened no sealed store and left the canonical one-shot read count at one. The</w:t>
+      </w:r>
+      <w:r>
+        <w:t xml:space="preserve"> </w:t>
+      </w:r>
+      <w:r>
+        <w:t xml:space="preserve">corrected grid has 11,700 origins versus 11,875 historically: 175</w:t>
+      </w:r>
+      <w:r>
+        <w:t xml:space="preserve"> </w:t>
+      </w:r>
+      <w:r>
+        <w:rPr>
+          <w:rStyle w:val="VerbatimChar"/>
+        </w:rPr>
+        <w:t xml:space="preserve">origin_minute = 30</w:t>
+      </w:r>
+      <w:r>
+        <w:t xml:space="preserve"> </w:t>
+      </w:r>
+      <w:r>
+        <w:t xml:space="preserve">rows are no longer admissible because a full trailing thirty-minute B0 window does not</w:t>
+      </w:r>
+      <w:r>
+        <w:t xml:space="preserve"> </w:t>
+      </w:r>
+      <w:r>
+        <w:t xml:space="preserve">exist at the</w:t>
+      </w:r>
+      <w:r>
+        <w:t xml:space="preserve"> </w:t>
+      </w:r>
+      <w:r>
+        <w:rPr>
+          <w:rStyle w:val="VerbatimChar"/>
+        </w:rPr>
+        <w:t xml:space="preserve">t−120s</w:t>
+      </w:r>
+      <w:r>
+        <w:t xml:space="preserve"> </w:t>
+      </w:r>
+      <w:r>
+        <w:t xml:space="preserve">cutoff. B1’s minimum core-feature finite coverage is</w:t>
+      </w:r>
+      <w:r>
+        <w:t xml:space="preserve"> </w:t>
+      </w:r>
+      <w:r>
+        <w:t xml:space="preserve">11,664/11,700 = 99.6923%, while all twelve B2 core features are 100% finite; the B2 core</w:t>
+      </w:r>
+      <w:r>
+        <w:t xml:space="preserve"> </w:t>
+      </w:r>
+      <w:r>
+        <w:t xml:space="preserve">values and</w:t>
+      </w:r>
+      <w:r>
+        <w:t xml:space="preserve"> </w:t>
+      </w:r>
+      <w:r>
+        <w:rPr>
+          <w:rStyle w:val="VerbatimChar"/>
+        </w:rPr>
+        <w:t xml:space="preserve">rv30</w:t>
+      </w:r>
+      <w:r>
+        <w:t xml:space="preserve"> </w:t>
+      </w:r>
+      <w:r>
+        <w:t xml:space="preserve">are exact on every paired key.</w:t>
+      </w:r>
+    </w:p>
+    <w:p>
+      <w:pPr>
+        <w:pStyle w:val="BodyText"/>
+      </w:pPr>
+      <w:r>
+        <w:t xml:space="preserve">Absolute QLIKE does not improve generally: only one of eight B1-inclusive primary cells</w:t>
+      </w:r>
+      <w:r>
+        <w:t xml:space="preserve"> </w:t>
+      </w:r>
+      <w:r>
+        <w:t xml:space="preserve">has lower paired loss after remediation. Scientific validity improves because the</w:t>
+      </w:r>
+      <w:r>
+        <w:t xml:space="preserve"> </w:t>
+      </w:r>
+      <w:r>
+        <w:t xml:space="preserve">inadmissible clock is removed. The corrected contrasts retain the earlier qualitative</w:t>
+      </w:r>
+      <w:r>
+        <w:t xml:space="preserve"> </w:t>
+      </w:r>
+      <w:r>
+        <w:t xml:space="preserve">pattern: all four ΔB1 estimates are positive and three of four descriptive Holm p-values</w:t>
+      </w:r>
+      <w:r>
+        <w:t xml:space="preserve"> </w:t>
+      </w:r>
+      <w:r>
+        <w:t xml:space="preserve">are below 0.05; all four ΔB2 conditional on B1 intervals cross zero and none is</w:t>
+      </w:r>
+      <w:r>
+        <w:t xml:space="preserve"> </w:t>
+      </w:r>
+      <w:r>
+        <w:t xml:space="preserve">descriptively significant. The complete cells, paired QLIKE comparison, coverage</w:t>
+      </w:r>
+      <w:r>
+        <w:t xml:space="preserve"> </w:t>
+      </w:r>
+      <w:r>
+        <w:t xml:space="preserve">distinction, custody and hashes are reported in</w:t>
+      </w:r>
+      <w:r>
+        <w:t xml:space="preserve"> </w:t>
+      </w:r>
+      <w:r>
+        <w:rPr>
+          <w:rStyle w:val="VerbatimChar"/>
+        </w:rPr>
+        <w:t xml:space="preserve">reports/phase8a_exploratory_bridge_addendum_v13.md</w:t>
       </w:r>
       <w:r>
         <w:t xml:space="preserve">.</w:t>
       </w:r>
     </w:p>
     <w:bookmarkEnd w:id="32"/>
-    <w:bookmarkStart w:id="33" w:name="X92789f8c2ab2ec71a880ad0265646011b597bdb"/>
+    <w:bookmarkStart w:id="33" w:name="Xaf1a61459b7021697d23d3251bf85a51be5ad96"/>
     <w:p>
       <w:pPr>
         <w:pStyle w:val="Heading3"/>
@@ -3142,7 +3333,7 @@
         <w:t xml:space="preserve"> </w:t>
       </w:r>
       <w:r>
-        <w:t xml:space="preserve">population effect was proved zero. The timing-remediated run did not reopen that 68-test</w:t>
+        <w:t xml:space="preserve">population effect was proved zero. The spot-cutoff-remediated run did not reopen that 68-test</w:t>
       </w:r>
       <w:r>
         <w:t xml:space="preserve"> </w:t>
@@ -3178,16 +3369,17 @@
     <w:tbl>
       <w:tblPr>
         <w:tblStyle w:val="Table"/>
-        <w:tblW w:type="auto" w:w="0"/>
+        <w:tblW w:type="pct" w:w="5000"/>
         <w:tblLook w:firstRow="1" w:lastRow="0" w:firstColumn="0" w:lastColumn="0" w:noHBand="0" w:noVBand="0" w:val="0020"/>
         <w:jc w:val="start"/>
+        <w:tblLayout w:type="fixed"/>
       </w:tblPr>
       <w:tblGrid>
-        <w:gridCol w:w="1584"/>
-        <w:gridCol w:w="1584"/>
-        <w:gridCol w:w="1584"/>
-        <w:gridCol w:w="1584"/>
-        <w:gridCol w:w="1584"/>
+        <w:gridCol w:w="1250"/>
+        <w:gridCol w:w="1667"/>
+        <w:gridCol w:w="1667"/>
+        <w:gridCol w:w="1667"/>
+        <w:gridCol w:w="1667"/>
       </w:tblGrid>
       <w:tr>
         <w:trPr>
@@ -3275,7 +3467,7 @@
               <w:jc w:val="right"/>
             </w:pPr>
             <w:r>
-              <w:t xml:space="preserve">12.593 / 10 / 0.247302 / 1.000000</w:t>
+              <w:t xml:space="preserve">12.567 / 10 / 0.248901 / 1.000000</w:t>
             </w:r>
           </w:p>
         </w:tc>
@@ -3287,7 +3479,7 @@
               <w:jc w:val="right"/>
             </w:pPr>
             <w:r>
-              <w:t xml:space="preserve">11.769 / 10 / 0.300784 / 1.000000</w:t>
+              <w:t xml:space="preserve">11.793 / 10 / 0.299176 / 1.000000</w:t>
             </w:r>
           </w:p>
         </w:tc>
@@ -3299,7 +3491,7 @@
               <w:jc w:val="right"/>
             </w:pPr>
             <w:r>
-              <w:t xml:space="preserve">27.793 / 10 / 0.001948 / 0.070123</w:t>
+              <w:t xml:space="preserve">27.846 / 10 / 0.001910 / 0.068774</w:t>
             </w:r>
           </w:p>
         </w:tc>
@@ -3311,7 +3503,7 @@
               <w:jc w:val="right"/>
             </w:pPr>
             <w:r>
-              <w:t xml:space="preserve">29.554 / 10 / 0.001013 / 0.038488</w:t>
+              <w:t xml:space="preserve">29.575 / 10 / 0.001005 / 0.038196</w:t>
             </w:r>
           </w:p>
         </w:tc>
@@ -3337,7 +3529,7 @@
               <w:jc w:val="right"/>
             </w:pPr>
             <w:r>
-              <w:t xml:space="preserve">12.976 / 10 / 0.225014 / 1.000000</w:t>
+              <w:t xml:space="preserve">12.981 / 10 / 0.224741 / 1.000000</w:t>
             </w:r>
           </w:p>
         </w:tc>
@@ -3349,7 +3541,7 @@
               <w:jc w:val="right"/>
             </w:pPr>
             <w:r>
-              <w:t xml:space="preserve">17.634 / 10 / 0.061464 / 1.000000</w:t>
+              <w:t xml:space="preserve">17.623 / 10 / 0.061665 / 1.000000</w:t>
             </w:r>
           </w:p>
         </w:tc>
@@ -3361,7 +3553,7 @@
               <w:jc w:val="right"/>
             </w:pPr>
             <w:r>
-              <w:t xml:space="preserve">27.793 / 10 / 0.001948 / 0.070123</w:t>
+              <w:t xml:space="preserve">27.846 / 10 / 0.001910 / 0.068774</w:t>
             </w:r>
           </w:p>
         </w:tc>
@@ -3373,7 +3565,7 @@
               <w:jc w:val="right"/>
             </w:pPr>
             <w:r>
-              <w:t xml:space="preserve">29.554 / 10 / 0.001013 / 0.038488</w:t>
+              <w:t xml:space="preserve">29.575 / 10 / 0.001005 / 0.038196</w:t>
             </w:r>
           </w:p>
         </w:tc>
@@ -3399,7 +3591,7 @@
               <w:jc w:val="right"/>
             </w:pPr>
             <w:r>
-              <w:t xml:space="preserve">29.405 / 12 / 0.003429 / 0.109729</w:t>
+              <w:t xml:space="preserve">29.378 / 12 / 0.003461 / 0.110753</w:t>
             </w:r>
           </w:p>
         </w:tc>
@@ -3411,7 +3603,7 @@
               <w:jc w:val="right"/>
             </w:pPr>
             <w:r>
-              <w:t xml:space="preserve">22.717 / 12 / 0.030231 / 0.816240</w:t>
+              <w:t xml:space="preserve">22.729 / 12 / 0.030119 / 0.813202</w:t>
             </w:r>
           </w:p>
         </w:tc>
@@ -3423,7 +3615,7 @@
               <w:jc w:val="right"/>
             </w:pPr>
             <w:r>
-              <w:t xml:space="preserve">30.457 / 12 / 0.002382 / 0.080985</w:t>
+              <w:t xml:space="preserve">30.497 / 12 / 0.002349 / 0.079872</w:t>
             </w:r>
           </w:p>
         </w:tc>
@@ -3435,7 +3627,7 @@
               <w:jc w:val="right"/>
             </w:pPr>
             <w:r>
-              <w:t xml:space="preserve">26.444 / 12 / 0.009284 / 0.269236</w:t>
+              <w:t xml:space="preserve">26.468 / 12 / 0.009209 / 0.267060</w:t>
             </w:r>
           </w:p>
         </w:tc>
@@ -3461,7 +3653,7 @@
               <w:jc w:val="right"/>
             </w:pPr>
             <w:r>
-              <w:t xml:space="preserve">33.065 / 12 / 0.000946 / 0.036878</w:t>
+              <w:t xml:space="preserve">33.068 / 12 / 0.000945 / 0.036843</w:t>
             </w:r>
           </w:p>
         </w:tc>
@@ -3473,7 +3665,7 @@
               <w:jc w:val="right"/>
             </w:pPr>
             <w:r>
-              <w:t xml:space="preserve">37.072 / 12 / 0.000217 / 0.008699</w:t>
+              <w:t xml:space="preserve">37.078 / 12 / 0.000217 / 0.008680</w:t>
             </w:r>
           </w:p>
         </w:tc>
@@ -3485,7 +3677,7 @@
               <w:jc w:val="right"/>
             </w:pPr>
             <w:r>
-              <w:t xml:space="preserve">30.457 / 12 / 0.002382 / 0.080985</w:t>
+              <w:t xml:space="preserve">30.497 / 12 / 0.002349 / 0.079872</w:t>
             </w:r>
           </w:p>
         </w:tc>
@@ -3497,7 +3689,7 @@
               <w:jc w:val="right"/>
             </w:pPr>
             <w:r>
-              <w:t xml:space="preserve">26.444 / 12 / 0.009284 / 0.269236</w:t>
+              <w:t xml:space="preserve">26.468 / 12 / 0.009209 / 0.267060</w:t>
             </w:r>
           </w:p>
         </w:tc>
@@ -3529,7 +3721,7 @@
         <w:t xml:space="preserve"> </w:t>
       </w:r>
       <w:r>
-        <w:t xml:space="preserve">is 0.405764 and the coverage main effect is 0.036811, a ratio of 11.02. The registered</w:t>
+        <w:t xml:space="preserve">is 0.405476 and the coverage main effect is 0.037680, a ratio of 10.76. The registered</w:t>
       </w:r>
       <w:r>
         <w:t xml:space="preserve"> </w:t>
@@ -3657,7 +3849,7 @@
         <w:rPr>
           <w:rStyle w:val="VerbatimChar"/>
         </w:rPr>
-        <w:t xml:space="preserve">artifacts/rp2_ext1_directional_factorial_v2/results.json</w:t>
+        <w:t xml:space="preserve">artifacts/rp2_ext1_directional_factorial_v3/results.json</w:t>
       </w:r>
       <w:r>
         <w:t xml:space="preserve">; it records</w:t>
@@ -3676,7 +3868,7 @@
       </w:r>
     </w:p>
     <w:bookmarkEnd w:id="33"/>
-    <w:bookmarkStart w:id="34" w:name="X08e477e665b55ba288ce28eba8927c6ac385830"/>
+    <w:bookmarkStart w:id="34" w:name="X96727389f6f5dc8fda81a92ab615eb307f45a02"/>
     <w:p>
       <w:pPr>
         <w:pStyle w:val="Heading3"/>
@@ -3779,13 +3971,13 @@
         <w:t xml:space="preserve"> </w:t>
       </w:r>
       <w:r>
-        <w:t xml:space="preserve">repairs of decision 92. Under the timing-remediated bundle, recalibrated discovery ΔB1 is</w:t>
-      </w:r>
-      <w:r>
-        <w:t xml:space="preserve"> </w:t>
-      </w:r>
-      <w:r>
-        <w:t xml:space="preserve">+0.00276 for</w:t>
+        <w:t xml:space="preserve">repairs of decision 92. Under the B1 spot-cutoff-remediated bundle, recalibrated discovery ΔB1 is</w:t>
+      </w:r>
+      <w:r>
+        <w:t xml:space="preserve"> </w:t>
+      </w:r>
+      <w:r>
+        <w:t xml:space="preserve">+0.00275 for</w:t>
       </w:r>
       <w:r>
         <w:t xml:space="preserve"> </w:t>
@@ -3797,7 +3989,7 @@
         <w:t xml:space="preserve">gamma_glm</w:t>
       </w:r>
       <w:r>
-        <w:t xml:space="preserve">, +0.00288 for</w:t>
+        <w:t xml:space="preserve">, +0.00287 for</w:t>
       </w:r>
       <w:r>
         <w:t xml:space="preserve"> </w:t>
@@ -3812,7 +4004,7 @@
         <w:t xml:space="preserve"> </w:t>
       </w:r>
       <w:r>
-        <w:t xml:space="preserve">and +0.00285 for</w:t>
+        <w:t xml:space="preserve">and +0.00334 for</w:t>
       </w:r>
       <w:r>
         <w:t xml:space="preserve"> </w:t>
@@ -3824,7 +4016,7 @@
         <w:t xml:space="preserve">lightgbm_qlike</w:t>
       </w:r>
       <w:r>
-        <w:t xml:space="preserve">; validation reads −0.00084, −0.00091 and −0.00101, none significant</w:t>
+        <w:t xml:space="preserve">; validation reads −0.00079, −0.00086 and +0.00155, none significant</w:t>
       </w:r>
       <w:r>
         <w:t xml:space="preserve"> </w:t>
@@ -3839,7 +4031,7 @@
         <w:t xml:space="preserve">rp2_block8_ladder/ladder.json</w:t>
       </w:r>
       <w:r>
-        <w:t xml:space="preserve">). These figures are diagnostics and not the study's</w:t>
+        <w:t xml:space="preserve">). These figures are diagnostics and not the study’s</w:t>
       </w:r>
       <w:r>
         <w:t xml:space="preserve"> </w:t>
@@ -3851,7 +4043,7 @@
         <w:t xml:space="preserve"> </w:t>
       </w:r>
       <w:r>
-        <w:t xml:space="preserve">primary raw contrast remains the one reported in §5.1, on which the report's claims</w:t>
+        <w:t xml:space="preserve">primary raw contrast remains the one reported in §5.1, on which the report’s claims</w:t>
       </w:r>
       <w:r>
         <w:t xml:space="preserve"> </w:t>
@@ -3863,13 +4055,13 @@
         <w:t xml:space="preserve"> </w:t>
       </w:r>
       <w:r>
-        <w:t xml:space="preserve">slope of the gamma family's B0 forecasts is 1.00 in discovery and 1.03 in validation, and</w:t>
-      </w:r>
-      <w:r>
-        <w:t xml:space="preserve"> </w:t>
-      </w:r>
-      <w:r>
-        <w:t xml:space="preserve">the tree family's is 1.02 against 1.11 — so the raw validation nulls and the recalibrated</w:t>
+        <w:t xml:space="preserve">slope of the gamma family’s B0 forecasts is 1.00 in discovery and 1.03 in validation, and</w:t>
+      </w:r>
+      <w:r>
+        <w:t xml:space="preserve"> </w:t>
+      </w:r>
+      <w:r>
+        <w:t xml:space="preserve">the tree family’s is 1.02 against 1.11 — so the raw validation nulls and the recalibrated</w:t>
       </w:r>
       <w:r>
         <w:t xml:space="preserve"> </w:t>
@@ -3895,7 +4087,7 @@
         <w:t xml:space="preserve"> </w:t>
       </w:r>
       <w:r>
-        <w:t xml:space="preserve">is +0.00024 for</w:t>
+        <w:t xml:space="preserve">is +0.00018 for</w:t>
       </w:r>
       <w:r>
         <w:t xml:space="preserve"> </w:t>
@@ -3922,7 +4114,7 @@
         <w:t xml:space="preserve"> </w:t>
       </w:r>
       <w:r>
-        <w:t xml:space="preserve">and +0.00096 for</w:t>
+        <w:t xml:space="preserve">and +0.00055 for</w:t>
       </w:r>
       <w:r>
         <w:t xml:space="preserve"> </w:t>
@@ -3982,7 +4174,7 @@
       </w:r>
     </w:p>
     <w:bookmarkEnd w:id="34"/>
-    <w:bookmarkStart w:id="35" w:name="X8389a3a91025374832e5a84c65754e1ef7d1ba7"/>
+    <w:bookmarkStart w:id="35" w:name="Xfda4d5761af0037af982e9c1bd6cfc354663424"/>
     <w:p>
       <w:pPr>
         <w:pStyle w:val="Heading3"/>
@@ -4020,7 +4212,7 @@
         <w:t xml:space="preserve"> </w:t>
       </w:r>
       <w:r>
-        <w:t xml:space="preserve">0.18012 against HAR's 0.18041; both remeasured 2026-08-25 after the Int8</w:t>
+        <w:t xml:space="preserve">0.18012 against HAR’s 0.18041; both remeasured 2026-08-25 after the Int8</w:t>
       </w:r>
       <w:r>
         <w:t xml:space="preserve"> </w:t>
@@ -4076,7 +4268,7 @@
     </w:p>
     <w:bookmarkEnd w:id="35"/>
     <w:bookmarkEnd w:id="36"/>
-    <w:bookmarkStart w:id="37" w:name="Xe60211b7362d4efd10cab3a88ad8ddec4cb4e70"/>
+    <w:bookmarkStart w:id="37" w:name="discussion"/>
     <w:p>
       <w:pPr>
         <w:pStyle w:val="Heading2"/>
@@ -4168,13 +4360,13 @@
         <w:t xml:space="preserve"> </w:t>
       </w:r>
       <w:r>
-        <w:t xml:space="preserve">when the forecasts are recalibrated out of evaluation, and why no single family's number is</w:t>
-      </w:r>
-      <w:r>
-        <w:t xml:space="preserve"> </w:t>
-      </w:r>
-      <w:r>
-        <w:t xml:space="preserve">presented as the study's answer.</w:t>
+        <w:t xml:space="preserve">when the forecasts are recalibrated out of evaluation, and why no single family’s number is</w:t>
+      </w:r>
+      <w:r>
+        <w:t xml:space="preserve"> </w:t>
+      </w:r>
+      <w:r>
+        <w:t xml:space="preserve">presented as the study’s answer.</w:t>
       </w:r>
     </w:p>
     <w:p>
@@ -4259,7 +4451,19 @@
         <w:t xml:space="preserve"> </w:t>
       </w:r>
       <w:r>
-        <w:t xml:space="preserve">or rerun. Phase 9 (decision 58) remains a frozen, collecting, 60-session one-read test of</w:t>
+        <w:t xml:space="preserve">or reopened as a new canonical evaluation. Its same-session post-hoc remediation is a</w:t>
+      </w:r>
+      <w:r>
+        <w:t xml:space="preserve"> </w:t>
+      </w:r>
+      <w:r>
+        <w:t xml:space="preserve">sensitivity over already materialized bytes, not a second confirmation. Phase 9 (decision</w:t>
+      </w:r>
+      <w:r>
+        <w:t xml:space="preserve"> </w:t>
+      </w:r>
+      <w:r>
+        <w:t xml:space="preserve">58) remains a frozen, collecting, 60-session one-read test of</w:t>
       </w:r>
       <w:r>
         <w:t xml:space="preserve"> </w:t>
@@ -4329,7 +4533,7 @@
       </w:r>
     </w:p>
     <w:bookmarkEnd w:id="37"/>
-    <w:bookmarkStart w:id="38" w:name="X37c964ddc35c2eea68e5d9ed0daf274553be565"/>
+    <w:bookmarkStart w:id="38" w:name="threats-to-validity"/>
     <w:p>
       <w:pPr>
         <w:pStyle w:val="Heading2"/>
@@ -4355,13 +4559,13 @@
         <w:t xml:space="preserve"> </w:t>
       </w:r>
       <w:r>
-        <w:t xml:space="preserve">sessions against discovery's one hundred and fifty-six. The minimum detectable effects</w:t>
-      </w:r>
-      <w:r>
-        <w:t xml:space="preserve"> </w:t>
-      </w:r>
-      <w:r>
-        <w:t xml:space="preserve">that follow — 0.00496 for</w:t>
+        <w:t xml:space="preserve">sessions against discovery’s one hundred and fifty-six. The minimum detectable effects</w:t>
+      </w:r>
+      <w:r>
+        <w:t xml:space="preserve"> </w:t>
+      </w:r>
+      <w:r>
+        <w:t xml:space="preserve">that follow — 0.00506 for</w:t>
       </w:r>
       <w:r>
         <w:t xml:space="preserve"> </w:t>
@@ -4373,7 +4577,7 @@
         <w:t xml:space="preserve">gamma_glm</w:t>
       </w:r>
       <w:r>
-        <w:t xml:space="preserve">, 0.00311 for</w:t>
+        <w:t xml:space="preserve">, 0.00315 for</w:t>
       </w:r>
       <w:r>
         <w:t xml:space="preserve"> </w:t>
@@ -4385,7 +4589,7 @@
         <w:t xml:space="preserve">ridge_log</w:t>
       </w:r>
       <w:r>
-        <w:t xml:space="preserve">, 0.01037 for</w:t>
+        <w:t xml:space="preserve">, 0.01198 for</w:t>
       </w:r>
       <w:r>
         <w:t xml:space="preserve"> </w:t>
@@ -4400,7 +4604,7 @@
         <w:t xml:space="preserve"> </w:t>
       </w:r>
       <w:r>
-        <w:t xml:space="preserve">— stand against discovery increments of +0.00258, +0.00288 and +0.00267,</w:t>
+        <w:t xml:space="preserve">— stand against discovery increments of +0.00256, +0.00287 and +0.00320,</w:t>
       </w:r>
       <w:r>
         <w:t xml:space="preserve"> </w:t>
@@ -4432,7 +4636,7 @@
         <w:pStyle w:val="BodyText"/>
       </w:pPr>
       <w:r>
-        <w:t xml:space="preserve">The threat is not one-sided. The</w:t>
+        <w:t xml:space="preserve">The threat is not one-sided. Validation ΔB2|B1 is negative for</w:t>
       </w:r>
       <w:r>
         <w:t xml:space="preserve"> </w:t>
@@ -4447,31 +4651,52 @@
         <w:t xml:space="preserve"> </w:t>
       </w:r>
       <w:r>
-        <w:t xml:space="preserve">validation ΔB2|B1 of −0.00272 at</w:t>
-      </w:r>
-      <w:r>
-        <w:t xml:space="preserve"> </w:t>
-      </w:r>
-      <w:r>
-        <w:t xml:space="preserve">[−0.00598, −0.00011] excludes zero at 95 percent without clearing the budget, and carries</w:t>
-      </w:r>
-      <w:r>
-        <w:t xml:space="preserve"> </w:t>
-      </w:r>
-      <w:r>
-        <w:t xml:space="preserve">a measured caveat: on the run this one supersedes, its interval's empirical coverage was</w:t>
-      </w:r>
-      <w:r>
-        <w:t xml:space="preserve"> </w:t>
-      </w:r>
-      <w:r>
-        <w:t xml:space="preserve">0.784 against a nominal 0.95, and that measurement has not been repeated on the current</w:t>
-      </w:r>
-      <w:r>
-        <w:t xml:space="preserve"> </w:t>
-      </w:r>
-      <w:r>
-        <w:t xml:space="preserve">run. Its sign survives; its stated confidence does not read as stated.</w:t>
+        <w:t xml:space="preserve">and</w:t>
+      </w:r>
+      <w:r>
+        <w:t xml:space="preserve"> </w:t>
+      </w:r>
+      <w:r>
+        <w:rPr>
+          <w:rStyle w:val="VerbatimChar"/>
+        </w:rPr>
+        <w:t xml:space="preserve">ridge_log</w:t>
+      </w:r>
+      <w:r>
+        <w:t xml:space="preserve"> </w:t>
+      </w:r>
+      <w:r>
+        <w:t xml:space="preserve">but positive for</w:t>
+      </w:r>
+      <w:r>
+        <w:t xml:space="preserve"> </w:t>
+      </w:r>
+      <w:r>
+        <w:rPr>
+          <w:rStyle w:val="VerbatimChar"/>
+        </w:rPr>
+        <w:t xml:space="preserve">lightgbm_qlike</w:t>
+      </w:r>
+      <w:r>
+        <w:t xml:space="preserve">; all three intervals cross zero. The current</w:t>
+      </w:r>
+      <w:r>
+        <w:t xml:space="preserve"> </w:t>
+      </w:r>
+      <w:r>
+        <w:t xml:space="preserve">run therefore establishes neither incremental benefit nor harm from B2 in validation.</w:t>
+      </w:r>
+      <w:r>
+        <w:t xml:space="preserve"> </w:t>
+      </w:r>
+      <w:r>
+        <w:t xml:space="preserve">The family-dependent signs and wide intervals are part of the result, not permission to</w:t>
+      </w:r>
+      <w:r>
+        <w:t xml:space="preserve"> </w:t>
+      </w:r>
+      <w:r>
+        <w:t xml:space="preserve">select the agreeable family.</w:t>
       </w:r>
     </w:p>
     <w:p>
@@ -4485,19 +4710,19 @@
         <w:t xml:space="preserve"> </w:t>
       </w:r>
       <w:r>
-        <w:t xml:space="preserve">three fixed families give discovery ΔB1 of +0.00258, +0.00288 and +0.00267, while</w:t>
-      </w:r>
-      <w:r>
-        <w:t xml:space="preserve"> </w:t>
-      </w:r>
-      <w:r>
-        <w:t xml:space="preserve">validation gives −0.00152, −0.00092 and +0.00136 and their minimum detectable effects</w:t>
-      </w:r>
-      <w:r>
-        <w:t xml:space="preserve"> </w:t>
-      </w:r>
-      <w:r>
-        <w:t xml:space="preserve">differ by a factor of 3.3. The family therefore fixes both the estimate and what the experiment</w:t>
+        <w:t xml:space="preserve">three fixed families give discovery ΔB1 of +0.00256, +0.00287 and +0.00320, while</w:t>
+      </w:r>
+      <w:r>
+        <w:t xml:space="preserve"> </w:t>
+      </w:r>
+      <w:r>
+        <w:t xml:space="preserve">validation gives −0.00150, −0.00088 and +0.00280 and their minimum detectable effects</w:t>
+      </w:r>
+      <w:r>
+        <w:t xml:space="preserve"> </w:t>
+      </w:r>
+      <w:r>
+        <w:t xml:space="preserve">differ by a factor of 3.8. The family therefore fixes both the estimate and what the experiment</w:t>
       </w:r>
       <w:r>
         <w:t xml:space="preserve"> </w:t>
@@ -4559,7 +4784,34 @@
         <w:t xml:space="preserve"> </w:t>
       </w:r>
       <w:r>
-        <w:t xml:space="preserve">name. B1 reaches a core coverage of 0.9934 with no post-cutoff observation, but its</w:t>
+        <w:t xml:space="preserve">name. In D/V, B1 reaches a minimum core-feature coverage of 0.9934 with no post-cutoff</w:t>
+      </w:r>
+      <w:r>
+        <w:t xml:space="preserve"> </w:t>
+      </w:r>
+      <w:r>
+        <w:t xml:space="preserve">observation; in the same-session Phase 8 remediation its minimum is 0.996923, with</w:t>
+      </w:r>
+      <w:r>
+        <w:t xml:space="preserve"> </w:t>
+      </w:r>
+      <w:r>
+        <w:rPr>
+          <w:rStyle w:val="VerbatimChar"/>
+        </w:rPr>
+        <w:t xml:space="preserve">b1_risk_reversal_25</w:t>
+      </w:r>
+      <w:r>
+        <w:t xml:space="preserve"> </w:t>
+      </w:r>
+      <w:r>
+        <w:t xml:space="preserve">finite on 11,664 of 11,700 current-grid origins and every other core</w:t>
+      </w:r>
+      <w:r>
+        <w:t xml:space="preserve"> </w:t>
+      </w:r>
+      <w:r>
+        <w:t xml:space="preserve">feature finite on all origins. Its</w:t>
       </w:r>
       <w:r>
         <w:t xml:space="preserve"> </w:t>
@@ -4583,7 +4835,7 @@
         <w:t xml:space="preserve"> </w:t>
       </w:r>
       <w:r>
-        <w:t xml:space="preserve">fit quality. B2 is one vendor's option-trade tape read through an availability proxy,</w:t>
+        <w:t xml:space="preserve">fit quality. B2 is one vendor’s option-trade tape read through an availability proxy,</w:t>
       </w:r>
       <w:r>
         <w:t xml:space="preserve"> </w:t>
@@ -4615,13 +4867,13 @@
         <w:t xml:space="preserve"> </w:t>
       </w:r>
       <w:r>
-        <w:t xml:space="preserve">smaller training sample or an absent effect. B0 QLIKE rises from 0.13860, 0.13910 and</w:t>
-      </w:r>
-      <w:r>
-        <w:t xml:space="preserve"> </w:t>
-      </w:r>
-      <w:r>
-        <w:t xml:space="preserve">0.13550 in discovery to 0.17501, 0.17851 and 0.19866 in validation. Randomly mixing</w:t>
+        <w:t xml:space="preserve">smaller training sample or an absent effect. B0 QLIKE rises from 0.14522, 0.14576 and</w:t>
+      </w:r>
+      <w:r>
+        <w:t xml:space="preserve"> </w:t>
+      </w:r>
+      <w:r>
+        <w:t xml:space="preserve">0.14239 in discovery to 0.18347, 0.18724 and 0.21304 in validation. Randomly mixing</w:t>
       </w:r>
       <w:r>
         <w:t xml:space="preserve"> </w:t>
@@ -4630,8 +4882,34 @@
         <w:t xml:space="preserve">sessions would conceal that temporal-generalisation problem rather than solve it.</w:t>
       </w:r>
     </w:p>
+    <w:p>
+      <w:pPr>
+        <w:pStyle w:val="BodyText"/>
+      </w:pPr>
+      <w:r>
+        <w:t xml:space="preserve">The Phase 8 remediation is also post-hoc: the original outcomes were known before the</w:t>
+      </w:r>
+      <w:r>
+        <w:t xml:space="preserve"> </w:t>
+      </w:r>
+      <w:r>
+        <w:t xml:space="preserve">corrected B0/B1 clock was applied. Its precommitted paired-grid rules prevent selective</w:t>
+      </w:r>
+      <w:r>
+        <w:t xml:space="preserve"> </w:t>
+      </w:r>
+      <w:r>
+        <w:t xml:space="preserve">reporting within the rerun, but they cannot restore the prospective blindness of the</w:t>
+      </w:r>
+      <w:r>
+        <w:t xml:space="preserve"> </w:t>
+      </w:r>
+      <w:r>
+        <w:t xml:space="preserve">historical one-shot execution. It supports a robustness interpretation only.</w:t>
+      </w:r>
+    </w:p>
     <w:bookmarkEnd w:id="38"/>
-    <w:bookmarkStart w:id="40" w:name="Xd9cf52679672012faea4471d69d6db5ac4faf4b"/>
+    <w:bookmarkStart w:id="40" w:name="conclusion-and-contribution"/>
     <w:p>
       <w:pPr>
         <w:pStyle w:val="Heading2"/>
@@ -4719,7 +4997,19 @@
         <w:t xml:space="preserve"> </w:t>
       </w:r>
       <w:r>
-        <w:t xml:space="preserve">a headline. Phase 8 is complete and exploratory; Phase 9 continues to 60 as prospective</w:t>
+        <w:t xml:space="preserve">a headline. Phase 8 is complete and exploratory; its corrected same-session sensitivity</w:t>
+      </w:r>
+      <w:r>
+        <w:t xml:space="preserve"> </w:t>
+      </w:r>
+      <w:r>
+        <w:t xml:space="preserve">does not improve paired QLIKE generally and does not create a confirmatory result. Phase 9</w:t>
+      </w:r>
+      <w:r>
+        <w:t xml:space="preserve"> </w:t>
+      </w:r>
+      <w:r>
+        <w:t xml:space="preserve">continues to 60 as prospective</w:t>
       </w:r>
       <w:r>
         <w:t xml:space="preserve"> </w:t>
@@ -4748,7 +5038,7 @@
         <w:pStyle w:val="FirstParagraph"/>
       </w:pPr>
       <w:r>
-        <w:t xml:space="preserve">The one question this report leaves open — whether the tree family's budget-clearing B2</w:t>
+        <w:t xml:space="preserve">The one question this report leaves open — whether the tree family’s budget-clearing B2</w:t>
       </w:r>
       <w:r>
         <w:t xml:space="preserve"> </w:t>
@@ -4793,7 +5083,7 @@
         <w:t xml:space="preserve"> </w:t>
       </w:r>
       <w:r>
-        <w:t xml:space="preserve">closed list of two hypotheses on an evaluation window that starts where this study's</w:t>
+        <w:t xml:space="preserve">closed list of two hypotheses on an evaluation window that starts where this study’s</w:t>
       </w:r>
       <w:r>
         <w:t xml:space="preserve"> </w:t>
@@ -4841,7 +5131,7 @@
         <w:t xml:space="preserve"> </w:t>
       </w:r>
       <w:r>
-        <w:t xml:space="preserve">evaluable sessions (estimated 2029-01-30) under a winner's-curse-halved sizing recorded in</w:t>
+        <w:t xml:space="preserve">evaluable sessions (estimated 2029-01-30) under a winner’s-curse-halved sizing recorded in</w:t>
       </w:r>
       <w:r>
         <w:t xml:space="preserve"> </w:t>
@@ -4859,7 +5149,7 @@
         <w:t xml:space="preserve"> </w:t>
       </w:r>
       <w:r>
-        <w:t xml:space="preserve">information at 120 minutes. The program's own selection liabilities are declared inside</w:t>
+        <w:t xml:space="preserve">information at 120 minutes. The program’s own selection liabilities are declared inside</w:t>
       </w:r>
       <w:r>
         <w:t xml:space="preserve"> </w:t>
@@ -4877,13 +5167,13 @@
         <w:t xml:space="preserve"> </w:t>
       </w:r>
       <w:r>
-        <w:t xml:space="preserve">found the frozen index's development effect there to be negative, a dead end recorded</w:t>
-      </w:r>
-      <w:r>
-        <w:t xml:space="preserve"> </w:t>
-      </w:r>
-      <w:r>
-        <w:t xml:space="preserve">permanently beside the road taken. The read's outcome, whatever it is, is committed to</w:t>
+        <w:t xml:space="preserve">found the frozen index’s development effect there to be negative, a dead end recorded</w:t>
+      </w:r>
+      <w:r>
+        <w:t xml:space="preserve"> </w:t>
+      </w:r>
+      <w:r>
+        <w:t xml:space="preserve">permanently beside the road taken. The read’s outcome, whatever it is, is committed to</w:t>
       </w:r>
       <w:r>
         <w:t xml:space="preserve"> </w:t>
@@ -4894,7 +5184,7 @@
     </w:p>
     <w:bookmarkEnd w:id="39"/>
     <w:bookmarkEnd w:id="40"/>
-    <w:bookmarkStart w:id="41" w:name="X05c252bb324b59d74213582a35bc1b53bba3933"/>
+    <w:bookmarkStart w:id="41" w:name="ethics-and-reproducibility"/>
     <w:p>
       <w:pPr>
         <w:pStyle w:val="Heading2"/>
@@ -4960,182 +5250,297 @@
     <w:p>
       <w:pPr>
         <w:pStyle w:val="FirstParagraph"/>
-      </w:pPr>
-      <w:r>
+        <w:spacing w:before="0" w:after="0" w:line="240" w:lineRule="auto"/>
+      </w:pPr>
+      <w:r>
+        <w:rPr>
+          <w:sz w:val="21"/>
+        </w:rPr>
         <w:t xml:space="preserve">A. Campaign register and contrast tables (</w:t>
       </w:r>
       <w:r>
         <w:rPr>
           <w:rStyle w:val="VerbatimChar"/>
+          <w:sz w:val="21"/>
         </w:rPr>
         <w:t xml:space="preserve">docs/results_reconciliation_v2.md</w:t>
       </w:r>
       <w:r>
+        <w:rPr>
+          <w:sz w:val="21"/>
+        </w:rPr>
         <w:t xml:space="preserve">).</w:t>
       </w:r>
       <w:r>
-        <w:t xml:space="preserve"> </w:t>
-      </w:r>
-      <w:r>
+        <w:rPr>
+          <w:sz w:val="21"/>
+        </w:rPr>
+        <w:t xml:space="preserve"> </w:t>
+      </w:r>
+      <w:r>
+        <w:rPr>
+          <w:sz w:val="21"/>
+        </w:rPr>
         <w:t xml:space="preserve">B. Studentized inference tables (</w:t>
       </w:r>
       <w:r>
         <w:rPr>
           <w:rStyle w:val="VerbatimChar"/>
+          <w:sz w:val="21"/>
         </w:rPr>
         <w:t xml:space="preserve">artifacts/gate1_inference/</w:t>
       </w:r>
       <w:r>
+        <w:rPr>
+          <w:sz w:val="21"/>
+        </w:rPr>
         <w:t xml:space="preserve">).</w:t>
       </w:r>
       <w:r>
-        <w:t xml:space="preserve"> </w:t>
-      </w:r>
-      <w:r>
+        <w:rPr>
+          <w:sz w:val="21"/>
+        </w:rPr>
+        <w:t xml:space="preserve"> </w:t>
+      </w:r>
+      <w:r>
+        <w:rPr>
+          <w:sz w:val="21"/>
+        </w:rPr>
         <w:t xml:space="preserve">C. Gate reports 1–12 (</w:t>
       </w:r>
       <w:r>
         <w:rPr>
           <w:rStyle w:val="VerbatimChar"/>
+          <w:sz w:val="21"/>
         </w:rPr>
         <w:t xml:space="preserve">docs/INDEX.md</w:t>
       </w:r>
       <w:r>
+        <w:rPr>
+          <w:sz w:val="21"/>
+        </w:rPr>
         <w:t xml:space="preserve">).</w:t>
       </w:r>
       <w:r>
-        <w:t xml:space="preserve"> </w:t>
-      </w:r>
-      <w:r>
+        <w:rPr>
+          <w:sz w:val="21"/>
+        </w:rPr>
+        <w:t xml:space="preserve"> </w:t>
+      </w:r>
+      <w:r>
+        <w:rPr>
+          <w:sz w:val="21"/>
+        </w:rPr>
         <w:t xml:space="preserve">D. Economic-significance tables (</w:t>
       </w:r>
       <w:r>
         <w:rPr>
           <w:rStyle w:val="VerbatimChar"/>
+          <w:sz w:val="21"/>
         </w:rPr>
         <w:t xml:space="preserve">artifacts/economic_significance/</w:t>
       </w:r>
       <w:r>
+        <w:rPr>
+          <w:sz w:val="21"/>
+        </w:rPr>
         <w:t xml:space="preserve">).</w:t>
       </w:r>
       <w:r>
-        <w:t xml:space="preserve"> </w:t>
-      </w:r>
-      <w:r>
+        <w:rPr>
+          <w:sz w:val="21"/>
+        </w:rPr>
+        <w:t xml:space="preserve"> </w:t>
+      </w:r>
+      <w:r>
+        <w:rPr>
+          <w:sz w:val="21"/>
+        </w:rPr>
         <w:t xml:space="preserve">E. Preregistration, freeze and target-blind planning hashes (Phase 9 freeze</w:t>
       </w:r>
       <w:r>
-        <w:t xml:space="preserve"> </w:t>
-      </w:r>
-      <w:r>
-        <w:rPr>
-          <w:rStyle w:val="VerbatimChar"/>
+        <w:rPr>
+          <w:sz w:val="21"/>
+        </w:rPr>
+        <w:t xml:space="preserve"> </w:t>
+      </w:r>
+      <w:r>
+        <w:rPr>
+          <w:rStyle w:val="VerbatimChar"/>
+          <w:sz w:val="21"/>
         </w:rPr>
         <w:t xml:space="preserve">artifacts/phase9/protocol_freeze.json</w:t>
       </w:r>
       <w:r>
+        <w:rPr>
+          <w:sz w:val="21"/>
+        </w:rPr>
         <w:t xml:space="preserve">; corrected power/deadline audit</w:t>
       </w:r>
       <w:r>
-        <w:t xml:space="preserve"> </w:t>
-      </w:r>
-      <w:r>
-        <w:rPr>
-          <w:rStyle w:val="VerbatimChar"/>
+        <w:rPr>
+          <w:sz w:val="21"/>
+        </w:rPr>
+        <w:t xml:space="preserve"> </w:t>
+      </w:r>
+      <w:r>
+        <w:rPr>
+          <w:rStyle w:val="VerbatimChar"/>
+          <w:sz w:val="21"/>
         </w:rPr>
         <w:t xml:space="preserve">artifacts/phase9/power_deadline_audit_v1.json</w:t>
       </w:r>
       <w:r>
+        <w:rPr>
+          <w:sz w:val="21"/>
+        </w:rPr>
         <w:t xml:space="preserve">).</w:t>
       </w:r>
       <w:r>
-        <w:t xml:space="preserve"> </w:t>
-      </w:r>
-      <w:r>
+        <w:rPr>
+          <w:sz w:val="21"/>
+        </w:rPr>
+        <w:t xml:space="preserve"> </w:t>
+      </w:r>
+      <w:r>
+        <w:rPr>
+          <w:sz w:val="21"/>
+        </w:rPr>
         <w:t xml:space="preserve">F. Supervisor feedback mapping, restricted to source-verified comments; unverified</w:t>
       </w:r>
       <w:r>
-        <w:t xml:space="preserve"> </w:t>
-      </w:r>
-      <w:r>
+        <w:rPr>
+          <w:sz w:val="21"/>
+        </w:rPr>
+        <w:t xml:space="preserve"> </w:t>
+      </w:r>
+      <w:r>
+        <w:rPr>
+          <w:sz w:val="21"/>
+        </w:rPr>
         <w:t xml:space="preserve">paraphrases are excluded.</w:t>
       </w:r>
       <w:r>
-        <w:t xml:space="preserve"> </w:t>
-      </w:r>
-      <w:r>
+        <w:rPr>
+          <w:sz w:val="21"/>
+        </w:rPr>
+        <w:t xml:space="preserve"> </w:t>
+      </w:r>
+      <w:r>
+        <w:rPr>
+          <w:sz w:val="21"/>
+        </w:rPr>
         <w:t xml:space="preserve">G. Primary run artifacts (</w:t>
       </w:r>
       <w:r>
         <w:rPr>
           <w:rStyle w:val="VerbatimChar"/>
-        </w:rPr>
-        <w:t xml:space="preserve">artifacts/rp2_v3/rp2-v3-20260831-timing-role-remediation/</w:t>
-      </w:r>
-      <w:r>
+          <w:sz w:val="21"/>
+        </w:rPr>
+        <w:t xml:space="preserve">artifacts/rp2_v3/rp2-v3-20260831-b1-spot-cutoff-remediation/</w:t>
+      </w:r>
+      <w:r>
+        <w:rPr>
+          <w:sz w:val="21"/>
+        </w:rPr>
         <w:t xml:space="preserve">:</w:t>
       </w:r>
       <w:r>
-        <w:t xml:space="preserve"> </w:t>
-      </w:r>
-      <w:r>
-        <w:rPr>
-          <w:rStyle w:val="VerbatimChar"/>
+        <w:rPr>
+          <w:sz w:val="21"/>
+        </w:rPr>
+        <w:t xml:space="preserve"> </w:t>
+      </w:r>
+      <w:r>
+        <w:rPr>
+          <w:rStyle w:val="VerbatimChar"/>
+          <w:sz w:val="21"/>
         </w:rPr>
         <w:t xml:space="preserve">scorecard.md</w:t>
       </w:r>
       <w:r>
+        <w:rPr>
+          <w:sz w:val="21"/>
+        </w:rPr>
         <w:t xml:space="preserve">,</w:t>
       </w:r>
       <w:r>
-        <w:t xml:space="preserve"> </w:t>
-      </w:r>
-      <w:r>
-        <w:rPr>
-          <w:rStyle w:val="VerbatimChar"/>
+        <w:rPr>
+          <w:sz w:val="21"/>
+        </w:rPr>
+        <w:t xml:space="preserve"> </w:t>
+      </w:r>
+      <w:r>
+        <w:rPr>
+          <w:rStyle w:val="VerbatimChar"/>
+          <w:sz w:val="21"/>
         </w:rPr>
         <w:t xml:space="preserve">rp2_block8_ladder/ladder.json</w:t>
       </w:r>
       <w:r>
+        <w:rPr>
+          <w:sz w:val="21"/>
+        </w:rPr>
         <w:t xml:space="preserve">,</w:t>
       </w:r>
       <w:r>
-        <w:t xml:space="preserve"> </w:t>
-      </w:r>
-      <w:r>
-        <w:rPr>
-          <w:rStyle w:val="VerbatimChar"/>
+        <w:rPr>
+          <w:sz w:val="21"/>
+        </w:rPr>
+        <w:t xml:space="preserve"> </w:t>
+      </w:r>
+      <w:r>
+        <w:rPr>
+          <w:rStyle w:val="VerbatimChar"/>
+          <w:sz w:val="21"/>
         </w:rPr>
         <w:t xml:space="preserve">rp2_block10_inference/inference.json</w:t>
       </w:r>
       <w:r>
+        <w:rPr>
+          <w:sz w:val="21"/>
+        </w:rPr>
         <w:t xml:space="preserve">,</w:t>
       </w:r>
       <w:r>
-        <w:t xml:space="preserve"> </w:t>
-      </w:r>
-      <w:r>
-        <w:rPr>
-          <w:rStyle w:val="VerbatimChar"/>
+        <w:rPr>
+          <w:sz w:val="21"/>
+        </w:rPr>
+        <w:t xml:space="preserve"> </w:t>
+      </w:r>
+      <w:r>
+        <w:rPr>
+          <w:rStyle w:val="VerbatimChar"/>
+          <w:sz w:val="21"/>
         </w:rPr>
         <w:t xml:space="preserve">run_identity.json</w:t>
       </w:r>
       <w:r>
+        <w:rPr>
+          <w:sz w:val="21"/>
+        </w:rPr>
         <w:t xml:space="preserve">) and the run verdict (</w:t>
       </w:r>
       <w:r>
         <w:rPr>
           <w:rStyle w:val="VerbatimChar"/>
+          <w:sz w:val="21"/>
         </w:rPr>
         <w:t xml:space="preserve">docs/rp2_v3/VERDICT.md</w:t>
       </w:r>
       <w:r>
+        <w:rPr>
+          <w:sz w:val="21"/>
+        </w:rPr>
         <w:t xml:space="preserve">).</w:t>
       </w:r>
     </w:p>
     <w:bookmarkEnd w:id="42"/>
     <w:bookmarkEnd w:id="43"/>
-    <w:sectPr/>
+    <w:sectPr>
+      <w:pgSz w:w="12240" w:h="15840"/>
+      <w:pgMar w:top="1440" w:bottom="1440" w:left="1440" w:right="1440"/>
+    </w:sectPr>
   </w:body>
 </w:document>
 </file>

</xml_diff>

<commit_message>
docs: propagate UW opening latency finding
</commit_message>
<xml_diff>
--- a/reports/final_report_draft_v2.docx
+++ b/reports/final_report_draft_v2.docx
@@ -2,7 +2,7 @@
 <file path=word/document.xml><?xml version="1.0" encoding="utf-8"?>
 <w:document xmlns:w="http://schemas.openxmlformats.org/wordprocessingml/2006/main" xmlns:m="http://schemas.openxmlformats.org/officeDocument/2006/math" xmlns:r="http://schemas.openxmlformats.org/officeDocument/2006/relationships" xmlns:o="urn:schemas-microsoft-com:office:office" xmlns:v="urn:schemas-microsoft-com:vml" xmlns:w10="urn:schemas-microsoft-com:office:word" xmlns:a="http://schemas.openxmlformats.org/drawingml/2006/main" xmlns:pic="http://schemas.openxmlformats.org/drawingml/2006/picture" xmlns:wp="http://schemas.openxmlformats.org/drawingml/2006/wordprocessingDrawing">
   <w:body>
-    <w:bookmarkStart w:id="43" w:name="X38984083efee9680b21f1536dd8294d72ad0f10"/>
+    <w:bookmarkStart w:id="44" w:name="X38984083efee9680b21f1536dd8294d72ad0f10"/>
     <w:p>
       <w:pPr>
         <w:pStyle w:val="Heading1"/>
@@ -20,7 +20,7 @@
           <w:bCs/>
           <w:b/>
         </w:rPr>
-        <w:t xml:space="preserve">Capstone report — evidence-cutoff version (2026-08-31)</w:t>
+        <w:t xml:space="preserve">Capstone report — scientific-result cutoff 2026-08-31; timing amendment 2026-09-01</w:t>
       </w:r>
     </w:p>
     <w:p>
@@ -196,49 +196,67 @@
         <w:t xml:space="preserve">govern if a dated narrative disagrees.</w:t>
       </w:r>
     </w:p>
-    <w:bookmarkStart w:id="20" w:name="title-page"/>
-    <w:p>
-      <w:pPr>
-        <w:pStyle w:val="Heading2"/>
-      </w:pPr>
-      <w:r>
-        <w:t xml:space="preserve">Title page</w:t>
-      </w:r>
-    </w:p>
-    <w:p>
-      <w:pPr>
-        <w:pStyle w:val="FirstParagraph"/>
+    <w:p>
+      <w:pPr>
+        <w:pStyle w:val="BlockText"/>
       </w:pPr>
       <w:r>
         <w:rPr>
           <w:bCs/>
           <w:b/>
         </w:rPr>
-        <w:t xml:space="preserve">Title:</w:t>
-      </w:r>
-      <w:r>
-        <w:t xml:space="preserve"> </w:t>
-      </w:r>
-      <w:r>
-        <w:t xml:space="preserve">Point-in-time options information for forecasting next-30-minute realised variance</w:t>
-      </w:r>
-    </w:p>
-    <w:p>
-      <w:pPr>
-        <w:pStyle w:val="BodyText"/>
+        <w:t xml:space="preserve">Methodological timing amendment (2026-09-01).</w:t>
+      </w:r>
+      <w:r>
+        <w:t xml:space="preserve"> </w:t>
+      </w:r>
+      <w:r>
+        <w:t xml:space="preserve">The predictive-result cutoff above</w:t>
+      </w:r>
+      <w:r>
+        <w:t xml:space="preserve"> </w:t>
+      </w:r>
+      <w:r>
+        <w:t xml:space="preserve">is unchanged. A later target-blind UW receipt-latency snapshot is included only to</w:t>
+      </w:r>
+      <w:r>
+        <w:t xml:space="preserve"> </w:t>
+      </w:r>
+      <w:r>
+        <w:t xml:space="preserve">correct the operational-availability limitation in §§3, 7 and 8. It changes no panel,</w:t>
+      </w:r>
+      <w:r>
+        <w:t xml:space="preserve"> </w:t>
+      </w:r>
+      <w:r>
+        <w:t xml:space="preserve">mask, estimate, interval or verdict and reads no sealed outcome cohort.</w:t>
+      </w:r>
+    </w:p>
+    <w:bookmarkStart w:id="20" w:name="title-page"/>
+    <w:p>
+      <w:pPr>
+        <w:pStyle w:val="Heading2"/>
+      </w:pPr>
+      <w:r>
+        <w:t xml:space="preserve">Title page</w:t>
+      </w:r>
+    </w:p>
+    <w:p>
+      <w:pPr>
+        <w:pStyle w:val="FirstParagraph"/>
       </w:pPr>
       <w:r>
         <w:rPr>
           <w:bCs/>
           <w:b/>
         </w:rPr>
-        <w:t xml:space="preserve">Author:</w:t>
-      </w:r>
-      <w:r>
-        <w:t xml:space="preserve"> </w:t>
-      </w:r>
-      <w:r>
-        <w:t xml:space="preserve">Miguel Guerrero Quijano</w:t>
+        <w:t xml:space="preserve">Title:</w:t>
+      </w:r>
+      <w:r>
+        <w:t xml:space="preserve"> </w:t>
+      </w:r>
+      <w:r>
+        <w:t xml:space="preserve">Point-in-time options information for forecasting next-30-minute realised variance</w:t>
       </w:r>
     </w:p>
     <w:p>
@@ -250,13 +268,13 @@
           <w:bCs/>
           <w:b/>
         </w:rPr>
-        <w:t xml:space="preserve">Course:</w:t>
-      </w:r>
-      <w:r>
-        <w:t xml:space="preserve"> </w:t>
-      </w:r>
-      <w:r>
-        <w:t xml:space="preserve">MDS650 Capstone Research Project</w:t>
+        <w:t xml:space="preserve">Author:</w:t>
+      </w:r>
+      <w:r>
+        <w:t xml:space="preserve"> </w:t>
+      </w:r>
+      <w:r>
+        <w:t xml:space="preserve">Miguel Guerrero Quijano</w:t>
       </w:r>
     </w:p>
     <w:p>
@@ -268,13 +286,13 @@
           <w:bCs/>
           <w:b/>
         </w:rPr>
-        <w:t xml:space="preserve">Document:</w:t>
-      </w:r>
-      <w:r>
-        <w:t xml:space="preserve"> </w:t>
-      </w:r>
-      <w:r>
-        <w:t xml:space="preserve">Capstone report, evidence-cutoff version</w:t>
+        <w:t xml:space="preserve">Course:</w:t>
+      </w:r>
+      <w:r>
+        <w:t xml:space="preserve"> </w:t>
+      </w:r>
+      <w:r>
+        <w:t xml:space="preserve">MDS650 Capstone Research Project</w:t>
       </w:r>
     </w:p>
     <w:p>
@@ -286,6 +304,24 @@
           <w:bCs/>
           <w:b/>
         </w:rPr>
+        <w:t xml:space="preserve">Document:</w:t>
+      </w:r>
+      <w:r>
+        <w:t xml:space="preserve"> </w:t>
+      </w:r>
+      <w:r>
+        <w:t xml:space="preserve">Capstone report, evidence-cutoff version</w:t>
+      </w:r>
+    </w:p>
+    <w:p>
+      <w:pPr>
+        <w:pStyle w:val="BodyText"/>
+      </w:pPr>
+      <w:r>
+        <w:rPr>
+          <w:bCs/>
+          <w:b/>
+        </w:rPr>
         <w:t xml:space="preserve">Evidence cutoff:</w:t>
       </w:r>
       <w:r>
@@ -293,6 +329,24 @@
       </w:r>
       <w:r>
         <w:t xml:space="preserve">31 August 2026 (Australia/Sydney)</w:t>
+      </w:r>
+    </w:p>
+    <w:p>
+      <w:pPr>
+        <w:pStyle w:val="BodyText"/>
+      </w:pPr>
+      <w:r>
+        <w:rPr>
+          <w:bCs/>
+          <w:b/>
+        </w:rPr>
+        <w:t xml:space="preserve">Methodological timing amendment:</w:t>
+      </w:r>
+      <w:r>
+        <w:t xml:space="preserve"> </w:t>
+      </w:r>
+      <w:r>
+        <w:t xml:space="preserve">1 September 2026 (target-blind; no result re-evaluation)</w:t>
       </w:r>
     </w:p>
     <w:bookmarkEnd w:id="20"/>
@@ -424,7 +478,25 @@
         <w:t xml:space="preserve"> </w:t>
       </w:r>
       <w:r>
-        <w:t xml:space="preserve">time; PIT v2.2 reconciliation therefore remains blocked. Phase 8 consumed its sole</w:t>
+        <w:t xml:space="preserve">time. A five-clean-session receipt audit found 6/406 (1.48 per cent) opening receipts</w:t>
+      </w:r>
+      <w:r>
+        <w:t xml:space="preserve"> </w:t>
+      </w:r>
+      <w:r>
+        <w:t xml:space="preserve">beyond 60 seconds and none beyond 120 seconds, so the 60-second UW proxy is not a strict</w:t>
+      </w:r>
+      <w:r>
+        <w:t xml:space="preserve"> </w:t>
+      </w:r>
+      <w:r>
+        <w:t xml:space="preserve">conservative opening bound in this sample; PIT v2.2 reconciliation therefore remains</w:t>
+      </w:r>
+      <w:r>
+        <w:t xml:space="preserve"> </w:t>
+      </w:r>
+      <w:r>
+        <w:t xml:space="preserve">blocked. Phase 8 consumed its sole</w:t>
       </w:r>
       <w:r>
         <w:t xml:space="preserve"> </w:t>
@@ -1597,6 +1669,65 @@
         <w:pStyle w:val="BodyText"/>
       </w:pPr>
       <w:r>
+        <w:t xml:space="preserve">A target-blind live receipt audit dated 2026-09-01 tests that operational assumption</w:t>
+      </w:r>
+      <w:r>
+        <w:t xml:space="preserve"> </w:t>
+      </w:r>
+      <w:r>
+        <w:t xml:space="preserve">without changing the historical panel. Its measured result and sample boundary are</w:t>
+      </w:r>
+      <w:r>
+        <w:t xml:space="preserve"> </w:t>
+      </w:r>
+      <w:r>
+        <w:t xml:space="preserve">reported separately in §5.6. It leaves</w:t>
+      </w:r>
+      <w:r>
+        <w:t xml:space="preserve"> </w:t>
+      </w:r>
+      <w:r>
+        <w:rPr>
+          <w:rStyle w:val="VerbatimChar"/>
+        </w:rPr>
+        <w:t xml:space="preserve">created_at</w:t>
+      </w:r>
+      <w:r>
+        <w:t xml:space="preserve"> </w:t>
+      </w:r>
+      <w:r>
+        <w:t xml:space="preserve">as</w:t>
+      </w:r>
+      <w:r>
+        <w:t xml:space="preserve"> </w:t>
+      </w:r>
+      <w:r>
+        <w:rPr>
+          <w:rStyle w:val="VerbatimChar"/>
+        </w:rPr>
+        <w:t xml:space="preserve">PROXY_ONLY</w:t>
+      </w:r>
+      <w:r>
+        <w:t xml:space="preserve">, preserves</w:t>
+      </w:r>
+      <w:r>
+        <w:t xml:space="preserve"> </w:t>
+      </w:r>
+      <w:r>
+        <w:rPr>
+          <w:rStyle w:val="VerbatimChar"/>
+        </w:rPr>
+        <w:t xml:space="preserve">PIT_V22_RECONCILIATION_BLOCKED</w:t>
+      </w:r>
+      <w:r>
+        <w:t xml:space="preserve">, and does not re-score any forecast.</w:t>
+      </w:r>
+    </w:p>
+    <w:p>
+      <w:pPr>
+        <w:pStyle w:val="BodyText"/>
+      </w:pPr>
+      <w:r>
         <w:t xml:space="preserve">Discipline also means repairing data rather than smoothing over it. Two discovery bar</w:t>
       </w:r>
       <w:r>
@@ -2476,7 +2607,7 @@
     </w:p>
     <w:bookmarkEnd w:id="29"/>
     <w:bookmarkEnd w:id="30"/>
-    <w:bookmarkStart w:id="36" w:name="results"/>
+    <w:bookmarkStart w:id="37" w:name="results"/>
     <w:p>
       <w:pPr>
         <w:pStyle w:val="Heading2"/>
@@ -4267,8 +4398,207 @@
       </w:r>
     </w:p>
     <w:bookmarkEnd w:id="35"/>
+    <w:bookmarkStart w:id="36" w:name="X6e833626e53982d286d764d2d0c9743c97746ac"/>
+    <w:p>
+      <w:pPr>
+        <w:pStyle w:val="Heading3"/>
+      </w:pPr>
+      <w:r>
+        <w:t xml:space="preserve">5.6 Operational timing result: the 60-second opening bound</w:t>
+      </w:r>
+    </w:p>
+    <w:p>
+      <w:pPr>
+        <w:pStyle w:val="FirstParagraph"/>
+      </w:pPr>
+      <w:r>
+        <w:t xml:space="preserve">Gate 5 produced a separate target-blind operational timing result; it is not a predictive</w:t>
+      </w:r>
+      <w:r>
+        <w:t xml:space="preserve"> </w:t>
+      </w:r>
+      <w:r>
+        <w:t xml:space="preserve">result and uses no target, forecast or loss. Across all six reconciled sessions,</w:t>
+      </w:r>
+      <w:r>
+        <w:t xml:space="preserve"> </w:t>
+      </w:r>
+      <w:r>
+        <w:t xml:space="preserve">2,418/2,418 live flow alerts had support inside the registered contract window. The</w:t>
+      </w:r>
+      <w:r>
+        <w:t xml:space="preserve"> </w:t>
+      </w:r>
+      <w:r>
+        <w:t xml:space="preserve">receipt-latency distribution preserves the registered exclusion of the 2026-08-21</w:t>
+      </w:r>
+      <w:r>
+        <w:t xml:space="preserve"> </w:t>
+      </w:r>
+      <w:r>
+        <w:t xml:space="preserve">collector-replay anomaly, leaving five clean sessions and 1,768 first valid receipts.</w:t>
+      </w:r>
+    </w:p>
+    <w:p>
+      <w:pPr>
+        <w:pStyle w:val="BodyText"/>
+      </w:pPr>
+      <w:r>
+        <w:t xml:space="preserve">The New York opening hour contains 406 first receipts. Of these, 6/406 (1.48 per cent)</w:t>
+      </w:r>
+      <w:r>
+        <w:t xml:space="preserve"> </w:t>
+      </w:r>
+      <w:r>
+        <w:t xml:space="preserve">arrived more than 60 seconds after</w:t>
+      </w:r>
+      <w:r>
+        <w:t xml:space="preserve"> </w:t>
+      </w:r>
+      <w:r>
+        <w:rPr>
+          <w:rStyle w:val="VerbatimChar"/>
+        </w:rPr>
+        <w:t xml:space="preserve">created_at</w:t>
+      </w:r>
+      <w:r>
+        <w:t xml:space="preserve">; p99 was 60.216898 seconds, and 0/406</w:t>
+      </w:r>
+      <w:r>
+        <w:t xml:space="preserve"> </w:t>
+      </w:r>
+      <w:r>
+        <w:t xml:space="preserve">exceeded 120 seconds. The registered 60-second UW availability buffer therefore does not</w:t>
+      </w:r>
+      <w:r>
+        <w:t xml:space="preserve"> </w:t>
+      </w:r>
+      <w:r>
+        <w:t xml:space="preserve">hold as a strict conservative bound at the NY opening in this sample. The 120-second</w:t>
+      </w:r>
+      <w:r>
+        <w:t xml:space="preserve"> </w:t>
+      </w:r>
+      <w:r>
+        <w:t xml:space="preserve">sensitivity has no opening exceedance, but two of 95 receipts in hour 14 exceeded 120</w:t>
+      </w:r>
+      <w:r>
+        <w:t xml:space="preserve"> </w:t>
+      </w:r>
+      <w:r>
+        <w:t xml:space="preserve">seconds, so it is not a strict all-day bound in the observed sessions.</w:t>
+      </w:r>
+    </w:p>
+    <w:p>
+      <w:pPr>
+        <w:pStyle w:val="BodyText"/>
+      </w:pPr>
+      <w:r>
+        <w:t xml:space="preserve">Five sessions and 406 opening receipts can falsify a zero-exceedance claim in the observed</w:t>
+      </w:r>
+      <w:r>
+        <w:t xml:space="preserve"> </w:t>
+      </w:r>
+      <w:r>
+        <w:t xml:space="preserve">sample; they cannot certify future sessions. The estimand is local</w:t>
+      </w:r>
+      <w:r>
+        <w:t xml:space="preserve"> </w:t>
+      </w:r>
+      <w:r>
+        <w:rPr>
+          <w:rStyle w:val="VerbatimChar"/>
+        </w:rPr>
+        <w:t xml:space="preserve">receipt_utc − created_at</w:t>
+      </w:r>
+      <w:r>
+        <w:t xml:space="preserve">, not provider publication time or historical client receipt.</w:t>
+      </w:r>
+      <w:r>
+        <w:t xml:space="preserve"> </w:t>
+      </w:r>
+      <w:r>
+        <w:t xml:space="preserve">Accordingly,</w:t>
+      </w:r>
+      <w:r>
+        <w:t xml:space="preserve"> </w:t>
+      </w:r>
+      <w:r>
+        <w:rPr>
+          <w:rStyle w:val="VerbatimChar"/>
+        </w:rPr>
+        <w:t xml:space="preserve">created_at</w:t>
+      </w:r>
+      <w:r>
+        <w:t xml:space="preserve"> </w:t>
+      </w:r>
+      <w:r>
+        <w:t xml:space="preserve">remains</w:t>
+      </w:r>
+      <w:r>
+        <w:t xml:space="preserve"> </w:t>
+      </w:r>
+      <w:r>
+        <w:rPr>
+          <w:rStyle w:val="VerbatimChar"/>
+        </w:rPr>
+        <w:t xml:space="preserve">PROXY_ONLY_CROSS_CHANNEL</w:t>
+      </w:r>
+      <w:r>
+        <w:t xml:space="preserve">, backfill and revision remain</w:t>
+      </w:r>
+      <w:r>
+        <w:t xml:space="preserve"> </w:t>
+      </w:r>
+      <w:r>
+        <w:t xml:space="preserve">non-identifiable, and</w:t>
+      </w:r>
+      <w:r>
+        <w:t xml:space="preserve"> </w:t>
+      </w:r>
+      <w:r>
+        <w:rPr>
+          <w:rStyle w:val="VerbatimChar"/>
+        </w:rPr>
+        <w:t xml:space="preserve">PIT_V22_RECONCILIATION_BLOCKED</w:t>
+      </w:r>
+      <w:r>
+        <w:t xml:space="preserve"> </w:t>
+      </w:r>
+      <w:r>
+        <w:t xml:space="preserve">remains in force</w:t>
+      </w:r>
+      <w:r>
+        <w:t xml:space="preserve"> </w:t>
+      </w:r>
+      <w:r>
+        <w:t xml:space="preserve">(</w:t>
+      </w:r>
+      <w:r>
+        <w:rPr>
+          <w:rStyle w:val="VerbatimChar"/>
+        </w:rPr>
+        <w:t xml:space="preserve">artifacts/gate5_pit/uw_latency_campaign_20260901_v2.json</w:t>
+      </w:r>
+      <w:r>
+        <w:t xml:space="preserve">;</w:t>
+      </w:r>
+      <w:r>
+        <w:t xml:space="preserve"> </w:t>
+      </w:r>
+      <w:r>
+        <w:rPr>
+          <w:rStyle w:val="VerbatimChar"/>
+        </w:rPr>
+        <w:t xml:space="preserve">docs/gate5_pit_foundations_v1.md</w:t>
+      </w:r>
+      <w:r>
+        <w:t xml:space="preserve">).</w:t>
+      </w:r>
+    </w:p>
     <w:bookmarkEnd w:id="36"/>
-    <w:bookmarkStart w:id="37" w:name="discussion"/>
+    <w:bookmarkEnd w:id="37"/>
+    <w:bookmarkStart w:id="38" w:name="discussion"/>
     <w:p>
       <w:pPr>
         <w:pStyle w:val="Heading2"/>
@@ -4532,8 +4862,8 @@
         <w:t xml:space="preserve">.</w:t>
       </w:r>
     </w:p>
-    <w:bookmarkEnd w:id="37"/>
-    <w:bookmarkStart w:id="38" w:name="threats-to-validity"/>
+    <w:bookmarkEnd w:id="38"/>
+    <w:bookmarkStart w:id="39" w:name="threats-to-validity"/>
     <w:p>
       <w:pPr>
         <w:pStyle w:val="Heading2"/>
@@ -4849,6 +5179,44 @@
         <w:pStyle w:val="BodyText"/>
       </w:pPr>
       <w:r>
+        <w:t xml:space="preserve">That availability threat is now measured rather than merely asserted. The five-session</w:t>
+      </w:r>
+      <w:r>
+        <w:t xml:space="preserve"> </w:t>
+      </w:r>
+      <w:r>
+        <w:t xml:space="preserve">receipt audit falsifies a zero-exceedance interpretation of the 60-second opening buffer,</w:t>
+      </w:r>
+      <w:r>
+        <w:t xml:space="preserve"> </w:t>
+      </w:r>
+      <w:r>
+        <w:t xml:space="preserve">but its short span cannot identify a future-session tail probability, and the separate</w:t>
+      </w:r>
+      <w:r>
+        <w:t xml:space="preserve"> </w:t>
+      </w:r>
+      <w:r>
+        <w:t xml:space="preserve">cross-channel design still cannot identify backfill or revision. The absence of opening</w:t>
+      </w:r>
+      <w:r>
+        <w:t xml:space="preserve"> </w:t>
+      </w:r>
+      <w:r>
+        <w:t xml:space="preserve">exceedances beyond 120 seconds is therefore a bounded sample result, not proof of a</w:t>
+      </w:r>
+      <w:r>
+        <w:t xml:space="preserve"> </w:t>
+      </w:r>
+      <w:r>
+        <w:t xml:space="preserve">universal provider-latency guarantee.</w:t>
+      </w:r>
+    </w:p>
+    <w:p>
+      <w:pPr>
+        <w:pStyle w:val="BodyText"/>
+      </w:pPr>
+      <w:r>
         <w:t xml:space="preserve">Finally, the chronological separation limits what the validation null can mean. It</w:t>
       </w:r>
       <w:r>
@@ -4908,8 +5276,8 @@
         <w:t xml:space="preserve">historical one-shot execution. It supports a robustness interpretation only.</w:t>
       </w:r>
     </w:p>
-    <w:bookmarkEnd w:id="38"/>
-    <w:bookmarkStart w:id="40" w:name="conclusion-and-contribution"/>
+    <w:bookmarkEnd w:id="39"/>
+    <w:bookmarkStart w:id="41" w:name="conclusion-and-contribution"/>
     <w:p>
       <w:pPr>
         <w:pStyle w:val="Heading2"/>
@@ -4991,13 +5359,31 @@
         <w:t xml:space="preserve"> </w:t>
       </w:r>
       <w:r>
-        <w:t xml:space="preserve">observe. The remaining PIT v2.2 blocker is part of the result, not something concealed by</w:t>
-      </w:r>
-      <w:r>
-        <w:t xml:space="preserve"> </w:t>
-      </w:r>
-      <w:r>
-        <w:t xml:space="preserve">a headline. Phase 8 is complete and exploratory; its corrected same-session sensitivity</w:t>
+        <w:t xml:space="preserve">observe. That machinery produced a substantive negative methodological result: the</w:t>
+      </w:r>
+      <w:r>
+        <w:t xml:space="preserve"> </w:t>
+      </w:r>
+      <w:r>
+        <w:t xml:space="preserve">60-second UW availability buffer is not a strict conservative opening bound in the five</w:t>
+      </w:r>
+      <w:r>
+        <w:t xml:space="preserve"> </w:t>
+      </w:r>
+      <w:r>
+        <w:t xml:space="preserve">clean sessions, while the 120-second opening sensitivity remains sample-bounded rather</w:t>
+      </w:r>
+      <w:r>
+        <w:t xml:space="preserve"> </w:t>
+      </w:r>
+      <w:r>
+        <w:t xml:space="preserve">than provider-certified. The remaining PIT v2.2 blocker is part of the result, not</w:t>
+      </w:r>
+      <w:r>
+        <w:t xml:space="preserve"> </w:t>
+      </w:r>
+      <w:r>
+        <w:t xml:space="preserve">something concealed by a headline. Phase 8 is complete and exploratory; its corrected same-session sensitivity</w:t>
       </w:r>
       <w:r>
         <w:t xml:space="preserve"> </w:t>
@@ -5024,7 +5410,7 @@
         <w:t xml:space="preserve">its editorial cutoff.</w:t>
       </w:r>
     </w:p>
-    <w:bookmarkStart w:id="39" w:name="Xebdc92d4acd8b8d67c9f3fe0f9867e95cc7704d"/>
+    <w:bookmarkStart w:id="40" w:name="Xebdc92d4acd8b8d67c9f3fe0f9867e95cc7704d"/>
     <w:p>
       <w:pPr>
         <w:pStyle w:val="Heading3"/>
@@ -5182,9 +5568,9 @@
         <w:t xml:space="preserve">publication with the same prominence as a positive.</w:t>
       </w:r>
     </w:p>
-    <w:bookmarkEnd w:id="39"/>
     <w:bookmarkEnd w:id="40"/>
-    <w:bookmarkStart w:id="41" w:name="ethics-and-reproducibility"/>
+    <w:bookmarkEnd w:id="41"/>
+    <w:bookmarkStart w:id="42" w:name="ethics-and-reproducibility"/>
     <w:p>
       <w:pPr>
         <w:pStyle w:val="Heading2"/>
@@ -5237,8 +5623,8 @@
         <w:t xml:space="preserve">report.</w:t>
       </w:r>
     </w:p>
-    <w:bookmarkEnd w:id="41"/>
-    <w:bookmarkStart w:id="42" w:name="appendices"/>
+    <w:bookmarkEnd w:id="42"/>
+    <w:bookmarkStart w:id="43" w:name="appendices"/>
     <w:p>
       <w:pPr>
         <w:pStyle w:val="Heading2"/>
@@ -5250,297 +5636,182 @@
     <w:p>
       <w:pPr>
         <w:pStyle w:val="FirstParagraph"/>
-        <w:spacing w:before="0" w:after="0" w:line="240" w:lineRule="auto"/>
-      </w:pPr>
-      <w:r>
-        <w:rPr>
-          <w:sz w:val="21"/>
-        </w:rPr>
+      </w:pPr>
+      <w:r>
         <w:t xml:space="preserve">A. Campaign register and contrast tables (</w:t>
       </w:r>
       <w:r>
         <w:rPr>
           <w:rStyle w:val="VerbatimChar"/>
-          <w:sz w:val="21"/>
         </w:rPr>
         <w:t xml:space="preserve">docs/results_reconciliation_v2.md</w:t>
       </w:r>
       <w:r>
-        <w:rPr>
-          <w:sz w:val="21"/>
-        </w:rPr>
         <w:t xml:space="preserve">).</w:t>
       </w:r>
       <w:r>
-        <w:rPr>
-          <w:sz w:val="21"/>
-        </w:rPr>
-        <w:t xml:space="preserve"> </w:t>
-      </w:r>
-      <w:r>
-        <w:rPr>
-          <w:sz w:val="21"/>
-        </w:rPr>
+        <w:t xml:space="preserve"> </w:t>
+      </w:r>
+      <w:r>
         <w:t xml:space="preserve">B. Studentized inference tables (</w:t>
       </w:r>
       <w:r>
         <w:rPr>
           <w:rStyle w:val="VerbatimChar"/>
-          <w:sz w:val="21"/>
         </w:rPr>
         <w:t xml:space="preserve">artifacts/gate1_inference/</w:t>
       </w:r>
       <w:r>
-        <w:rPr>
-          <w:sz w:val="21"/>
-        </w:rPr>
         <w:t xml:space="preserve">).</w:t>
       </w:r>
       <w:r>
-        <w:rPr>
-          <w:sz w:val="21"/>
-        </w:rPr>
-        <w:t xml:space="preserve"> </w:t>
-      </w:r>
-      <w:r>
-        <w:rPr>
-          <w:sz w:val="21"/>
-        </w:rPr>
+        <w:t xml:space="preserve"> </w:t>
+      </w:r>
+      <w:r>
         <w:t xml:space="preserve">C. Gate reports 1–12 (</w:t>
       </w:r>
       <w:r>
         <w:rPr>
           <w:rStyle w:val="VerbatimChar"/>
-          <w:sz w:val="21"/>
         </w:rPr>
         <w:t xml:space="preserve">docs/INDEX.md</w:t>
       </w:r>
       <w:r>
-        <w:rPr>
-          <w:sz w:val="21"/>
-        </w:rPr>
         <w:t xml:space="preserve">).</w:t>
       </w:r>
       <w:r>
-        <w:rPr>
-          <w:sz w:val="21"/>
-        </w:rPr>
-        <w:t xml:space="preserve"> </w:t>
-      </w:r>
-      <w:r>
-        <w:rPr>
-          <w:sz w:val="21"/>
-        </w:rPr>
+        <w:t xml:space="preserve"> </w:t>
+      </w:r>
+      <w:r>
         <w:t xml:space="preserve">D. Economic-significance tables (</w:t>
       </w:r>
       <w:r>
         <w:rPr>
           <w:rStyle w:val="VerbatimChar"/>
-          <w:sz w:val="21"/>
         </w:rPr>
         <w:t xml:space="preserve">artifacts/economic_significance/</w:t>
       </w:r>
       <w:r>
-        <w:rPr>
-          <w:sz w:val="21"/>
-        </w:rPr>
         <w:t xml:space="preserve">).</w:t>
       </w:r>
       <w:r>
-        <w:rPr>
-          <w:sz w:val="21"/>
-        </w:rPr>
-        <w:t xml:space="preserve"> </w:t>
-      </w:r>
-      <w:r>
-        <w:rPr>
-          <w:sz w:val="21"/>
-        </w:rPr>
+        <w:t xml:space="preserve"> </w:t>
+      </w:r>
+      <w:r>
         <w:t xml:space="preserve">E. Preregistration, freeze and target-blind planning hashes (Phase 9 freeze</w:t>
       </w:r>
       <w:r>
-        <w:rPr>
-          <w:sz w:val="21"/>
-        </w:rPr>
-        <w:t xml:space="preserve"> </w:t>
-      </w:r>
-      <w:r>
-        <w:rPr>
-          <w:rStyle w:val="VerbatimChar"/>
-          <w:sz w:val="21"/>
+        <w:t xml:space="preserve"> </w:t>
+      </w:r>
+      <w:r>
+        <w:rPr>
+          <w:rStyle w:val="VerbatimChar"/>
         </w:rPr>
         <w:t xml:space="preserve">artifacts/phase9/protocol_freeze.json</w:t>
       </w:r>
       <w:r>
-        <w:rPr>
-          <w:sz w:val="21"/>
-        </w:rPr>
         <w:t xml:space="preserve">; corrected power/deadline audit</w:t>
       </w:r>
       <w:r>
-        <w:rPr>
-          <w:sz w:val="21"/>
-        </w:rPr>
-        <w:t xml:space="preserve"> </w:t>
-      </w:r>
-      <w:r>
-        <w:rPr>
-          <w:rStyle w:val="VerbatimChar"/>
-          <w:sz w:val="21"/>
+        <w:t xml:space="preserve"> </w:t>
+      </w:r>
+      <w:r>
+        <w:rPr>
+          <w:rStyle w:val="VerbatimChar"/>
         </w:rPr>
         <w:t xml:space="preserve">artifacts/phase9/power_deadline_audit_v1.json</w:t>
       </w:r>
       <w:r>
-        <w:rPr>
-          <w:sz w:val="21"/>
-        </w:rPr>
         <w:t xml:space="preserve">).</w:t>
       </w:r>
       <w:r>
-        <w:rPr>
-          <w:sz w:val="21"/>
-        </w:rPr>
-        <w:t xml:space="preserve"> </w:t>
-      </w:r>
-      <w:r>
-        <w:rPr>
-          <w:sz w:val="21"/>
-        </w:rPr>
+        <w:t xml:space="preserve"> </w:t>
+      </w:r>
+      <w:r>
         <w:t xml:space="preserve">F. Supervisor feedback mapping, restricted to source-verified comments; unverified</w:t>
       </w:r>
       <w:r>
-        <w:rPr>
-          <w:sz w:val="21"/>
-        </w:rPr>
-        <w:t xml:space="preserve"> </w:t>
-      </w:r>
-      <w:r>
-        <w:rPr>
-          <w:sz w:val="21"/>
-        </w:rPr>
+        <w:t xml:space="preserve"> </w:t>
+      </w:r>
+      <w:r>
         <w:t xml:space="preserve">paraphrases are excluded.</w:t>
       </w:r>
       <w:r>
-        <w:rPr>
-          <w:sz w:val="21"/>
-        </w:rPr>
-        <w:t xml:space="preserve"> </w:t>
-      </w:r>
-      <w:r>
-        <w:rPr>
-          <w:sz w:val="21"/>
-        </w:rPr>
+        <w:t xml:space="preserve"> </w:t>
+      </w:r>
+      <w:r>
         <w:t xml:space="preserve">G. Primary run artifacts (</w:t>
       </w:r>
       <w:r>
         <w:rPr>
           <w:rStyle w:val="VerbatimChar"/>
-          <w:sz w:val="21"/>
         </w:rPr>
         <w:t xml:space="preserve">artifacts/rp2_v3/rp2-v3-20260831-b1-spot-cutoff-remediation/</w:t>
       </w:r>
       <w:r>
-        <w:rPr>
-          <w:sz w:val="21"/>
-        </w:rPr>
         <w:t xml:space="preserve">:</w:t>
       </w:r>
       <w:r>
-        <w:rPr>
-          <w:sz w:val="21"/>
-        </w:rPr>
-        <w:t xml:space="preserve"> </w:t>
-      </w:r>
-      <w:r>
-        <w:rPr>
-          <w:rStyle w:val="VerbatimChar"/>
-          <w:sz w:val="21"/>
+        <w:t xml:space="preserve"> </w:t>
+      </w:r>
+      <w:r>
+        <w:rPr>
+          <w:rStyle w:val="VerbatimChar"/>
         </w:rPr>
         <w:t xml:space="preserve">scorecard.md</w:t>
       </w:r>
       <w:r>
-        <w:rPr>
-          <w:sz w:val="21"/>
-        </w:rPr>
         <w:t xml:space="preserve">,</w:t>
       </w:r>
       <w:r>
-        <w:rPr>
-          <w:sz w:val="21"/>
-        </w:rPr>
-        <w:t xml:space="preserve"> </w:t>
-      </w:r>
-      <w:r>
-        <w:rPr>
-          <w:rStyle w:val="VerbatimChar"/>
-          <w:sz w:val="21"/>
+        <w:t xml:space="preserve"> </w:t>
+      </w:r>
+      <w:r>
+        <w:rPr>
+          <w:rStyle w:val="VerbatimChar"/>
         </w:rPr>
         <w:t xml:space="preserve">rp2_block8_ladder/ladder.json</w:t>
       </w:r>
       <w:r>
-        <w:rPr>
-          <w:sz w:val="21"/>
-        </w:rPr>
         <w:t xml:space="preserve">,</w:t>
       </w:r>
       <w:r>
-        <w:rPr>
-          <w:sz w:val="21"/>
-        </w:rPr>
-        <w:t xml:space="preserve"> </w:t>
-      </w:r>
-      <w:r>
-        <w:rPr>
-          <w:rStyle w:val="VerbatimChar"/>
-          <w:sz w:val="21"/>
+        <w:t xml:space="preserve"> </w:t>
+      </w:r>
+      <w:r>
+        <w:rPr>
+          <w:rStyle w:val="VerbatimChar"/>
         </w:rPr>
         <w:t xml:space="preserve">rp2_block10_inference/inference.json</w:t>
       </w:r>
       <w:r>
-        <w:rPr>
-          <w:sz w:val="21"/>
-        </w:rPr>
         <w:t xml:space="preserve">,</w:t>
       </w:r>
       <w:r>
-        <w:rPr>
-          <w:sz w:val="21"/>
-        </w:rPr>
-        <w:t xml:space="preserve"> </w:t>
-      </w:r>
-      <w:r>
-        <w:rPr>
-          <w:rStyle w:val="VerbatimChar"/>
-          <w:sz w:val="21"/>
+        <w:t xml:space="preserve"> </w:t>
+      </w:r>
+      <w:r>
+        <w:rPr>
+          <w:rStyle w:val="VerbatimChar"/>
         </w:rPr>
         <w:t xml:space="preserve">run_identity.json</w:t>
       </w:r>
       <w:r>
-        <w:rPr>
-          <w:sz w:val="21"/>
-        </w:rPr>
         <w:t xml:space="preserve">) and the run verdict (</w:t>
       </w:r>
       <w:r>
         <w:rPr>
           <w:rStyle w:val="VerbatimChar"/>
-          <w:sz w:val="21"/>
         </w:rPr>
         <w:t xml:space="preserve">docs/rp2_v3/VERDICT.md</w:t>
       </w:r>
       <w:r>
-        <w:rPr>
-          <w:sz w:val="21"/>
-        </w:rPr>
         <w:t xml:space="preserve">).</w:t>
       </w:r>
     </w:p>
-    <w:bookmarkEnd w:id="42"/>
     <w:bookmarkEnd w:id="43"/>
-    <w:sectPr>
-      <w:pgSz w:w="12240" w:h="15840"/>
-      <w:pgMar w:top="1440" w:bottom="1440" w:left="1440" w:right="1440"/>
-    </w:sectPr>
+    <w:bookmarkEnd w:id="44"/>
+    <w:sectPr/>
   </w:body>
 </w:document>
 </file>
@@ -6150,7 +6421,7 @@
       <w:color w:themeColor="accent1" w:themeShade="BF" w:val="365F91"/>
     </w:rPr>
   </w:style>
-  <w:style w:customStyle="1" w:styleId="SourceCode" w:type="paragraph">
+  <w:style w:type="paragraph" w:customStyle="1" w:styleId="SourceCode">
     <w:name w:val="Source Code"/>
     <w:basedOn w:val="Normal"/>
     <w:link w:val="VerbatimChar"/>
@@ -6158,7 +6429,7 @@
       <w:wordWrap w:val="off"/>
     </w:pPr>
   </w:style>
-  <w:style w:customStyle="1" w:styleId="KeywordTok" w:type="character">
+  <w:style w:type="character" w:customStyle="1" w:styleId="KeywordTok">
     <w:name w:val="KeywordTok"/>
     <w:basedOn w:val="VerbatimChar"/>
     <w:rPr>
@@ -6166,77 +6437,77 @@
       <w:b/>
     </w:rPr>
   </w:style>
-  <w:style w:customStyle="1" w:styleId="DataTypeTok" w:type="character">
+  <w:style w:type="character" w:customStyle="1" w:styleId="DataTypeTok">
     <w:name w:val="DataTypeTok"/>
     <w:basedOn w:val="VerbatimChar"/>
     <w:rPr>
       <w:color w:val="902000"/>
     </w:rPr>
   </w:style>
-  <w:style w:customStyle="1" w:styleId="DecValTok" w:type="character">
+  <w:style w:type="character" w:customStyle="1" w:styleId="DecValTok">
     <w:name w:val="DecValTok"/>
     <w:basedOn w:val="VerbatimChar"/>
     <w:rPr>
       <w:color w:val="40a070"/>
     </w:rPr>
   </w:style>
-  <w:style w:customStyle="1" w:styleId="BaseNTok" w:type="character">
+  <w:style w:type="character" w:customStyle="1" w:styleId="BaseNTok">
     <w:name w:val="BaseNTok"/>
     <w:basedOn w:val="VerbatimChar"/>
     <w:rPr>
       <w:color w:val="40a070"/>
     </w:rPr>
   </w:style>
-  <w:style w:customStyle="1" w:styleId="FloatTok" w:type="character">
+  <w:style w:type="character" w:customStyle="1" w:styleId="FloatTok">
     <w:name w:val="FloatTok"/>
     <w:basedOn w:val="VerbatimChar"/>
     <w:rPr>
       <w:color w:val="40a070"/>
     </w:rPr>
   </w:style>
-  <w:style w:customStyle="1" w:styleId="ConstantTok" w:type="character">
+  <w:style w:type="character" w:customStyle="1" w:styleId="ConstantTok">
     <w:name w:val="ConstantTok"/>
     <w:basedOn w:val="VerbatimChar"/>
     <w:rPr>
       <w:color w:val="880000"/>
     </w:rPr>
   </w:style>
-  <w:style w:customStyle="1" w:styleId="CharTok" w:type="character">
+  <w:style w:type="character" w:customStyle="1" w:styleId="CharTok">
     <w:name w:val="CharTok"/>
     <w:basedOn w:val="VerbatimChar"/>
     <w:rPr>
       <w:color w:val="4070a0"/>
     </w:rPr>
   </w:style>
-  <w:style w:customStyle="1" w:styleId="SpecialCharTok" w:type="character">
+  <w:style w:type="character" w:customStyle="1" w:styleId="SpecialCharTok">
     <w:name w:val="SpecialCharTok"/>
     <w:basedOn w:val="VerbatimChar"/>
     <w:rPr>
       <w:color w:val="4070a0"/>
     </w:rPr>
   </w:style>
-  <w:style w:customStyle="1" w:styleId="StringTok" w:type="character">
+  <w:style w:type="character" w:customStyle="1" w:styleId="StringTok">
     <w:name w:val="StringTok"/>
     <w:basedOn w:val="VerbatimChar"/>
     <w:rPr>
       <w:color w:val="4070a0"/>
     </w:rPr>
   </w:style>
-  <w:style w:customStyle="1" w:styleId="VerbatimStringTok" w:type="character">
+  <w:style w:type="character" w:customStyle="1" w:styleId="VerbatimStringTok">
     <w:name w:val="VerbatimStringTok"/>
     <w:basedOn w:val="VerbatimChar"/>
     <w:rPr>
       <w:color w:val="4070a0"/>
     </w:rPr>
   </w:style>
-  <w:style w:customStyle="1" w:styleId="SpecialStringTok" w:type="character">
+  <w:style w:type="character" w:customStyle="1" w:styleId="SpecialStringTok">
     <w:name w:val="SpecialStringTok"/>
     <w:basedOn w:val="VerbatimChar"/>
     <w:rPr>
       <w:color w:val="bb6688"/>
     </w:rPr>
   </w:style>
-  <w:style w:customStyle="1" w:styleId="ImportTok" w:type="character">
+  <w:style w:type="character" w:customStyle="1" w:styleId="ImportTok">
     <w:name w:val="ImportTok"/>
     <w:basedOn w:val="VerbatimChar"/>
     <w:rPr>
@@ -6244,7 +6515,7 @@
       <w:b/>
     </w:rPr>
   </w:style>
-  <w:style w:customStyle="1" w:styleId="CommentTok" w:type="character">
+  <w:style w:type="character" w:customStyle="1" w:styleId="CommentTok">
     <w:name w:val="CommentTok"/>
     <w:basedOn w:val="VerbatimChar"/>
     <w:rPr>
@@ -6252,7 +6523,7 @@
       <w:i/>
     </w:rPr>
   </w:style>
-  <w:style w:customStyle="1" w:styleId="DocumentationTok" w:type="character">
+  <w:style w:type="character" w:customStyle="1" w:styleId="DocumentationTok">
     <w:name w:val="DocumentationTok"/>
     <w:basedOn w:val="VerbatimChar"/>
     <w:rPr>
@@ -6260,7 +6531,7 @@
       <w:i/>
     </w:rPr>
   </w:style>
-  <w:style w:customStyle="1" w:styleId="AnnotationTok" w:type="character">
+  <w:style w:type="character" w:customStyle="1" w:styleId="AnnotationTok">
     <w:name w:val="AnnotationTok"/>
     <w:basedOn w:val="VerbatimChar"/>
     <w:rPr>
@@ -6269,7 +6540,7 @@
       <w:i/>
     </w:rPr>
   </w:style>
-  <w:style w:customStyle="1" w:styleId="CommentVarTok" w:type="character">
+  <w:style w:type="character" w:customStyle="1" w:styleId="CommentVarTok">
     <w:name w:val="CommentVarTok"/>
     <w:basedOn w:val="VerbatimChar"/>
     <w:rPr>
@@ -6278,28 +6549,28 @@
       <w:i/>
     </w:rPr>
   </w:style>
-  <w:style w:customStyle="1" w:styleId="OtherTok" w:type="character">
+  <w:style w:type="character" w:customStyle="1" w:styleId="OtherTok">
     <w:name w:val="OtherTok"/>
     <w:basedOn w:val="VerbatimChar"/>
     <w:rPr>
       <w:color w:val="007020"/>
     </w:rPr>
   </w:style>
-  <w:style w:customStyle="1" w:styleId="FunctionTok" w:type="character">
+  <w:style w:type="character" w:customStyle="1" w:styleId="FunctionTok">
     <w:name w:val="FunctionTok"/>
     <w:basedOn w:val="VerbatimChar"/>
     <w:rPr>
       <w:color w:val="06287e"/>
     </w:rPr>
   </w:style>
-  <w:style w:customStyle="1" w:styleId="VariableTok" w:type="character">
+  <w:style w:type="character" w:customStyle="1" w:styleId="VariableTok">
     <w:name w:val="VariableTok"/>
     <w:basedOn w:val="VerbatimChar"/>
     <w:rPr>
       <w:color w:val="19177c"/>
     </w:rPr>
   </w:style>
-  <w:style w:customStyle="1" w:styleId="ControlFlowTok" w:type="character">
+  <w:style w:type="character" w:customStyle="1" w:styleId="ControlFlowTok">
     <w:name w:val="ControlFlowTok"/>
     <w:basedOn w:val="VerbatimChar"/>
     <w:rPr>
@@ -6307,45 +6578,45 @@
       <w:b/>
     </w:rPr>
   </w:style>
-  <w:style w:customStyle="1" w:styleId="OperatorTok" w:type="character">
+  <w:style w:type="character" w:customStyle="1" w:styleId="OperatorTok">
     <w:name w:val="OperatorTok"/>
     <w:basedOn w:val="VerbatimChar"/>
     <w:rPr>
       <w:color w:val="666666"/>
     </w:rPr>
   </w:style>
-  <w:style w:customStyle="1" w:styleId="BuiltInTok" w:type="character">
+  <w:style w:type="character" w:customStyle="1" w:styleId="BuiltInTok">
     <w:name w:val="BuiltInTok"/>
     <w:basedOn w:val="VerbatimChar"/>
     <w:rPr>
       <w:color w:val="008000"/>
     </w:rPr>
   </w:style>
-  <w:style w:customStyle="1" w:styleId="ExtensionTok" w:type="character">
+  <w:style w:type="character" w:customStyle="1" w:styleId="ExtensionTok">
     <w:name w:val="ExtensionTok"/>
     <w:basedOn w:val="VerbatimChar"/>
     <w:rPr/>
   </w:style>
-  <w:style w:customStyle="1" w:styleId="PreprocessorTok" w:type="character">
+  <w:style w:type="character" w:customStyle="1" w:styleId="PreprocessorTok">
     <w:name w:val="PreprocessorTok"/>
     <w:basedOn w:val="VerbatimChar"/>
     <w:rPr>
       <w:color w:val="bc7a00"/>
     </w:rPr>
   </w:style>
-  <w:style w:customStyle="1" w:styleId="AttributeTok" w:type="character">
+  <w:style w:type="character" w:customStyle="1" w:styleId="AttributeTok">
     <w:name w:val="AttributeTok"/>
     <w:basedOn w:val="VerbatimChar"/>
     <w:rPr>
       <w:color w:val="7d9029"/>
     </w:rPr>
   </w:style>
-  <w:style w:customStyle="1" w:styleId="RegionMarkerTok" w:type="character">
+  <w:style w:type="character" w:customStyle="1" w:styleId="RegionMarkerTok">
     <w:name w:val="RegionMarkerTok"/>
     <w:basedOn w:val="VerbatimChar"/>
     <w:rPr/>
   </w:style>
-  <w:style w:customStyle="1" w:styleId="InformationTok" w:type="character">
+  <w:style w:type="character" w:customStyle="1" w:styleId="InformationTok">
     <w:name w:val="InformationTok"/>
     <w:basedOn w:val="VerbatimChar"/>
     <w:rPr>
@@ -6354,7 +6625,7 @@
       <w:i/>
     </w:rPr>
   </w:style>
-  <w:style w:customStyle="1" w:styleId="WarningTok" w:type="character">
+  <w:style w:type="character" w:customStyle="1" w:styleId="WarningTok">
     <w:name w:val="WarningTok"/>
     <w:basedOn w:val="VerbatimChar"/>
     <w:rPr>
@@ -6363,7 +6634,7 @@
       <w:i/>
     </w:rPr>
   </w:style>
-  <w:style w:customStyle="1" w:styleId="AlertTok" w:type="character">
+  <w:style w:type="character" w:customStyle="1" w:styleId="AlertTok">
     <w:name w:val="AlertTok"/>
     <w:basedOn w:val="VerbatimChar"/>
     <w:rPr>
@@ -6371,7 +6642,7 @@
       <w:b/>
     </w:rPr>
   </w:style>
-  <w:style w:customStyle="1" w:styleId="ErrorTok" w:type="character">
+  <w:style w:type="character" w:customStyle="1" w:styleId="ErrorTok">
     <w:name w:val="ErrorTok"/>
     <w:basedOn w:val="VerbatimChar"/>
     <w:rPr>
@@ -6379,7 +6650,7 @@
       <w:b/>
     </w:rPr>
   </w:style>
-  <w:style w:customStyle="1" w:styleId="NormalTok" w:type="character">
+  <w:style w:type="character" w:customStyle="1" w:styleId="NormalTok">
     <w:name w:val="NormalTok"/>
     <w:basedOn w:val="VerbatimChar"/>
     <w:rPr/>

</xml_diff>

<commit_message>
docs: propagate UW opening latency finding (#53)
Co-authored-by: Miguel Guerrero <mguerrero896@users.noreply.github.com>
</commit_message>
<xml_diff>
--- a/reports/final_report_draft_v2.docx
+++ b/reports/final_report_draft_v2.docx
@@ -2,7 +2,7 @@
 <file path=word/document.xml><?xml version="1.0" encoding="utf-8"?>
 <w:document xmlns:w="http://schemas.openxmlformats.org/wordprocessingml/2006/main" xmlns:m="http://schemas.openxmlformats.org/officeDocument/2006/math" xmlns:r="http://schemas.openxmlformats.org/officeDocument/2006/relationships" xmlns:o="urn:schemas-microsoft-com:office:office" xmlns:v="urn:schemas-microsoft-com:vml" xmlns:w10="urn:schemas-microsoft-com:office:word" xmlns:a="http://schemas.openxmlformats.org/drawingml/2006/main" xmlns:pic="http://schemas.openxmlformats.org/drawingml/2006/picture" xmlns:wp="http://schemas.openxmlformats.org/drawingml/2006/wordprocessingDrawing">
   <w:body>
-    <w:bookmarkStart w:id="43" w:name="X38984083efee9680b21f1536dd8294d72ad0f10"/>
+    <w:bookmarkStart w:id="44" w:name="X38984083efee9680b21f1536dd8294d72ad0f10"/>
     <w:p>
       <w:pPr>
         <w:pStyle w:val="Heading1"/>
@@ -20,7 +20,7 @@
           <w:bCs/>
           <w:b/>
         </w:rPr>
-        <w:t xml:space="preserve">Capstone report — evidence-cutoff version (2026-08-31)</w:t>
+        <w:t xml:space="preserve">Capstone report — scientific-result cutoff 2026-08-31; timing amendment 2026-09-01</w:t>
       </w:r>
     </w:p>
     <w:p>
@@ -196,49 +196,67 @@
         <w:t xml:space="preserve">govern if a dated narrative disagrees.</w:t>
       </w:r>
     </w:p>
-    <w:bookmarkStart w:id="20" w:name="title-page"/>
-    <w:p>
-      <w:pPr>
-        <w:pStyle w:val="Heading2"/>
-      </w:pPr>
-      <w:r>
-        <w:t xml:space="preserve">Title page</w:t>
-      </w:r>
-    </w:p>
-    <w:p>
-      <w:pPr>
-        <w:pStyle w:val="FirstParagraph"/>
+    <w:p>
+      <w:pPr>
+        <w:pStyle w:val="BlockText"/>
       </w:pPr>
       <w:r>
         <w:rPr>
           <w:bCs/>
           <w:b/>
         </w:rPr>
-        <w:t xml:space="preserve">Title:</w:t>
-      </w:r>
-      <w:r>
-        <w:t xml:space="preserve"> </w:t>
-      </w:r>
-      <w:r>
-        <w:t xml:space="preserve">Point-in-time options information for forecasting next-30-minute realised variance</w:t>
-      </w:r>
-    </w:p>
-    <w:p>
-      <w:pPr>
-        <w:pStyle w:val="BodyText"/>
+        <w:t xml:space="preserve">Methodological timing amendment (2026-09-01).</w:t>
+      </w:r>
+      <w:r>
+        <w:t xml:space="preserve"> </w:t>
+      </w:r>
+      <w:r>
+        <w:t xml:space="preserve">The predictive-result cutoff above</w:t>
+      </w:r>
+      <w:r>
+        <w:t xml:space="preserve"> </w:t>
+      </w:r>
+      <w:r>
+        <w:t xml:space="preserve">is unchanged. A later target-blind UW receipt-latency snapshot is included only to</w:t>
+      </w:r>
+      <w:r>
+        <w:t xml:space="preserve"> </w:t>
+      </w:r>
+      <w:r>
+        <w:t xml:space="preserve">correct the operational-availability limitation in §§3, 7 and 8. It changes no panel,</w:t>
+      </w:r>
+      <w:r>
+        <w:t xml:space="preserve"> </w:t>
+      </w:r>
+      <w:r>
+        <w:t xml:space="preserve">mask, estimate, interval or verdict and reads no sealed outcome cohort.</w:t>
+      </w:r>
+    </w:p>
+    <w:bookmarkStart w:id="20" w:name="title-page"/>
+    <w:p>
+      <w:pPr>
+        <w:pStyle w:val="Heading2"/>
+      </w:pPr>
+      <w:r>
+        <w:t xml:space="preserve">Title page</w:t>
+      </w:r>
+    </w:p>
+    <w:p>
+      <w:pPr>
+        <w:pStyle w:val="FirstParagraph"/>
       </w:pPr>
       <w:r>
         <w:rPr>
           <w:bCs/>
           <w:b/>
         </w:rPr>
-        <w:t xml:space="preserve">Author:</w:t>
-      </w:r>
-      <w:r>
-        <w:t xml:space="preserve"> </w:t>
-      </w:r>
-      <w:r>
-        <w:t xml:space="preserve">Miguel Guerrero Quijano</w:t>
+        <w:t xml:space="preserve">Title:</w:t>
+      </w:r>
+      <w:r>
+        <w:t xml:space="preserve"> </w:t>
+      </w:r>
+      <w:r>
+        <w:t xml:space="preserve">Point-in-time options information for forecasting next-30-minute realised variance</w:t>
       </w:r>
     </w:p>
     <w:p>
@@ -250,13 +268,13 @@
           <w:bCs/>
           <w:b/>
         </w:rPr>
-        <w:t xml:space="preserve">Course:</w:t>
-      </w:r>
-      <w:r>
-        <w:t xml:space="preserve"> </w:t>
-      </w:r>
-      <w:r>
-        <w:t xml:space="preserve">MDS650 Capstone Research Project</w:t>
+        <w:t xml:space="preserve">Author:</w:t>
+      </w:r>
+      <w:r>
+        <w:t xml:space="preserve"> </w:t>
+      </w:r>
+      <w:r>
+        <w:t xml:space="preserve">Miguel Guerrero Quijano</w:t>
       </w:r>
     </w:p>
     <w:p>
@@ -268,13 +286,13 @@
           <w:bCs/>
           <w:b/>
         </w:rPr>
-        <w:t xml:space="preserve">Document:</w:t>
-      </w:r>
-      <w:r>
-        <w:t xml:space="preserve"> </w:t>
-      </w:r>
-      <w:r>
-        <w:t xml:space="preserve">Capstone report, evidence-cutoff version</w:t>
+        <w:t xml:space="preserve">Course:</w:t>
+      </w:r>
+      <w:r>
+        <w:t xml:space="preserve"> </w:t>
+      </w:r>
+      <w:r>
+        <w:t xml:space="preserve">MDS650 Capstone Research Project</w:t>
       </w:r>
     </w:p>
     <w:p>
@@ -286,6 +304,24 @@
           <w:bCs/>
           <w:b/>
         </w:rPr>
+        <w:t xml:space="preserve">Document:</w:t>
+      </w:r>
+      <w:r>
+        <w:t xml:space="preserve"> </w:t>
+      </w:r>
+      <w:r>
+        <w:t xml:space="preserve">Capstone report, evidence-cutoff version</w:t>
+      </w:r>
+    </w:p>
+    <w:p>
+      <w:pPr>
+        <w:pStyle w:val="BodyText"/>
+      </w:pPr>
+      <w:r>
+        <w:rPr>
+          <w:bCs/>
+          <w:b/>
+        </w:rPr>
         <w:t xml:space="preserve">Evidence cutoff:</w:t>
       </w:r>
       <w:r>
@@ -293,6 +329,24 @@
       </w:r>
       <w:r>
         <w:t xml:space="preserve">31 August 2026 (Australia/Sydney)</w:t>
+      </w:r>
+    </w:p>
+    <w:p>
+      <w:pPr>
+        <w:pStyle w:val="BodyText"/>
+      </w:pPr>
+      <w:r>
+        <w:rPr>
+          <w:bCs/>
+          <w:b/>
+        </w:rPr>
+        <w:t xml:space="preserve">Methodological timing amendment:</w:t>
+      </w:r>
+      <w:r>
+        <w:t xml:space="preserve"> </w:t>
+      </w:r>
+      <w:r>
+        <w:t xml:space="preserve">1 September 2026 (target-blind; no result re-evaluation)</w:t>
       </w:r>
     </w:p>
     <w:bookmarkEnd w:id="20"/>
@@ -424,7 +478,25 @@
         <w:t xml:space="preserve"> </w:t>
       </w:r>
       <w:r>
-        <w:t xml:space="preserve">time; PIT v2.2 reconciliation therefore remains blocked. Phase 8 consumed its sole</w:t>
+        <w:t xml:space="preserve">time. A five-clean-session receipt audit found 6/406 (1.48 per cent) opening receipts</w:t>
+      </w:r>
+      <w:r>
+        <w:t xml:space="preserve"> </w:t>
+      </w:r>
+      <w:r>
+        <w:t xml:space="preserve">beyond 60 seconds and none beyond 120 seconds, so the 60-second UW proxy is not a strict</w:t>
+      </w:r>
+      <w:r>
+        <w:t xml:space="preserve"> </w:t>
+      </w:r>
+      <w:r>
+        <w:t xml:space="preserve">conservative opening bound in this sample; PIT v2.2 reconciliation therefore remains</w:t>
+      </w:r>
+      <w:r>
+        <w:t xml:space="preserve"> </w:t>
+      </w:r>
+      <w:r>
+        <w:t xml:space="preserve">blocked. Phase 8 consumed its sole</w:t>
       </w:r>
       <w:r>
         <w:t xml:space="preserve"> </w:t>
@@ -1597,6 +1669,65 @@
         <w:pStyle w:val="BodyText"/>
       </w:pPr>
       <w:r>
+        <w:t xml:space="preserve">A target-blind live receipt audit dated 2026-09-01 tests that operational assumption</w:t>
+      </w:r>
+      <w:r>
+        <w:t xml:space="preserve"> </w:t>
+      </w:r>
+      <w:r>
+        <w:t xml:space="preserve">without changing the historical panel. Its measured result and sample boundary are</w:t>
+      </w:r>
+      <w:r>
+        <w:t xml:space="preserve"> </w:t>
+      </w:r>
+      <w:r>
+        <w:t xml:space="preserve">reported separately in §5.6. It leaves</w:t>
+      </w:r>
+      <w:r>
+        <w:t xml:space="preserve"> </w:t>
+      </w:r>
+      <w:r>
+        <w:rPr>
+          <w:rStyle w:val="VerbatimChar"/>
+        </w:rPr>
+        <w:t xml:space="preserve">created_at</w:t>
+      </w:r>
+      <w:r>
+        <w:t xml:space="preserve"> </w:t>
+      </w:r>
+      <w:r>
+        <w:t xml:space="preserve">as</w:t>
+      </w:r>
+      <w:r>
+        <w:t xml:space="preserve"> </w:t>
+      </w:r>
+      <w:r>
+        <w:rPr>
+          <w:rStyle w:val="VerbatimChar"/>
+        </w:rPr>
+        <w:t xml:space="preserve">PROXY_ONLY</w:t>
+      </w:r>
+      <w:r>
+        <w:t xml:space="preserve">, preserves</w:t>
+      </w:r>
+      <w:r>
+        <w:t xml:space="preserve"> </w:t>
+      </w:r>
+      <w:r>
+        <w:rPr>
+          <w:rStyle w:val="VerbatimChar"/>
+        </w:rPr>
+        <w:t xml:space="preserve">PIT_V22_RECONCILIATION_BLOCKED</w:t>
+      </w:r>
+      <w:r>
+        <w:t xml:space="preserve">, and does not re-score any forecast.</w:t>
+      </w:r>
+    </w:p>
+    <w:p>
+      <w:pPr>
+        <w:pStyle w:val="BodyText"/>
+      </w:pPr>
+      <w:r>
         <w:t xml:space="preserve">Discipline also means repairing data rather than smoothing over it. Two discovery bar</w:t>
       </w:r>
       <w:r>
@@ -2476,7 +2607,7 @@
     </w:p>
     <w:bookmarkEnd w:id="29"/>
     <w:bookmarkEnd w:id="30"/>
-    <w:bookmarkStart w:id="36" w:name="results"/>
+    <w:bookmarkStart w:id="37" w:name="results"/>
     <w:p>
       <w:pPr>
         <w:pStyle w:val="Heading2"/>
@@ -4267,8 +4398,207 @@
       </w:r>
     </w:p>
     <w:bookmarkEnd w:id="35"/>
+    <w:bookmarkStart w:id="36" w:name="X6e833626e53982d286d764d2d0c9743c97746ac"/>
+    <w:p>
+      <w:pPr>
+        <w:pStyle w:val="Heading3"/>
+      </w:pPr>
+      <w:r>
+        <w:t xml:space="preserve">5.6 Operational timing result: the 60-second opening bound</w:t>
+      </w:r>
+    </w:p>
+    <w:p>
+      <w:pPr>
+        <w:pStyle w:val="FirstParagraph"/>
+      </w:pPr>
+      <w:r>
+        <w:t xml:space="preserve">Gate 5 produced a separate target-blind operational timing result; it is not a predictive</w:t>
+      </w:r>
+      <w:r>
+        <w:t xml:space="preserve"> </w:t>
+      </w:r>
+      <w:r>
+        <w:t xml:space="preserve">result and uses no target, forecast or loss. Across all six reconciled sessions,</w:t>
+      </w:r>
+      <w:r>
+        <w:t xml:space="preserve"> </w:t>
+      </w:r>
+      <w:r>
+        <w:t xml:space="preserve">2,418/2,418 live flow alerts had support inside the registered contract window. The</w:t>
+      </w:r>
+      <w:r>
+        <w:t xml:space="preserve"> </w:t>
+      </w:r>
+      <w:r>
+        <w:t xml:space="preserve">receipt-latency distribution preserves the registered exclusion of the 2026-08-21</w:t>
+      </w:r>
+      <w:r>
+        <w:t xml:space="preserve"> </w:t>
+      </w:r>
+      <w:r>
+        <w:t xml:space="preserve">collector-replay anomaly, leaving five clean sessions and 1,768 first valid receipts.</w:t>
+      </w:r>
+    </w:p>
+    <w:p>
+      <w:pPr>
+        <w:pStyle w:val="BodyText"/>
+      </w:pPr>
+      <w:r>
+        <w:t xml:space="preserve">The New York opening hour contains 406 first receipts. Of these, 6/406 (1.48 per cent)</w:t>
+      </w:r>
+      <w:r>
+        <w:t xml:space="preserve"> </w:t>
+      </w:r>
+      <w:r>
+        <w:t xml:space="preserve">arrived more than 60 seconds after</w:t>
+      </w:r>
+      <w:r>
+        <w:t xml:space="preserve"> </w:t>
+      </w:r>
+      <w:r>
+        <w:rPr>
+          <w:rStyle w:val="VerbatimChar"/>
+        </w:rPr>
+        <w:t xml:space="preserve">created_at</w:t>
+      </w:r>
+      <w:r>
+        <w:t xml:space="preserve">; p99 was 60.216898 seconds, and 0/406</w:t>
+      </w:r>
+      <w:r>
+        <w:t xml:space="preserve"> </w:t>
+      </w:r>
+      <w:r>
+        <w:t xml:space="preserve">exceeded 120 seconds. The registered 60-second UW availability buffer therefore does not</w:t>
+      </w:r>
+      <w:r>
+        <w:t xml:space="preserve"> </w:t>
+      </w:r>
+      <w:r>
+        <w:t xml:space="preserve">hold as a strict conservative bound at the NY opening in this sample. The 120-second</w:t>
+      </w:r>
+      <w:r>
+        <w:t xml:space="preserve"> </w:t>
+      </w:r>
+      <w:r>
+        <w:t xml:space="preserve">sensitivity has no opening exceedance, but two of 95 receipts in hour 14 exceeded 120</w:t>
+      </w:r>
+      <w:r>
+        <w:t xml:space="preserve"> </w:t>
+      </w:r>
+      <w:r>
+        <w:t xml:space="preserve">seconds, so it is not a strict all-day bound in the observed sessions.</w:t>
+      </w:r>
+    </w:p>
+    <w:p>
+      <w:pPr>
+        <w:pStyle w:val="BodyText"/>
+      </w:pPr>
+      <w:r>
+        <w:t xml:space="preserve">Five sessions and 406 opening receipts can falsify a zero-exceedance claim in the observed</w:t>
+      </w:r>
+      <w:r>
+        <w:t xml:space="preserve"> </w:t>
+      </w:r>
+      <w:r>
+        <w:t xml:space="preserve">sample; they cannot certify future sessions. The estimand is local</w:t>
+      </w:r>
+      <w:r>
+        <w:t xml:space="preserve"> </w:t>
+      </w:r>
+      <w:r>
+        <w:rPr>
+          <w:rStyle w:val="VerbatimChar"/>
+        </w:rPr>
+        <w:t xml:space="preserve">receipt_utc − created_at</w:t>
+      </w:r>
+      <w:r>
+        <w:t xml:space="preserve">, not provider publication time or historical client receipt.</w:t>
+      </w:r>
+      <w:r>
+        <w:t xml:space="preserve"> </w:t>
+      </w:r>
+      <w:r>
+        <w:t xml:space="preserve">Accordingly,</w:t>
+      </w:r>
+      <w:r>
+        <w:t xml:space="preserve"> </w:t>
+      </w:r>
+      <w:r>
+        <w:rPr>
+          <w:rStyle w:val="VerbatimChar"/>
+        </w:rPr>
+        <w:t xml:space="preserve">created_at</w:t>
+      </w:r>
+      <w:r>
+        <w:t xml:space="preserve"> </w:t>
+      </w:r>
+      <w:r>
+        <w:t xml:space="preserve">remains</w:t>
+      </w:r>
+      <w:r>
+        <w:t xml:space="preserve"> </w:t>
+      </w:r>
+      <w:r>
+        <w:rPr>
+          <w:rStyle w:val="VerbatimChar"/>
+        </w:rPr>
+        <w:t xml:space="preserve">PROXY_ONLY_CROSS_CHANNEL</w:t>
+      </w:r>
+      <w:r>
+        <w:t xml:space="preserve">, backfill and revision remain</w:t>
+      </w:r>
+      <w:r>
+        <w:t xml:space="preserve"> </w:t>
+      </w:r>
+      <w:r>
+        <w:t xml:space="preserve">non-identifiable, and</w:t>
+      </w:r>
+      <w:r>
+        <w:t xml:space="preserve"> </w:t>
+      </w:r>
+      <w:r>
+        <w:rPr>
+          <w:rStyle w:val="VerbatimChar"/>
+        </w:rPr>
+        <w:t xml:space="preserve">PIT_V22_RECONCILIATION_BLOCKED</w:t>
+      </w:r>
+      <w:r>
+        <w:t xml:space="preserve"> </w:t>
+      </w:r>
+      <w:r>
+        <w:t xml:space="preserve">remains in force</w:t>
+      </w:r>
+      <w:r>
+        <w:t xml:space="preserve"> </w:t>
+      </w:r>
+      <w:r>
+        <w:t xml:space="preserve">(</w:t>
+      </w:r>
+      <w:r>
+        <w:rPr>
+          <w:rStyle w:val="VerbatimChar"/>
+        </w:rPr>
+        <w:t xml:space="preserve">artifacts/gate5_pit/uw_latency_campaign_20260901_v2.json</w:t>
+      </w:r>
+      <w:r>
+        <w:t xml:space="preserve">;</w:t>
+      </w:r>
+      <w:r>
+        <w:t xml:space="preserve"> </w:t>
+      </w:r>
+      <w:r>
+        <w:rPr>
+          <w:rStyle w:val="VerbatimChar"/>
+        </w:rPr>
+        <w:t xml:space="preserve">docs/gate5_pit_foundations_v1.md</w:t>
+      </w:r>
+      <w:r>
+        <w:t xml:space="preserve">).</w:t>
+      </w:r>
+    </w:p>
     <w:bookmarkEnd w:id="36"/>
-    <w:bookmarkStart w:id="37" w:name="discussion"/>
+    <w:bookmarkEnd w:id="37"/>
+    <w:bookmarkStart w:id="38" w:name="discussion"/>
     <w:p>
       <w:pPr>
         <w:pStyle w:val="Heading2"/>
@@ -4532,8 +4862,8 @@
         <w:t xml:space="preserve">.</w:t>
       </w:r>
     </w:p>
-    <w:bookmarkEnd w:id="37"/>
-    <w:bookmarkStart w:id="38" w:name="threats-to-validity"/>
+    <w:bookmarkEnd w:id="38"/>
+    <w:bookmarkStart w:id="39" w:name="threats-to-validity"/>
     <w:p>
       <w:pPr>
         <w:pStyle w:val="Heading2"/>
@@ -4849,6 +5179,44 @@
         <w:pStyle w:val="BodyText"/>
       </w:pPr>
       <w:r>
+        <w:t xml:space="preserve">That availability threat is now measured rather than merely asserted. The five-session</w:t>
+      </w:r>
+      <w:r>
+        <w:t xml:space="preserve"> </w:t>
+      </w:r>
+      <w:r>
+        <w:t xml:space="preserve">receipt audit falsifies a zero-exceedance interpretation of the 60-second opening buffer,</w:t>
+      </w:r>
+      <w:r>
+        <w:t xml:space="preserve"> </w:t>
+      </w:r>
+      <w:r>
+        <w:t xml:space="preserve">but its short span cannot identify a future-session tail probability, and the separate</w:t>
+      </w:r>
+      <w:r>
+        <w:t xml:space="preserve"> </w:t>
+      </w:r>
+      <w:r>
+        <w:t xml:space="preserve">cross-channel design still cannot identify backfill or revision. The absence of opening</w:t>
+      </w:r>
+      <w:r>
+        <w:t xml:space="preserve"> </w:t>
+      </w:r>
+      <w:r>
+        <w:t xml:space="preserve">exceedances beyond 120 seconds is therefore a bounded sample result, not proof of a</w:t>
+      </w:r>
+      <w:r>
+        <w:t xml:space="preserve"> </w:t>
+      </w:r>
+      <w:r>
+        <w:t xml:space="preserve">universal provider-latency guarantee.</w:t>
+      </w:r>
+    </w:p>
+    <w:p>
+      <w:pPr>
+        <w:pStyle w:val="BodyText"/>
+      </w:pPr>
+      <w:r>
         <w:t xml:space="preserve">Finally, the chronological separation limits what the validation null can mean. It</w:t>
       </w:r>
       <w:r>
@@ -4908,8 +5276,8 @@
         <w:t xml:space="preserve">historical one-shot execution. It supports a robustness interpretation only.</w:t>
       </w:r>
     </w:p>
-    <w:bookmarkEnd w:id="38"/>
-    <w:bookmarkStart w:id="40" w:name="conclusion-and-contribution"/>
+    <w:bookmarkEnd w:id="39"/>
+    <w:bookmarkStart w:id="41" w:name="conclusion-and-contribution"/>
     <w:p>
       <w:pPr>
         <w:pStyle w:val="Heading2"/>
@@ -4991,13 +5359,31 @@
         <w:t xml:space="preserve"> </w:t>
       </w:r>
       <w:r>
-        <w:t xml:space="preserve">observe. The remaining PIT v2.2 blocker is part of the result, not something concealed by</w:t>
-      </w:r>
-      <w:r>
-        <w:t xml:space="preserve"> </w:t>
-      </w:r>
-      <w:r>
-        <w:t xml:space="preserve">a headline. Phase 8 is complete and exploratory; its corrected same-session sensitivity</w:t>
+        <w:t xml:space="preserve">observe. That machinery produced a substantive negative methodological result: the</w:t>
+      </w:r>
+      <w:r>
+        <w:t xml:space="preserve"> </w:t>
+      </w:r>
+      <w:r>
+        <w:t xml:space="preserve">60-second UW availability buffer is not a strict conservative opening bound in the five</w:t>
+      </w:r>
+      <w:r>
+        <w:t xml:space="preserve"> </w:t>
+      </w:r>
+      <w:r>
+        <w:t xml:space="preserve">clean sessions, while the 120-second opening sensitivity remains sample-bounded rather</w:t>
+      </w:r>
+      <w:r>
+        <w:t xml:space="preserve"> </w:t>
+      </w:r>
+      <w:r>
+        <w:t xml:space="preserve">than provider-certified. The remaining PIT v2.2 blocker is part of the result, not</w:t>
+      </w:r>
+      <w:r>
+        <w:t xml:space="preserve"> </w:t>
+      </w:r>
+      <w:r>
+        <w:t xml:space="preserve">something concealed by a headline. Phase 8 is complete and exploratory; its corrected same-session sensitivity</w:t>
       </w:r>
       <w:r>
         <w:t xml:space="preserve"> </w:t>
@@ -5024,7 +5410,7 @@
         <w:t xml:space="preserve">its editorial cutoff.</w:t>
       </w:r>
     </w:p>
-    <w:bookmarkStart w:id="39" w:name="Xebdc92d4acd8b8d67c9f3fe0f9867e95cc7704d"/>
+    <w:bookmarkStart w:id="40" w:name="Xebdc92d4acd8b8d67c9f3fe0f9867e95cc7704d"/>
     <w:p>
       <w:pPr>
         <w:pStyle w:val="Heading3"/>
@@ -5182,9 +5568,9 @@
         <w:t xml:space="preserve">publication with the same prominence as a positive.</w:t>
       </w:r>
     </w:p>
-    <w:bookmarkEnd w:id="39"/>
     <w:bookmarkEnd w:id="40"/>
-    <w:bookmarkStart w:id="41" w:name="ethics-and-reproducibility"/>
+    <w:bookmarkEnd w:id="41"/>
+    <w:bookmarkStart w:id="42" w:name="ethics-and-reproducibility"/>
     <w:p>
       <w:pPr>
         <w:pStyle w:val="Heading2"/>
@@ -5237,8 +5623,8 @@
         <w:t xml:space="preserve">report.</w:t>
       </w:r>
     </w:p>
-    <w:bookmarkEnd w:id="41"/>
-    <w:bookmarkStart w:id="42" w:name="appendices"/>
+    <w:bookmarkEnd w:id="42"/>
+    <w:bookmarkStart w:id="43" w:name="appendices"/>
     <w:p>
       <w:pPr>
         <w:pStyle w:val="Heading2"/>
@@ -5250,297 +5636,182 @@
     <w:p>
       <w:pPr>
         <w:pStyle w:val="FirstParagraph"/>
-        <w:spacing w:before="0" w:after="0" w:line="240" w:lineRule="auto"/>
-      </w:pPr>
-      <w:r>
-        <w:rPr>
-          <w:sz w:val="21"/>
-        </w:rPr>
+      </w:pPr>
+      <w:r>
         <w:t xml:space="preserve">A. Campaign register and contrast tables (</w:t>
       </w:r>
       <w:r>
         <w:rPr>
           <w:rStyle w:val="VerbatimChar"/>
-          <w:sz w:val="21"/>
         </w:rPr>
         <w:t xml:space="preserve">docs/results_reconciliation_v2.md</w:t>
       </w:r>
       <w:r>
-        <w:rPr>
-          <w:sz w:val="21"/>
-        </w:rPr>
         <w:t xml:space="preserve">).</w:t>
       </w:r>
       <w:r>
-        <w:rPr>
-          <w:sz w:val="21"/>
-        </w:rPr>
-        <w:t xml:space="preserve"> </w:t>
-      </w:r>
-      <w:r>
-        <w:rPr>
-          <w:sz w:val="21"/>
-        </w:rPr>
+        <w:t xml:space="preserve"> </w:t>
+      </w:r>
+      <w:r>
         <w:t xml:space="preserve">B. Studentized inference tables (</w:t>
       </w:r>
       <w:r>
         <w:rPr>
           <w:rStyle w:val="VerbatimChar"/>
-          <w:sz w:val="21"/>
         </w:rPr>
         <w:t xml:space="preserve">artifacts/gate1_inference/</w:t>
       </w:r>
       <w:r>
-        <w:rPr>
-          <w:sz w:val="21"/>
-        </w:rPr>
         <w:t xml:space="preserve">).</w:t>
       </w:r>
       <w:r>
-        <w:rPr>
-          <w:sz w:val="21"/>
-        </w:rPr>
-        <w:t xml:space="preserve"> </w:t>
-      </w:r>
-      <w:r>
-        <w:rPr>
-          <w:sz w:val="21"/>
-        </w:rPr>
+        <w:t xml:space="preserve"> </w:t>
+      </w:r>
+      <w:r>
         <w:t xml:space="preserve">C. Gate reports 1–12 (</w:t>
       </w:r>
       <w:r>
         <w:rPr>
           <w:rStyle w:val="VerbatimChar"/>
-          <w:sz w:val="21"/>
         </w:rPr>
         <w:t xml:space="preserve">docs/INDEX.md</w:t>
       </w:r>
       <w:r>
-        <w:rPr>
-          <w:sz w:val="21"/>
-        </w:rPr>
         <w:t xml:space="preserve">).</w:t>
       </w:r>
       <w:r>
-        <w:rPr>
-          <w:sz w:val="21"/>
-        </w:rPr>
-        <w:t xml:space="preserve"> </w:t>
-      </w:r>
-      <w:r>
-        <w:rPr>
-          <w:sz w:val="21"/>
-        </w:rPr>
+        <w:t xml:space="preserve"> </w:t>
+      </w:r>
+      <w:r>
         <w:t xml:space="preserve">D. Economic-significance tables (</w:t>
       </w:r>
       <w:r>
         <w:rPr>
           <w:rStyle w:val="VerbatimChar"/>
-          <w:sz w:val="21"/>
         </w:rPr>
         <w:t xml:space="preserve">artifacts/economic_significance/</w:t>
       </w:r>
       <w:r>
-        <w:rPr>
-          <w:sz w:val="21"/>
-        </w:rPr>
         <w:t xml:space="preserve">).</w:t>
       </w:r>
       <w:r>
-        <w:rPr>
-          <w:sz w:val="21"/>
-        </w:rPr>
-        <w:t xml:space="preserve"> </w:t>
-      </w:r>
-      <w:r>
-        <w:rPr>
-          <w:sz w:val="21"/>
-        </w:rPr>
+        <w:t xml:space="preserve"> </w:t>
+      </w:r>
+      <w:r>
         <w:t xml:space="preserve">E. Preregistration, freeze and target-blind planning hashes (Phase 9 freeze</w:t>
       </w:r>
       <w:r>
-        <w:rPr>
-          <w:sz w:val="21"/>
-        </w:rPr>
-        <w:t xml:space="preserve"> </w:t>
-      </w:r>
-      <w:r>
-        <w:rPr>
-          <w:rStyle w:val="VerbatimChar"/>
-          <w:sz w:val="21"/>
+        <w:t xml:space="preserve"> </w:t>
+      </w:r>
+      <w:r>
+        <w:rPr>
+          <w:rStyle w:val="VerbatimChar"/>
         </w:rPr>
         <w:t xml:space="preserve">artifacts/phase9/protocol_freeze.json</w:t>
       </w:r>
       <w:r>
-        <w:rPr>
-          <w:sz w:val="21"/>
-        </w:rPr>
         <w:t xml:space="preserve">; corrected power/deadline audit</w:t>
       </w:r>
       <w:r>
-        <w:rPr>
-          <w:sz w:val="21"/>
-        </w:rPr>
-        <w:t xml:space="preserve"> </w:t>
-      </w:r>
-      <w:r>
-        <w:rPr>
-          <w:rStyle w:val="VerbatimChar"/>
-          <w:sz w:val="21"/>
+        <w:t xml:space="preserve"> </w:t>
+      </w:r>
+      <w:r>
+        <w:rPr>
+          <w:rStyle w:val="VerbatimChar"/>
         </w:rPr>
         <w:t xml:space="preserve">artifacts/phase9/power_deadline_audit_v1.json</w:t>
       </w:r>
       <w:r>
-        <w:rPr>
-          <w:sz w:val="21"/>
-        </w:rPr>
         <w:t xml:space="preserve">).</w:t>
       </w:r>
       <w:r>
-        <w:rPr>
-          <w:sz w:val="21"/>
-        </w:rPr>
-        <w:t xml:space="preserve"> </w:t>
-      </w:r>
-      <w:r>
-        <w:rPr>
-          <w:sz w:val="21"/>
-        </w:rPr>
+        <w:t xml:space="preserve"> </w:t>
+      </w:r>
+      <w:r>
         <w:t xml:space="preserve">F. Supervisor feedback mapping, restricted to source-verified comments; unverified</w:t>
       </w:r>
       <w:r>
-        <w:rPr>
-          <w:sz w:val="21"/>
-        </w:rPr>
-        <w:t xml:space="preserve"> </w:t>
-      </w:r>
-      <w:r>
-        <w:rPr>
-          <w:sz w:val="21"/>
-        </w:rPr>
+        <w:t xml:space="preserve"> </w:t>
+      </w:r>
+      <w:r>
         <w:t xml:space="preserve">paraphrases are excluded.</w:t>
       </w:r>
       <w:r>
-        <w:rPr>
-          <w:sz w:val="21"/>
-        </w:rPr>
-        <w:t xml:space="preserve"> </w:t>
-      </w:r>
-      <w:r>
-        <w:rPr>
-          <w:sz w:val="21"/>
-        </w:rPr>
+        <w:t xml:space="preserve"> </w:t>
+      </w:r>
+      <w:r>
         <w:t xml:space="preserve">G. Primary run artifacts (</w:t>
       </w:r>
       <w:r>
         <w:rPr>
           <w:rStyle w:val="VerbatimChar"/>
-          <w:sz w:val="21"/>
         </w:rPr>
         <w:t xml:space="preserve">artifacts/rp2_v3/rp2-v3-20260831-b1-spot-cutoff-remediation/</w:t>
       </w:r>
       <w:r>
-        <w:rPr>
-          <w:sz w:val="21"/>
-        </w:rPr>
         <w:t xml:space="preserve">:</w:t>
       </w:r>
       <w:r>
-        <w:rPr>
-          <w:sz w:val="21"/>
-        </w:rPr>
-        <w:t xml:space="preserve"> </w:t>
-      </w:r>
-      <w:r>
-        <w:rPr>
-          <w:rStyle w:val="VerbatimChar"/>
-          <w:sz w:val="21"/>
+        <w:t xml:space="preserve"> </w:t>
+      </w:r>
+      <w:r>
+        <w:rPr>
+          <w:rStyle w:val="VerbatimChar"/>
         </w:rPr>
         <w:t xml:space="preserve">scorecard.md</w:t>
       </w:r>
       <w:r>
-        <w:rPr>
-          <w:sz w:val="21"/>
-        </w:rPr>
         <w:t xml:space="preserve">,</w:t>
       </w:r>
       <w:r>
-        <w:rPr>
-          <w:sz w:val="21"/>
-        </w:rPr>
-        <w:t xml:space="preserve"> </w:t>
-      </w:r>
-      <w:r>
-        <w:rPr>
-          <w:rStyle w:val="VerbatimChar"/>
-          <w:sz w:val="21"/>
+        <w:t xml:space="preserve"> </w:t>
+      </w:r>
+      <w:r>
+        <w:rPr>
+          <w:rStyle w:val="VerbatimChar"/>
         </w:rPr>
         <w:t xml:space="preserve">rp2_block8_ladder/ladder.json</w:t>
       </w:r>
       <w:r>
-        <w:rPr>
-          <w:sz w:val="21"/>
-        </w:rPr>
         <w:t xml:space="preserve">,</w:t>
       </w:r>
       <w:r>
-        <w:rPr>
-          <w:sz w:val="21"/>
-        </w:rPr>
-        <w:t xml:space="preserve"> </w:t>
-      </w:r>
-      <w:r>
-        <w:rPr>
-          <w:rStyle w:val="VerbatimChar"/>
-          <w:sz w:val="21"/>
+        <w:t xml:space="preserve"> </w:t>
+      </w:r>
+      <w:r>
+        <w:rPr>
+          <w:rStyle w:val="VerbatimChar"/>
         </w:rPr>
         <w:t xml:space="preserve">rp2_block10_inference/inference.json</w:t>
       </w:r>
       <w:r>
-        <w:rPr>
-          <w:sz w:val="21"/>
-        </w:rPr>
         <w:t xml:space="preserve">,</w:t>
       </w:r>
       <w:r>
-        <w:rPr>
-          <w:sz w:val="21"/>
-        </w:rPr>
-        <w:t xml:space="preserve"> </w:t>
-      </w:r>
-      <w:r>
-        <w:rPr>
-          <w:rStyle w:val="VerbatimChar"/>
-          <w:sz w:val="21"/>
+        <w:t xml:space="preserve"> </w:t>
+      </w:r>
+      <w:r>
+        <w:rPr>
+          <w:rStyle w:val="VerbatimChar"/>
         </w:rPr>
         <w:t xml:space="preserve">run_identity.json</w:t>
       </w:r>
       <w:r>
-        <w:rPr>
-          <w:sz w:val="21"/>
-        </w:rPr>
         <w:t xml:space="preserve">) and the run verdict (</w:t>
       </w:r>
       <w:r>
         <w:rPr>
           <w:rStyle w:val="VerbatimChar"/>
-          <w:sz w:val="21"/>
         </w:rPr>
         <w:t xml:space="preserve">docs/rp2_v3/VERDICT.md</w:t>
       </w:r>
       <w:r>
-        <w:rPr>
-          <w:sz w:val="21"/>
-        </w:rPr>
         <w:t xml:space="preserve">).</w:t>
       </w:r>
     </w:p>
-    <w:bookmarkEnd w:id="42"/>
     <w:bookmarkEnd w:id="43"/>
-    <w:sectPr>
-      <w:pgSz w:w="12240" w:h="15840"/>
-      <w:pgMar w:top="1440" w:bottom="1440" w:left="1440" w:right="1440"/>
-    </w:sectPr>
+    <w:bookmarkEnd w:id="44"/>
+    <w:sectPr/>
   </w:body>
 </w:document>
 </file>
@@ -6150,7 +6421,7 @@
       <w:color w:themeColor="accent1" w:themeShade="BF" w:val="365F91"/>
     </w:rPr>
   </w:style>
-  <w:style w:customStyle="1" w:styleId="SourceCode" w:type="paragraph">
+  <w:style w:type="paragraph" w:customStyle="1" w:styleId="SourceCode">
     <w:name w:val="Source Code"/>
     <w:basedOn w:val="Normal"/>
     <w:link w:val="VerbatimChar"/>
@@ -6158,7 +6429,7 @@
       <w:wordWrap w:val="off"/>
     </w:pPr>
   </w:style>
-  <w:style w:customStyle="1" w:styleId="KeywordTok" w:type="character">
+  <w:style w:type="character" w:customStyle="1" w:styleId="KeywordTok">
     <w:name w:val="KeywordTok"/>
     <w:basedOn w:val="VerbatimChar"/>
     <w:rPr>
@@ -6166,77 +6437,77 @@
       <w:b/>
     </w:rPr>
   </w:style>
-  <w:style w:customStyle="1" w:styleId="DataTypeTok" w:type="character">
+  <w:style w:type="character" w:customStyle="1" w:styleId="DataTypeTok">
     <w:name w:val="DataTypeTok"/>
     <w:basedOn w:val="VerbatimChar"/>
     <w:rPr>
       <w:color w:val="902000"/>
     </w:rPr>
   </w:style>
-  <w:style w:customStyle="1" w:styleId="DecValTok" w:type="character">
+  <w:style w:type="character" w:customStyle="1" w:styleId="DecValTok">
     <w:name w:val="DecValTok"/>
     <w:basedOn w:val="VerbatimChar"/>
     <w:rPr>
       <w:color w:val="40a070"/>
     </w:rPr>
   </w:style>
-  <w:style w:customStyle="1" w:styleId="BaseNTok" w:type="character">
+  <w:style w:type="character" w:customStyle="1" w:styleId="BaseNTok">
     <w:name w:val="BaseNTok"/>
     <w:basedOn w:val="VerbatimChar"/>
     <w:rPr>
       <w:color w:val="40a070"/>
     </w:rPr>
   </w:style>
-  <w:style w:customStyle="1" w:styleId="FloatTok" w:type="character">
+  <w:style w:type="character" w:customStyle="1" w:styleId="FloatTok">
     <w:name w:val="FloatTok"/>
     <w:basedOn w:val="VerbatimChar"/>
     <w:rPr>
       <w:color w:val="40a070"/>
     </w:rPr>
   </w:style>
-  <w:style w:customStyle="1" w:styleId="ConstantTok" w:type="character">
+  <w:style w:type="character" w:customStyle="1" w:styleId="ConstantTok">
     <w:name w:val="ConstantTok"/>
     <w:basedOn w:val="VerbatimChar"/>
     <w:rPr>
       <w:color w:val="880000"/>
     </w:rPr>
   </w:style>
-  <w:style w:customStyle="1" w:styleId="CharTok" w:type="character">
+  <w:style w:type="character" w:customStyle="1" w:styleId="CharTok">
     <w:name w:val="CharTok"/>
     <w:basedOn w:val="VerbatimChar"/>
     <w:rPr>
       <w:color w:val="4070a0"/>
     </w:rPr>
   </w:style>
-  <w:style w:customStyle="1" w:styleId="SpecialCharTok" w:type="character">
+  <w:style w:type="character" w:customStyle="1" w:styleId="SpecialCharTok">
     <w:name w:val="SpecialCharTok"/>
     <w:basedOn w:val="VerbatimChar"/>
     <w:rPr>
       <w:color w:val="4070a0"/>
     </w:rPr>
   </w:style>
-  <w:style w:customStyle="1" w:styleId="StringTok" w:type="character">
+  <w:style w:type="character" w:customStyle="1" w:styleId="StringTok">
     <w:name w:val="StringTok"/>
     <w:basedOn w:val="VerbatimChar"/>
     <w:rPr>
       <w:color w:val="4070a0"/>
     </w:rPr>
   </w:style>
-  <w:style w:customStyle="1" w:styleId="VerbatimStringTok" w:type="character">
+  <w:style w:type="character" w:customStyle="1" w:styleId="VerbatimStringTok">
     <w:name w:val="VerbatimStringTok"/>
     <w:basedOn w:val="VerbatimChar"/>
     <w:rPr>
       <w:color w:val="4070a0"/>
     </w:rPr>
   </w:style>
-  <w:style w:customStyle="1" w:styleId="SpecialStringTok" w:type="character">
+  <w:style w:type="character" w:customStyle="1" w:styleId="SpecialStringTok">
     <w:name w:val="SpecialStringTok"/>
     <w:basedOn w:val="VerbatimChar"/>
     <w:rPr>
       <w:color w:val="bb6688"/>
     </w:rPr>
   </w:style>
-  <w:style w:customStyle="1" w:styleId="ImportTok" w:type="character">
+  <w:style w:type="character" w:customStyle="1" w:styleId="ImportTok">
     <w:name w:val="ImportTok"/>
     <w:basedOn w:val="VerbatimChar"/>
     <w:rPr>
@@ -6244,7 +6515,7 @@
       <w:b/>
     </w:rPr>
   </w:style>
-  <w:style w:customStyle="1" w:styleId="CommentTok" w:type="character">
+  <w:style w:type="character" w:customStyle="1" w:styleId="CommentTok">
     <w:name w:val="CommentTok"/>
     <w:basedOn w:val="VerbatimChar"/>
     <w:rPr>
@@ -6252,7 +6523,7 @@
       <w:i/>
     </w:rPr>
   </w:style>
-  <w:style w:customStyle="1" w:styleId="DocumentationTok" w:type="character">
+  <w:style w:type="character" w:customStyle="1" w:styleId="DocumentationTok">
     <w:name w:val="DocumentationTok"/>
     <w:basedOn w:val="VerbatimChar"/>
     <w:rPr>
@@ -6260,7 +6531,7 @@
       <w:i/>
     </w:rPr>
   </w:style>
-  <w:style w:customStyle="1" w:styleId="AnnotationTok" w:type="character">
+  <w:style w:type="character" w:customStyle="1" w:styleId="AnnotationTok">
     <w:name w:val="AnnotationTok"/>
     <w:basedOn w:val="VerbatimChar"/>
     <w:rPr>
@@ -6269,7 +6540,7 @@
       <w:i/>
     </w:rPr>
   </w:style>
-  <w:style w:customStyle="1" w:styleId="CommentVarTok" w:type="character">
+  <w:style w:type="character" w:customStyle="1" w:styleId="CommentVarTok">
     <w:name w:val="CommentVarTok"/>
     <w:basedOn w:val="VerbatimChar"/>
     <w:rPr>
@@ -6278,28 +6549,28 @@
       <w:i/>
     </w:rPr>
   </w:style>
-  <w:style w:customStyle="1" w:styleId="OtherTok" w:type="character">
+  <w:style w:type="character" w:customStyle="1" w:styleId="OtherTok">
     <w:name w:val="OtherTok"/>
     <w:basedOn w:val="VerbatimChar"/>
     <w:rPr>
       <w:color w:val="007020"/>
     </w:rPr>
   </w:style>
-  <w:style w:customStyle="1" w:styleId="FunctionTok" w:type="character">
+  <w:style w:type="character" w:customStyle="1" w:styleId="FunctionTok">
     <w:name w:val="FunctionTok"/>
     <w:basedOn w:val="VerbatimChar"/>
     <w:rPr>
       <w:color w:val="06287e"/>
     </w:rPr>
   </w:style>
-  <w:style w:customStyle="1" w:styleId="VariableTok" w:type="character">
+  <w:style w:type="character" w:customStyle="1" w:styleId="VariableTok">
     <w:name w:val="VariableTok"/>
     <w:basedOn w:val="VerbatimChar"/>
     <w:rPr>
       <w:color w:val="19177c"/>
     </w:rPr>
   </w:style>
-  <w:style w:customStyle="1" w:styleId="ControlFlowTok" w:type="character">
+  <w:style w:type="character" w:customStyle="1" w:styleId="ControlFlowTok">
     <w:name w:val="ControlFlowTok"/>
     <w:basedOn w:val="VerbatimChar"/>
     <w:rPr>
@@ -6307,45 +6578,45 @@
       <w:b/>
     </w:rPr>
   </w:style>
-  <w:style w:customStyle="1" w:styleId="OperatorTok" w:type="character">
+  <w:style w:type="character" w:customStyle="1" w:styleId="OperatorTok">
     <w:name w:val="OperatorTok"/>
     <w:basedOn w:val="VerbatimChar"/>
     <w:rPr>
       <w:color w:val="666666"/>
     </w:rPr>
   </w:style>
-  <w:style w:customStyle="1" w:styleId="BuiltInTok" w:type="character">
+  <w:style w:type="character" w:customStyle="1" w:styleId="BuiltInTok">
     <w:name w:val="BuiltInTok"/>
     <w:basedOn w:val="VerbatimChar"/>
     <w:rPr>
       <w:color w:val="008000"/>
     </w:rPr>
   </w:style>
-  <w:style w:customStyle="1" w:styleId="ExtensionTok" w:type="character">
+  <w:style w:type="character" w:customStyle="1" w:styleId="ExtensionTok">
     <w:name w:val="ExtensionTok"/>
     <w:basedOn w:val="VerbatimChar"/>
     <w:rPr/>
   </w:style>
-  <w:style w:customStyle="1" w:styleId="PreprocessorTok" w:type="character">
+  <w:style w:type="character" w:customStyle="1" w:styleId="PreprocessorTok">
     <w:name w:val="PreprocessorTok"/>
     <w:basedOn w:val="VerbatimChar"/>
     <w:rPr>
       <w:color w:val="bc7a00"/>
     </w:rPr>
   </w:style>
-  <w:style w:customStyle="1" w:styleId="AttributeTok" w:type="character">
+  <w:style w:type="character" w:customStyle="1" w:styleId="AttributeTok">
     <w:name w:val="AttributeTok"/>
     <w:basedOn w:val="VerbatimChar"/>
     <w:rPr>
       <w:color w:val="7d9029"/>
     </w:rPr>
   </w:style>
-  <w:style w:customStyle="1" w:styleId="RegionMarkerTok" w:type="character">
+  <w:style w:type="character" w:customStyle="1" w:styleId="RegionMarkerTok">
     <w:name w:val="RegionMarkerTok"/>
     <w:basedOn w:val="VerbatimChar"/>
     <w:rPr/>
   </w:style>
-  <w:style w:customStyle="1" w:styleId="InformationTok" w:type="character">
+  <w:style w:type="character" w:customStyle="1" w:styleId="InformationTok">
     <w:name w:val="InformationTok"/>
     <w:basedOn w:val="VerbatimChar"/>
     <w:rPr>
@@ -6354,7 +6625,7 @@
       <w:i/>
     </w:rPr>
   </w:style>
-  <w:style w:customStyle="1" w:styleId="WarningTok" w:type="character">
+  <w:style w:type="character" w:customStyle="1" w:styleId="WarningTok">
     <w:name w:val="WarningTok"/>
     <w:basedOn w:val="VerbatimChar"/>
     <w:rPr>
@@ -6363,7 +6634,7 @@
       <w:i/>
     </w:rPr>
   </w:style>
-  <w:style w:customStyle="1" w:styleId="AlertTok" w:type="character">
+  <w:style w:type="character" w:customStyle="1" w:styleId="AlertTok">
     <w:name w:val="AlertTok"/>
     <w:basedOn w:val="VerbatimChar"/>
     <w:rPr>
@@ -6371,7 +6642,7 @@
       <w:b/>
     </w:rPr>
   </w:style>
-  <w:style w:customStyle="1" w:styleId="ErrorTok" w:type="character">
+  <w:style w:type="character" w:customStyle="1" w:styleId="ErrorTok">
     <w:name w:val="ErrorTok"/>
     <w:basedOn w:val="VerbatimChar"/>
     <w:rPr>
@@ -6379,7 +6650,7 @@
       <w:b/>
     </w:rPr>
   </w:style>
-  <w:style w:customStyle="1" w:styleId="NormalTok" w:type="character">
+  <w:style w:type="character" w:customStyle="1" w:styleId="NormalTok">
     <w:name w:val="NormalTok"/>
     <w:basedOn w:val="VerbatimChar"/>
     <w:rPr/>

</xml_diff>